<commit_message>
Ajustes TAP - parcial
</commit_message>
<xml_diff>
--- a/Docs/docx/Termo de Abertura do Projeto v1_opngoing.docx
+++ b/Docs/docx/Termo de Abertura do Projeto v1_opngoing.docx
@@ -2855,12 +2855,6 @@
             <w:insideH w:val="none" w:color="auto" w:sz="0" w:space="0"/>
             <w:insideV w:val="none" w:color="auto" w:sz="0" w:space="0"/>
           </w:tblBorders>
-          <w:tblCellMar>
-            <w:top w:w="80" w:type="dxa"/>
-            <w:left w:w="160" w:type="dxa"/>
-            <w:bottom w:w="80" w:type="dxa"/>
-            <w:right w:w="160" w:type="dxa"/>
-          </w:tblCellMar>
         </w:tblPrEx>
         <w:trPr>
           <w:tblCellSpacing w:w="0" w:type="dxa"/>
@@ -3553,12 +3547,6 @@
             <w:insideH w:val="none" w:color="auto" w:sz="0" w:space="0"/>
             <w:insideV w:val="none" w:color="auto" w:sz="0" w:space="0"/>
           </w:tblBorders>
-          <w:tblCellMar>
-            <w:top w:w="80" w:type="dxa"/>
-            <w:left w:w="160" w:type="dxa"/>
-            <w:bottom w:w="80" w:type="dxa"/>
-            <w:right w:w="160" w:type="dxa"/>
-          </w:tblCellMar>
         </w:tblPrEx>
         <w:trPr>
           <w:tblCellSpacing w:w="0" w:type="dxa"/>
@@ -4174,12 +4162,6 @@
             <w:insideH w:val="none" w:color="auto" w:sz="0" w:space="0"/>
             <w:insideV w:val="none" w:color="auto" w:sz="0" w:space="0"/>
           </w:tblBorders>
-          <w:tblCellMar>
-            <w:top w:w="80" w:type="dxa"/>
-            <w:left w:w="160" w:type="dxa"/>
-            <w:bottom w:w="80" w:type="dxa"/>
-            <w:right w:w="160" w:type="dxa"/>
-          </w:tblCellMar>
         </w:tblPrEx>
         <w:trPr>
           <w:tblCellSpacing w:w="0" w:type="dxa"/>
@@ -4786,12 +4768,6 @@
             <w:insideH w:val="none" w:color="auto" w:sz="0" w:space="0"/>
             <w:insideV w:val="none" w:color="auto" w:sz="0" w:space="0"/>
           </w:tblBorders>
-          <w:tblCellMar>
-            <w:top w:w="80" w:type="dxa"/>
-            <w:left w:w="160" w:type="dxa"/>
-            <w:bottom w:w="80" w:type="dxa"/>
-            <w:right w:w="160" w:type="dxa"/>
-          </w:tblCellMar>
         </w:tblPrEx>
         <w:trPr>
           <w:tblCellSpacing w:w="0" w:type="dxa"/>
@@ -5378,12 +5354,6 @@
             <w:insideH w:val="none" w:color="auto" w:sz="0" w:space="0"/>
             <w:insideV w:val="none" w:color="auto" w:sz="0" w:space="0"/>
           </w:tblBorders>
-          <w:tblCellMar>
-            <w:top w:w="80" w:type="dxa"/>
-            <w:left w:w="160" w:type="dxa"/>
-            <w:bottom w:w="80" w:type="dxa"/>
-            <w:right w:w="160" w:type="dxa"/>
-          </w:tblCellMar>
         </w:tblPrEx>
         <w:trPr>
           <w:tblCellSpacing w:w="0" w:type="dxa"/>
@@ -5950,12 +5920,6 @@
             <w:insideH w:val="none" w:color="auto" w:sz="0" w:space="0"/>
             <w:insideV w:val="none" w:color="auto" w:sz="0" w:space="0"/>
           </w:tblBorders>
-          <w:tblCellMar>
-            <w:top w:w="80" w:type="dxa"/>
-            <w:left w:w="160" w:type="dxa"/>
-            <w:bottom w:w="80" w:type="dxa"/>
-            <w:right w:w="160" w:type="dxa"/>
-          </w:tblCellMar>
         </w:tblPrEx>
         <w:trPr>
           <w:tblCellSpacing w:w="0" w:type="dxa"/>
@@ -6564,12 +6528,6 @@
             <w:insideH w:val="none" w:color="auto" w:sz="0" w:space="0"/>
             <w:insideV w:val="none" w:color="auto" w:sz="0" w:space="0"/>
           </w:tblBorders>
-          <w:tblCellMar>
-            <w:top w:w="80" w:type="dxa"/>
-            <w:left w:w="160" w:type="dxa"/>
-            <w:bottom w:w="80" w:type="dxa"/>
-            <w:right w:w="160" w:type="dxa"/>
-          </w:tblCellMar>
         </w:tblPrEx>
         <w:trPr>
           <w:tblCellSpacing w:w="0" w:type="dxa"/>
@@ -7322,12 +7280,6 @@
             <w:insideH w:val="none" w:color="auto" w:sz="0" w:space="0"/>
             <w:insideV w:val="none" w:color="auto" w:sz="0" w:space="0"/>
           </w:tblBorders>
-          <w:tblCellMar>
-            <w:top w:w="80" w:type="dxa"/>
-            <w:left w:w="160" w:type="dxa"/>
-            <w:bottom w:w="80" w:type="dxa"/>
-            <w:right w:w="160" w:type="dxa"/>
-          </w:tblCellMar>
         </w:tblPrEx>
         <w:trPr>
           <w:tblCellSpacing w:w="0" w:type="dxa"/>
@@ -8109,12 +8061,6 @@
             <w:insideH w:val="none" w:color="auto" w:sz="0" w:space="0"/>
             <w:insideV w:val="none" w:color="auto" w:sz="0" w:space="0"/>
           </w:tblBorders>
-          <w:tblCellMar>
-            <w:top w:w="80" w:type="dxa"/>
-            <w:left w:w="160" w:type="dxa"/>
-            <w:bottom w:w="80" w:type="dxa"/>
-            <w:right w:w="160" w:type="dxa"/>
-          </w:tblCellMar>
         </w:tblPrEx>
         <w:trPr>
           <w:tblCellSpacing w:w="0" w:type="dxa"/>
@@ -8917,12 +8863,6 @@
             <w:insideH w:val="none" w:color="auto" w:sz="0" w:space="0"/>
             <w:insideV w:val="none" w:color="auto" w:sz="0" w:space="0"/>
           </w:tblBorders>
-          <w:tblCellMar>
-            <w:top w:w="80" w:type="dxa"/>
-            <w:left w:w="160" w:type="dxa"/>
-            <w:bottom w:w="80" w:type="dxa"/>
-            <w:right w:w="160" w:type="dxa"/>
-          </w:tblCellMar>
         </w:tblPrEx>
         <w:trPr>
           <w:tblCellSpacing w:w="0" w:type="dxa"/>
@@ -12460,8 +12400,6 @@
           <w:lang w:val="pt-BR"/>
         </w:rPr>
       </w:pPr>
-      <w:bookmarkStart w:id="14" w:name="_GoBack"/>
-      <w:bookmarkEnd w:id="14"/>
     </w:p>
     <w:p>
       <w:pPr>
@@ -12486,35 +12424,4410 @@
     </w:p>
     <w:p>
       <w:pPr>
+        <w:rPr>
+          <w:rFonts w:hint="default" w:ascii="Calibri" w:hAnsi="Calibri" w:cs="Calibri"/>
+          <w:sz w:val="20"/>
+          <w:szCs w:val="20"/>
+        </w:rPr>
+      </w:pPr>
+      <w:r>
+        <w:rPr>
+          <w:rFonts w:hint="default" w:ascii="Calibri" w:hAnsi="Calibri" w:cs="Calibri"/>
+          <w:sz w:val="20"/>
+          <w:szCs w:val="20"/>
+        </w:rPr>
+        <w:t>Esta seção documenta os requisitos fundamentais dos produtos e entregas identificados na Estrutura Analítica do Projeto (EAP), conforme o Processo 5.2 (Coletar Requisitos) do PMBOK® 6ª edição e o Domínio de Entrega do PMBOK® 7ª edição. Cada requisito é mensurável, rastreável aos Objetivos SMART (§3) e vinculado a um pacote de trabalho específico da EAP.</w:t>
+      </w:r>
+    </w:p>
+    <w:p>
+      <w:pPr>
+        <w:rPr>
+          <w:rFonts w:hint="default" w:ascii="Calibri" w:hAnsi="Calibri" w:cs="Calibri"/>
+          <w:sz w:val="20"/>
+          <w:szCs w:val="20"/>
+        </w:rPr>
+      </w:pPr>
+    </w:p>
+    <w:p>
+      <w:pPr>
+        <w:rPr>
+          <w:rFonts w:hint="default" w:ascii="Calibri" w:hAnsi="Calibri" w:cs="Calibri"/>
+          <w:sz w:val="20"/>
+          <w:szCs w:val="20"/>
+          <w:lang w:val="pt-BR"/>
+        </w:rPr>
+      </w:pPr>
+      <w:r>
+        <w:rPr>
+          <w:rFonts w:hint="default" w:ascii="Calibri" w:hAnsi="Calibri" w:cs="Calibri"/>
+          <w:b/>
+          <w:sz w:val="20"/>
+          <w:szCs w:val="20"/>
+        </w:rPr>
+        <w:t>Regra de consistência:</w:t>
+      </w:r>
+      <w:r>
+        <w:rPr>
+          <w:rFonts w:hint="default" w:ascii="Calibri" w:hAnsi="Calibri" w:cs="Calibri"/>
+          <w:sz w:val="20"/>
+          <w:szCs w:val="20"/>
+        </w:rPr>
+        <w:t xml:space="preserve"> Todo requisito deve possuir</w:t>
+      </w:r>
+      <w:r>
+        <w:rPr>
+          <w:rFonts w:hint="default" w:ascii="Calibri" w:hAnsi="Calibri" w:cs="Calibri"/>
+          <w:sz w:val="20"/>
+          <w:szCs w:val="20"/>
+          <w:lang w:val="pt-BR"/>
+        </w:rPr>
+        <w:t>:</w:t>
+      </w:r>
+    </w:p>
+    <w:p>
+      <w:pPr>
+        <w:numPr>
+          <w:ilvl w:val="0"/>
+          <w:numId w:val="5"/>
+        </w:numPr>
+        <w:tabs>
+          <w:tab w:val="left" w:pos="425"/>
+          <w:tab w:val="clear" w:pos="845"/>
+        </w:tabs>
+        <w:ind w:left="845" w:leftChars="0" w:hanging="425" w:firstLineChars="0"/>
+        <w:rPr>
+          <w:rFonts w:hint="default" w:ascii="Calibri" w:hAnsi="Calibri" w:cs="Calibri"/>
+          <w:sz w:val="20"/>
+          <w:szCs w:val="20"/>
+        </w:rPr>
+      </w:pPr>
+      <w:r>
+        <w:rPr>
+          <w:rFonts w:hint="default" w:ascii="Calibri" w:hAnsi="Calibri" w:cs="Calibri"/>
+          <w:sz w:val="20"/>
+          <w:szCs w:val="20"/>
+        </w:rPr>
+        <w:t>critério de aceite quantificável</w:t>
+      </w:r>
+      <w:bookmarkStart w:id="14" w:name="_GoBack"/>
+      <w:bookmarkEnd w:id="14"/>
+    </w:p>
+    <w:p>
+      <w:pPr>
+        <w:numPr>
+          <w:ilvl w:val="0"/>
+          <w:numId w:val="5"/>
+        </w:numPr>
+        <w:tabs>
+          <w:tab w:val="left" w:pos="425"/>
+          <w:tab w:val="clear" w:pos="845"/>
+        </w:tabs>
+        <w:ind w:left="845" w:leftChars="0" w:hanging="425" w:firstLineChars="0"/>
+        <w:rPr>
+          <w:rFonts w:hint="default" w:ascii="Calibri" w:hAnsi="Calibri" w:cs="Calibri"/>
+          <w:sz w:val="20"/>
+          <w:szCs w:val="20"/>
+        </w:rPr>
+      </w:pPr>
+      <w:r>
+        <w:rPr>
+          <w:rFonts w:hint="default" w:ascii="Calibri" w:hAnsi="Calibri" w:cs="Calibri"/>
+          <w:sz w:val="20"/>
+          <w:szCs w:val="20"/>
+        </w:rPr>
+        <w:t>rastreabilidade ao Objetivo SMART do TAP §3</w:t>
+      </w:r>
+    </w:p>
+    <w:p>
+      <w:pPr>
+        <w:numPr>
+          <w:ilvl w:val="0"/>
+          <w:numId w:val="5"/>
+        </w:numPr>
+        <w:tabs>
+          <w:tab w:val="left" w:pos="425"/>
+          <w:tab w:val="clear" w:pos="845"/>
+        </w:tabs>
+        <w:ind w:left="845" w:leftChars="0" w:hanging="425" w:firstLineChars="0"/>
+        <w:rPr>
+          <w:rFonts w:hint="default" w:ascii="Calibri" w:hAnsi="Calibri" w:cs="Calibri"/>
+          <w:sz w:val="20"/>
+          <w:szCs w:val="20"/>
+        </w:rPr>
+      </w:pPr>
+      <w:r>
+        <w:rPr>
+          <w:rFonts w:hint="default" w:ascii="Calibri" w:hAnsi="Calibri" w:cs="Calibri"/>
+          <w:sz w:val="20"/>
+          <w:szCs w:val="20"/>
+        </w:rPr>
+        <w:t xml:space="preserve">mapeamento ao pacote da EAP </w:t>
+      </w:r>
+    </w:p>
+    <w:p>
+      <w:pPr>
+        <w:numPr>
+          <w:ilvl w:val="0"/>
+          <w:numId w:val="5"/>
+        </w:numPr>
+        <w:tabs>
+          <w:tab w:val="left" w:pos="425"/>
+          <w:tab w:val="clear" w:pos="845"/>
+        </w:tabs>
+        <w:ind w:left="845" w:leftChars="0" w:hanging="425" w:firstLineChars="0"/>
+        <w:rPr>
+          <w:rFonts w:hint="default" w:ascii="Calibri" w:hAnsi="Calibri" w:cs="Calibri"/>
+          <w:sz w:val="20"/>
+          <w:szCs w:val="20"/>
+        </w:rPr>
+      </w:pPr>
+      <w:r>
+        <w:rPr>
+          <w:rFonts w:hint="default" w:ascii="Calibri" w:hAnsi="Calibri" w:cs="Calibri"/>
+          <w:sz w:val="20"/>
+          <w:szCs w:val="20"/>
+        </w:rPr>
+        <w:t>domínio PMBOK 7ª associado.</w:t>
+      </w:r>
+    </w:p>
+    <w:p>
+      <w:pPr>
+        <w:numPr>
+          <w:numId w:val="0"/>
+        </w:numPr>
+        <w:ind w:leftChars="0"/>
+        <w:rPr>
+          <w:rFonts w:hint="default" w:ascii="Calibri" w:hAnsi="Calibri" w:cs="Calibri"/>
+          <w:sz w:val="20"/>
+          <w:szCs w:val="20"/>
+        </w:rPr>
+      </w:pPr>
+    </w:p>
+    <w:p>
+      <w:pPr>
+        <w:pStyle w:val="3"/>
+        <w:bidi w:val="0"/>
+        <w:rPr>
+          <w:rFonts w:hint="default"/>
+        </w:rPr>
+      </w:pPr>
+      <w:r>
+        <w:rPr>
+          <w:rFonts w:hint="default"/>
+        </w:rPr>
+        <w:t>Entrega Principal 1 — MVP Web Funcional (Fase N5)</w:t>
+      </w:r>
+    </w:p>
+    <w:tbl>
+      <w:tblPr>
+        <w:tblStyle w:val="12"/>
+        <w:tblW w:w="5013" w:type="pct"/>
+        <w:jc w:val="center"/>
+        <w:tblCellSpacing w:w="0" w:type="dxa"/>
+        <w:tblBorders>
+          <w:top w:val="single" w:color="000000" w:sz="2" w:space="0"/>
+          <w:left w:val="single" w:color="000000" w:sz="2" w:space="0"/>
+          <w:bottom w:val="single" w:color="000000" w:sz="2" w:space="0"/>
+          <w:right w:val="single" w:color="000000" w:sz="2" w:space="0"/>
+          <w:insideH w:val="none" w:color="auto" w:sz="0" w:space="0"/>
+          <w:insideV w:val="none" w:color="auto" w:sz="0" w:space="0"/>
+        </w:tblBorders>
+        <w:tblLayout w:type="autofit"/>
+        <w:tblCellMar>
+          <w:top w:w="80" w:type="dxa"/>
+          <w:left w:w="160" w:type="dxa"/>
+          <w:bottom w:w="80" w:type="dxa"/>
+          <w:right w:w="160" w:type="dxa"/>
+        </w:tblCellMar>
+      </w:tblPr>
+      <w:tblGrid>
+        <w:gridCol w:w="957"/>
+        <w:gridCol w:w="3066"/>
+        <w:gridCol w:w="2722"/>
+        <w:gridCol w:w="2112"/>
+      </w:tblGrid>
+      <w:tr>
+        <w:tblPrEx>
+          <w:tblBorders>
+            <w:top w:val="single" w:color="000000" w:sz="2" w:space="0"/>
+            <w:left w:val="single" w:color="000000" w:sz="2" w:space="0"/>
+            <w:bottom w:val="single" w:color="000000" w:sz="2" w:space="0"/>
+            <w:right w:val="single" w:color="000000" w:sz="2" w:space="0"/>
+            <w:insideH w:val="none" w:color="auto" w:sz="0" w:space="0"/>
+            <w:insideV w:val="none" w:color="auto" w:sz="0" w:space="0"/>
+          </w:tblBorders>
+          <w:tblCellMar>
+            <w:top w:w="80" w:type="dxa"/>
+            <w:left w:w="160" w:type="dxa"/>
+            <w:bottom w:w="80" w:type="dxa"/>
+            <w:right w:w="160" w:type="dxa"/>
+          </w:tblCellMar>
+        </w:tblPrEx>
+        <w:trPr>
+          <w:tblCellSpacing w:w="0" w:type="dxa"/>
+          <w:jc w:val="center"/>
+        </w:trPr>
+        <w:tc>
+          <w:tcPr>
+            <w:tcW w:w="540" w:type="pct"/>
+            <w:tcBorders>
+              <w:top w:val="single" w:color="000000" w:sz="0" w:space="0"/>
+              <w:left w:val="single" w:color="000000" w:sz="0" w:space="0"/>
+              <w:bottom w:val="single" w:color="000000" w:sz="0" w:space="0"/>
+              <w:right w:val="single" w:color="000000" w:sz="0" w:space="0"/>
+            </w:tcBorders>
+            <w:shd w:val="clear" w:color="auto" w:fill="B9D5F0" w:themeFill="text2" w:themeFillTint="32"/>
+            <w:vAlign w:val="top"/>
+          </w:tcPr>
+          <w:p>
+            <w:pPr>
+              <w:jc w:val="center"/>
+              <w:rPr>
+                <w:rFonts w:hint="default" w:ascii="Calibri" w:hAnsi="Calibri" w:cs="Calibri"/>
+                <w:b/>
+                <w:bCs/>
+                <w:sz w:val="18"/>
+                <w:szCs w:val="18"/>
+              </w:rPr>
+            </w:pPr>
+            <w:r>
+              <w:rPr>
+                <w:rFonts w:hint="default" w:ascii="Calibri" w:hAnsi="Calibri" w:cs="Calibri"/>
+                <w:b/>
+                <w:bCs/>
+                <w:sz w:val="18"/>
+                <w:szCs w:val="18"/>
+              </w:rPr>
+              <w:t>ID</w:t>
+            </w:r>
+          </w:p>
+        </w:tc>
+        <w:tc>
+          <w:tcPr>
+            <w:tcW w:w="1730" w:type="pct"/>
+            <w:tcBorders>
+              <w:top w:val="single" w:color="000000" w:sz="0" w:space="0"/>
+              <w:left w:val="single" w:color="000000" w:sz="0" w:space="0"/>
+              <w:bottom w:val="single" w:color="000000" w:sz="0" w:space="0"/>
+              <w:right w:val="single" w:color="000000" w:sz="0" w:space="0"/>
+            </w:tcBorders>
+            <w:shd w:val="clear" w:color="auto" w:fill="B9D5F0" w:themeFill="text2" w:themeFillTint="32"/>
+            <w:vAlign w:val="top"/>
+          </w:tcPr>
+          <w:p>
+            <w:pPr>
+              <w:jc w:val="center"/>
+              <w:rPr>
+                <w:rFonts w:hint="default" w:ascii="Calibri" w:hAnsi="Calibri" w:cs="Calibri"/>
+                <w:b/>
+                <w:bCs/>
+                <w:sz w:val="18"/>
+                <w:szCs w:val="18"/>
+              </w:rPr>
+            </w:pPr>
+            <w:r>
+              <w:rPr>
+                <w:rFonts w:hint="default" w:ascii="Calibri" w:hAnsi="Calibri" w:cs="Calibri"/>
+                <w:b/>
+                <w:bCs/>
+                <w:sz w:val="18"/>
+                <w:szCs w:val="18"/>
+              </w:rPr>
+              <w:t>Requisito</w:t>
+            </w:r>
+          </w:p>
+        </w:tc>
+        <w:tc>
+          <w:tcPr>
+            <w:tcW w:w="1536" w:type="pct"/>
+            <w:tcBorders>
+              <w:top w:val="single" w:color="000000" w:sz="0" w:space="0"/>
+              <w:left w:val="single" w:color="000000" w:sz="0" w:space="0"/>
+              <w:bottom w:val="single" w:color="000000" w:sz="0" w:space="0"/>
+              <w:right w:val="single" w:color="000000" w:sz="0" w:space="0"/>
+            </w:tcBorders>
+            <w:shd w:val="clear" w:color="auto" w:fill="B9D5F0" w:themeFill="text2" w:themeFillTint="32"/>
+            <w:vAlign w:val="top"/>
+          </w:tcPr>
+          <w:p>
+            <w:pPr>
+              <w:jc w:val="center"/>
+              <w:rPr>
+                <w:rFonts w:hint="default" w:ascii="Calibri" w:hAnsi="Calibri" w:cs="Calibri"/>
+                <w:b/>
+                <w:bCs/>
+                <w:sz w:val="18"/>
+                <w:szCs w:val="18"/>
+              </w:rPr>
+            </w:pPr>
+            <w:r>
+              <w:rPr>
+                <w:rFonts w:hint="default" w:ascii="Calibri" w:hAnsi="Calibri" w:cs="Calibri"/>
+                <w:b/>
+                <w:bCs/>
+                <w:sz w:val="18"/>
+                <w:szCs w:val="18"/>
+              </w:rPr>
+              <w:t>Critério de Aceite</w:t>
+            </w:r>
+          </w:p>
+        </w:tc>
+        <w:tc>
+          <w:tcPr>
+            <w:tcW w:w="1192" w:type="pct"/>
+            <w:tcBorders>
+              <w:top w:val="single" w:color="000000" w:sz="0" w:space="0"/>
+              <w:left w:val="single" w:color="000000" w:sz="0" w:space="0"/>
+              <w:bottom w:val="single" w:color="000000" w:sz="0" w:space="0"/>
+              <w:right w:val="single" w:color="000000" w:sz="0" w:space="0"/>
+            </w:tcBorders>
+            <w:shd w:val="clear" w:color="auto" w:fill="B9D5F0" w:themeFill="text2" w:themeFillTint="32"/>
+            <w:vAlign w:val="top"/>
+          </w:tcPr>
+          <w:p>
+            <w:pPr>
+              <w:jc w:val="center"/>
+              <w:rPr>
+                <w:rFonts w:hint="default" w:ascii="Calibri" w:hAnsi="Calibri" w:cs="Calibri"/>
+                <w:b/>
+                <w:bCs/>
+                <w:sz w:val="18"/>
+                <w:szCs w:val="18"/>
+              </w:rPr>
+            </w:pPr>
+            <w:r>
+              <w:rPr>
+                <w:rFonts w:hint="default" w:ascii="Calibri" w:hAnsi="Calibri" w:cs="Calibri"/>
+                <w:b/>
+                <w:bCs/>
+                <w:sz w:val="18"/>
+                <w:szCs w:val="18"/>
+              </w:rPr>
+              <w:t>Rastreabilidade</w:t>
+            </w:r>
+          </w:p>
+        </w:tc>
+      </w:tr>
+      <w:tr>
+        <w:tblPrEx>
+          <w:tblBorders>
+            <w:top w:val="single" w:color="000000" w:sz="2" w:space="0"/>
+            <w:left w:val="single" w:color="000000" w:sz="2" w:space="0"/>
+            <w:bottom w:val="single" w:color="000000" w:sz="2" w:space="0"/>
+            <w:right w:val="single" w:color="000000" w:sz="2" w:space="0"/>
+            <w:insideH w:val="none" w:color="auto" w:sz="0" w:space="0"/>
+            <w:insideV w:val="none" w:color="auto" w:sz="0" w:space="0"/>
+          </w:tblBorders>
+          <w:tblCellMar>
+            <w:top w:w="80" w:type="dxa"/>
+            <w:left w:w="160" w:type="dxa"/>
+            <w:bottom w:w="80" w:type="dxa"/>
+            <w:right w:w="160" w:type="dxa"/>
+          </w:tblCellMar>
+        </w:tblPrEx>
+        <w:trPr>
+          <w:tblCellSpacing w:w="0" w:type="dxa"/>
+          <w:jc w:val="center"/>
+        </w:trPr>
+        <w:tc>
+          <w:tcPr>
+            <w:tcW w:w="540" w:type="pct"/>
+            <w:tcBorders>
+              <w:top w:val="single" w:color="000000" w:sz="0" w:space="0"/>
+              <w:left w:val="single" w:color="000000" w:sz="0" w:space="0"/>
+              <w:bottom w:val="single" w:color="000000" w:sz="0" w:space="0"/>
+              <w:right w:val="single" w:color="000000" w:sz="0" w:space="0"/>
+            </w:tcBorders>
+          </w:tcPr>
+          <w:p>
+            <w:pPr>
+              <w:rPr>
+                <w:rFonts w:hint="default" w:ascii="Calibri" w:hAnsi="Calibri" w:cs="Calibri"/>
+                <w:sz w:val="18"/>
+                <w:szCs w:val="18"/>
+              </w:rPr>
+            </w:pPr>
+            <w:r>
+              <w:rPr>
+                <w:rFonts w:hint="default" w:ascii="Calibri" w:hAnsi="Calibri" w:cs="Calibri"/>
+                <w:sz w:val="18"/>
+                <w:szCs w:val="18"/>
+              </w:rPr>
+              <w:t>REQ-01</w:t>
+            </w:r>
+          </w:p>
+        </w:tc>
+        <w:tc>
+          <w:tcPr>
+            <w:tcW w:w="1730" w:type="pct"/>
+            <w:tcBorders>
+              <w:top w:val="single" w:color="000000" w:sz="0" w:space="0"/>
+              <w:left w:val="single" w:color="000000" w:sz="0" w:space="0"/>
+              <w:bottom w:val="single" w:color="000000" w:sz="0" w:space="0"/>
+              <w:right w:val="single" w:color="000000" w:sz="0" w:space="0"/>
+            </w:tcBorders>
+          </w:tcPr>
+          <w:p>
+            <w:pPr>
+              <w:rPr>
+                <w:rFonts w:hint="default" w:ascii="Calibri" w:hAnsi="Calibri" w:cs="Calibri"/>
+                <w:sz w:val="18"/>
+                <w:szCs w:val="18"/>
+              </w:rPr>
+            </w:pPr>
+            <w:r>
+              <w:rPr>
+                <w:rFonts w:hint="default" w:ascii="Calibri" w:hAnsi="Calibri" w:cs="Calibri"/>
+                <w:sz w:val="18"/>
+                <w:szCs w:val="18"/>
+              </w:rPr>
+              <w:t>Simulação de conversão cambial em tempo real (USD/EUR → BRL)</w:t>
+            </w:r>
+          </w:p>
+        </w:tc>
+        <w:tc>
+          <w:tcPr>
+            <w:tcW w:w="1536" w:type="pct"/>
+            <w:tcBorders>
+              <w:top w:val="single" w:color="000000" w:sz="0" w:space="0"/>
+              <w:left w:val="single" w:color="000000" w:sz="0" w:space="0"/>
+              <w:bottom w:val="single" w:color="000000" w:sz="0" w:space="0"/>
+              <w:right w:val="single" w:color="000000" w:sz="0" w:space="0"/>
+            </w:tcBorders>
+          </w:tcPr>
+          <w:p>
+            <w:pPr>
+              <w:rPr>
+                <w:rFonts w:hint="default" w:ascii="Calibri" w:hAnsi="Calibri" w:cs="Calibri"/>
+                <w:sz w:val="18"/>
+                <w:szCs w:val="18"/>
+              </w:rPr>
+            </w:pPr>
+            <w:r>
+              <w:rPr>
+                <w:rFonts w:hint="default" w:ascii="Calibri" w:hAnsi="Calibri" w:cs="Calibri"/>
+                <w:sz w:val="18"/>
+                <w:szCs w:val="18"/>
+              </w:rPr>
+              <w:t>Cotação obtida via API externa com latência ≤ 2s</w:t>
+            </w:r>
+          </w:p>
+        </w:tc>
+        <w:tc>
+          <w:tcPr>
+            <w:tcW w:w="1192" w:type="pct"/>
+            <w:tcBorders>
+              <w:top w:val="single" w:color="000000" w:sz="0" w:space="0"/>
+              <w:left w:val="single" w:color="000000" w:sz="0" w:space="0"/>
+              <w:bottom w:val="single" w:color="000000" w:sz="0" w:space="0"/>
+              <w:right w:val="single" w:color="000000" w:sz="0" w:space="0"/>
+            </w:tcBorders>
+          </w:tcPr>
+          <w:p>
+            <w:pPr>
+              <w:rPr>
+                <w:rFonts w:hint="default" w:ascii="Calibri" w:hAnsi="Calibri" w:cs="Calibri"/>
+                <w:sz w:val="18"/>
+                <w:szCs w:val="18"/>
+              </w:rPr>
+            </w:pPr>
+            <w:r>
+              <w:rPr>
+                <w:rFonts w:hint="default" w:ascii="Calibri" w:hAnsi="Calibri" w:cs="Calibri"/>
+                <w:sz w:val="18"/>
+                <w:szCs w:val="18"/>
+              </w:rPr>
+              <w:t>TAP §3 (Produto) + N5.2</w:t>
+            </w:r>
+          </w:p>
+        </w:tc>
+      </w:tr>
+      <w:tr>
+        <w:tblPrEx>
+          <w:tblBorders>
+            <w:top w:val="single" w:color="000000" w:sz="2" w:space="0"/>
+            <w:left w:val="single" w:color="000000" w:sz="2" w:space="0"/>
+            <w:bottom w:val="single" w:color="000000" w:sz="2" w:space="0"/>
+            <w:right w:val="single" w:color="000000" w:sz="2" w:space="0"/>
+            <w:insideH w:val="none" w:color="auto" w:sz="0" w:space="0"/>
+            <w:insideV w:val="none" w:color="auto" w:sz="0" w:space="0"/>
+          </w:tblBorders>
+          <w:tblCellMar>
+            <w:top w:w="80" w:type="dxa"/>
+            <w:left w:w="160" w:type="dxa"/>
+            <w:bottom w:w="80" w:type="dxa"/>
+            <w:right w:w="160" w:type="dxa"/>
+          </w:tblCellMar>
+        </w:tblPrEx>
+        <w:trPr>
+          <w:tblCellSpacing w:w="0" w:type="dxa"/>
+          <w:jc w:val="center"/>
+        </w:trPr>
+        <w:tc>
+          <w:tcPr>
+            <w:tcW w:w="540" w:type="pct"/>
+            <w:tcBorders>
+              <w:top w:val="single" w:color="000000" w:sz="0" w:space="0"/>
+              <w:left w:val="single" w:color="000000" w:sz="0" w:space="0"/>
+              <w:bottom w:val="single" w:color="000000" w:sz="0" w:space="0"/>
+              <w:right w:val="single" w:color="000000" w:sz="0" w:space="0"/>
+            </w:tcBorders>
+          </w:tcPr>
+          <w:p>
+            <w:pPr>
+              <w:rPr>
+                <w:rFonts w:hint="default" w:ascii="Calibri" w:hAnsi="Calibri" w:cs="Calibri"/>
+                <w:sz w:val="18"/>
+                <w:szCs w:val="18"/>
+              </w:rPr>
+            </w:pPr>
+            <w:r>
+              <w:rPr>
+                <w:rFonts w:hint="default" w:ascii="Calibri" w:hAnsi="Calibri" w:cs="Calibri"/>
+                <w:sz w:val="18"/>
+                <w:szCs w:val="18"/>
+              </w:rPr>
+              <w:t>REQ-02</w:t>
+            </w:r>
+          </w:p>
+        </w:tc>
+        <w:tc>
+          <w:tcPr>
+            <w:tcW w:w="1730" w:type="pct"/>
+            <w:tcBorders>
+              <w:top w:val="single" w:color="000000" w:sz="0" w:space="0"/>
+              <w:left w:val="single" w:color="000000" w:sz="0" w:space="0"/>
+              <w:bottom w:val="single" w:color="000000" w:sz="0" w:space="0"/>
+              <w:right w:val="single" w:color="000000" w:sz="0" w:space="0"/>
+            </w:tcBorders>
+          </w:tcPr>
+          <w:p>
+            <w:pPr>
+              <w:rPr>
+                <w:rFonts w:hint="default" w:ascii="Calibri" w:hAnsi="Calibri" w:cs="Calibri"/>
+                <w:sz w:val="18"/>
+                <w:szCs w:val="18"/>
+              </w:rPr>
+            </w:pPr>
+            <w:r>
+              <w:rPr>
+                <w:rFonts w:hint="default" w:ascii="Calibri" w:hAnsi="Calibri" w:cs="Calibri"/>
+                <w:sz w:val="18"/>
+                <w:szCs w:val="18"/>
+              </w:rPr>
+              <w:t>Suporte a 5 regimes de contratação (hora, dia, semana, mês, valor fixo)</w:t>
+            </w:r>
+          </w:p>
+        </w:tc>
+        <w:tc>
+          <w:tcPr>
+            <w:tcW w:w="1536" w:type="pct"/>
+            <w:tcBorders>
+              <w:top w:val="single" w:color="000000" w:sz="0" w:space="0"/>
+              <w:left w:val="single" w:color="000000" w:sz="0" w:space="0"/>
+              <w:bottom w:val="single" w:color="000000" w:sz="0" w:space="0"/>
+              <w:right w:val="single" w:color="000000" w:sz="0" w:space="0"/>
+            </w:tcBorders>
+          </w:tcPr>
+          <w:p>
+            <w:pPr>
+              <w:rPr>
+                <w:rFonts w:hint="default" w:ascii="Calibri" w:hAnsi="Calibri" w:cs="Calibri"/>
+                <w:sz w:val="18"/>
+                <w:szCs w:val="18"/>
+              </w:rPr>
+            </w:pPr>
+            <w:r>
+              <w:rPr>
+                <w:rFonts w:hint="default" w:ascii="Calibri" w:hAnsi="Calibri" w:cs="Calibri"/>
+                <w:sz w:val="18"/>
+                <w:szCs w:val="18"/>
+              </w:rPr>
+              <w:t>100% dos regimes operacionais em UAT</w:t>
+            </w:r>
+          </w:p>
+        </w:tc>
+        <w:tc>
+          <w:tcPr>
+            <w:tcW w:w="1192" w:type="pct"/>
+            <w:tcBorders>
+              <w:top w:val="single" w:color="000000" w:sz="0" w:space="0"/>
+              <w:left w:val="single" w:color="000000" w:sz="0" w:space="0"/>
+              <w:bottom w:val="single" w:color="000000" w:sz="0" w:space="0"/>
+              <w:right w:val="single" w:color="000000" w:sz="0" w:space="0"/>
+            </w:tcBorders>
+          </w:tcPr>
+          <w:p>
+            <w:pPr>
+              <w:rPr>
+                <w:rFonts w:hint="default" w:ascii="Calibri" w:hAnsi="Calibri" w:cs="Calibri"/>
+                <w:sz w:val="18"/>
+                <w:szCs w:val="18"/>
+              </w:rPr>
+            </w:pPr>
+            <w:r>
+              <w:rPr>
+                <w:rFonts w:hint="default" w:ascii="Calibri" w:hAnsi="Calibri" w:cs="Calibri"/>
+                <w:sz w:val="18"/>
+                <w:szCs w:val="18"/>
+              </w:rPr>
+              <w:t>TAP §3 (Produto) + N5.1</w:t>
+            </w:r>
+          </w:p>
+        </w:tc>
+      </w:tr>
+      <w:tr>
+        <w:tblPrEx>
+          <w:tblBorders>
+            <w:top w:val="single" w:color="000000" w:sz="2" w:space="0"/>
+            <w:left w:val="single" w:color="000000" w:sz="2" w:space="0"/>
+            <w:bottom w:val="single" w:color="000000" w:sz="2" w:space="0"/>
+            <w:right w:val="single" w:color="000000" w:sz="2" w:space="0"/>
+            <w:insideH w:val="none" w:color="auto" w:sz="0" w:space="0"/>
+            <w:insideV w:val="none" w:color="auto" w:sz="0" w:space="0"/>
+          </w:tblBorders>
+        </w:tblPrEx>
+        <w:trPr>
+          <w:tblCellSpacing w:w="0" w:type="dxa"/>
+          <w:jc w:val="center"/>
+        </w:trPr>
+        <w:tc>
+          <w:tcPr>
+            <w:tcW w:w="540" w:type="pct"/>
+            <w:tcBorders>
+              <w:top w:val="single" w:color="000000" w:sz="0" w:space="0"/>
+              <w:left w:val="single" w:color="000000" w:sz="0" w:space="0"/>
+              <w:bottom w:val="single" w:color="000000" w:sz="0" w:space="0"/>
+              <w:right w:val="single" w:color="000000" w:sz="0" w:space="0"/>
+            </w:tcBorders>
+          </w:tcPr>
+          <w:p>
+            <w:pPr>
+              <w:rPr>
+                <w:rFonts w:hint="default" w:ascii="Calibri" w:hAnsi="Calibri" w:cs="Calibri"/>
+                <w:sz w:val="18"/>
+                <w:szCs w:val="18"/>
+              </w:rPr>
+            </w:pPr>
+            <w:r>
+              <w:rPr>
+                <w:rFonts w:hint="default" w:ascii="Calibri" w:hAnsi="Calibri" w:cs="Calibri"/>
+                <w:sz w:val="18"/>
+                <w:szCs w:val="18"/>
+              </w:rPr>
+              <w:t>REQ-03</w:t>
+            </w:r>
+          </w:p>
+        </w:tc>
+        <w:tc>
+          <w:tcPr>
+            <w:tcW w:w="1730" w:type="pct"/>
+            <w:tcBorders>
+              <w:top w:val="single" w:color="000000" w:sz="0" w:space="0"/>
+              <w:left w:val="single" w:color="000000" w:sz="0" w:space="0"/>
+              <w:bottom w:val="single" w:color="000000" w:sz="0" w:space="0"/>
+              <w:right w:val="single" w:color="000000" w:sz="0" w:space="0"/>
+            </w:tcBorders>
+          </w:tcPr>
+          <w:p>
+            <w:pPr>
+              <w:rPr>
+                <w:rFonts w:hint="default" w:ascii="Calibri" w:hAnsi="Calibri" w:cs="Calibri"/>
+                <w:sz w:val="18"/>
+                <w:szCs w:val="18"/>
+              </w:rPr>
+            </w:pPr>
+            <w:r>
+              <w:rPr>
+                <w:rFonts w:hint="default" w:ascii="Calibri" w:hAnsi="Calibri" w:cs="Calibri"/>
+                <w:sz w:val="18"/>
+                <w:szCs w:val="18"/>
+              </w:rPr>
+              <w:t>Aplicação de encargos financeiros simulados (spread + IOF)</w:t>
+            </w:r>
+          </w:p>
+        </w:tc>
+        <w:tc>
+          <w:tcPr>
+            <w:tcW w:w="1536" w:type="pct"/>
+            <w:tcBorders>
+              <w:top w:val="single" w:color="000000" w:sz="0" w:space="0"/>
+              <w:left w:val="single" w:color="000000" w:sz="0" w:space="0"/>
+              <w:bottom w:val="single" w:color="000000" w:sz="0" w:space="0"/>
+              <w:right w:val="single" w:color="000000" w:sz="0" w:space="0"/>
+            </w:tcBorders>
+          </w:tcPr>
+          <w:p>
+            <w:pPr>
+              <w:rPr>
+                <w:rFonts w:hint="default" w:ascii="Calibri" w:hAnsi="Calibri" w:cs="Calibri"/>
+                <w:sz w:val="18"/>
+                <w:szCs w:val="18"/>
+              </w:rPr>
+            </w:pPr>
+            <w:r>
+              <w:rPr>
+                <w:rFonts w:hint="default" w:ascii="Calibri" w:hAnsi="Calibri" w:cs="Calibri"/>
+                <w:sz w:val="18"/>
+                <w:szCs w:val="18"/>
+              </w:rPr>
+              <w:t>Cálculo auditável com precisão de 2 casas decimais</w:t>
+            </w:r>
+          </w:p>
+        </w:tc>
+        <w:tc>
+          <w:tcPr>
+            <w:tcW w:w="1192" w:type="pct"/>
+            <w:tcBorders>
+              <w:top w:val="single" w:color="000000" w:sz="0" w:space="0"/>
+              <w:left w:val="single" w:color="000000" w:sz="0" w:space="0"/>
+              <w:bottom w:val="single" w:color="000000" w:sz="0" w:space="0"/>
+              <w:right w:val="single" w:color="000000" w:sz="0" w:space="0"/>
+            </w:tcBorders>
+          </w:tcPr>
+          <w:p>
+            <w:pPr>
+              <w:rPr>
+                <w:rFonts w:hint="default" w:ascii="Calibri" w:hAnsi="Calibri" w:cs="Calibri"/>
+                <w:sz w:val="18"/>
+                <w:szCs w:val="18"/>
+              </w:rPr>
+            </w:pPr>
+            <w:r>
+              <w:rPr>
+                <w:rFonts w:hint="default" w:ascii="Calibri" w:hAnsi="Calibri" w:cs="Calibri"/>
+                <w:sz w:val="18"/>
+                <w:szCs w:val="18"/>
+              </w:rPr>
+              <w:t>TAP §3 (Produto) + N5.1</w:t>
+            </w:r>
+          </w:p>
+        </w:tc>
+      </w:tr>
+      <w:tr>
+        <w:tblPrEx>
+          <w:tblBorders>
+            <w:top w:val="single" w:color="000000" w:sz="2" w:space="0"/>
+            <w:left w:val="single" w:color="000000" w:sz="2" w:space="0"/>
+            <w:bottom w:val="single" w:color="000000" w:sz="2" w:space="0"/>
+            <w:right w:val="single" w:color="000000" w:sz="2" w:space="0"/>
+            <w:insideH w:val="none" w:color="auto" w:sz="0" w:space="0"/>
+            <w:insideV w:val="none" w:color="auto" w:sz="0" w:space="0"/>
+          </w:tblBorders>
+          <w:tblCellMar>
+            <w:top w:w="80" w:type="dxa"/>
+            <w:left w:w="160" w:type="dxa"/>
+            <w:bottom w:w="80" w:type="dxa"/>
+            <w:right w:w="160" w:type="dxa"/>
+          </w:tblCellMar>
+        </w:tblPrEx>
+        <w:trPr>
+          <w:tblCellSpacing w:w="0" w:type="dxa"/>
+          <w:jc w:val="center"/>
+        </w:trPr>
+        <w:tc>
+          <w:tcPr>
+            <w:tcW w:w="540" w:type="pct"/>
+            <w:tcBorders>
+              <w:top w:val="single" w:color="000000" w:sz="0" w:space="0"/>
+              <w:left w:val="single" w:color="000000" w:sz="0" w:space="0"/>
+              <w:bottom w:val="single" w:color="000000" w:sz="0" w:space="0"/>
+              <w:right w:val="single" w:color="000000" w:sz="0" w:space="0"/>
+            </w:tcBorders>
+          </w:tcPr>
+          <w:p>
+            <w:pPr>
+              <w:rPr>
+                <w:rFonts w:hint="default" w:ascii="Calibri" w:hAnsi="Calibri" w:cs="Calibri"/>
+                <w:sz w:val="18"/>
+                <w:szCs w:val="18"/>
+              </w:rPr>
+            </w:pPr>
+            <w:r>
+              <w:rPr>
+                <w:rFonts w:hint="default" w:ascii="Calibri" w:hAnsi="Calibri" w:cs="Calibri"/>
+                <w:sz w:val="18"/>
+                <w:szCs w:val="18"/>
+              </w:rPr>
+              <w:t>REQ-04</w:t>
+            </w:r>
+          </w:p>
+        </w:tc>
+        <w:tc>
+          <w:tcPr>
+            <w:tcW w:w="1730" w:type="pct"/>
+            <w:tcBorders>
+              <w:top w:val="single" w:color="000000" w:sz="0" w:space="0"/>
+              <w:left w:val="single" w:color="000000" w:sz="0" w:space="0"/>
+              <w:bottom w:val="single" w:color="000000" w:sz="0" w:space="0"/>
+              <w:right w:val="single" w:color="000000" w:sz="0" w:space="0"/>
+            </w:tcBorders>
+          </w:tcPr>
+          <w:p>
+            <w:pPr>
+              <w:rPr>
+                <w:rFonts w:hint="default" w:ascii="Calibri" w:hAnsi="Calibri" w:cs="Calibri"/>
+                <w:sz w:val="18"/>
+                <w:szCs w:val="18"/>
+              </w:rPr>
+            </w:pPr>
+            <w:r>
+              <w:rPr>
+                <w:rFonts w:hint="default" w:ascii="Calibri" w:hAnsi="Calibri" w:cs="Calibri"/>
+                <w:sz w:val="18"/>
+                <w:szCs w:val="18"/>
+              </w:rPr>
+              <w:t>Emissão de invoice em formato PDF</w:t>
+            </w:r>
+          </w:p>
+        </w:tc>
+        <w:tc>
+          <w:tcPr>
+            <w:tcW w:w="1536" w:type="pct"/>
+            <w:tcBorders>
+              <w:top w:val="single" w:color="000000" w:sz="0" w:space="0"/>
+              <w:left w:val="single" w:color="000000" w:sz="0" w:space="0"/>
+              <w:bottom w:val="single" w:color="000000" w:sz="0" w:space="0"/>
+              <w:right w:val="single" w:color="000000" w:sz="0" w:space="0"/>
+            </w:tcBorders>
+          </w:tcPr>
+          <w:p>
+            <w:pPr>
+              <w:rPr>
+                <w:rFonts w:hint="default" w:ascii="Calibri" w:hAnsi="Calibri" w:cs="Calibri"/>
+                <w:sz w:val="18"/>
+                <w:szCs w:val="18"/>
+              </w:rPr>
+            </w:pPr>
+            <w:r>
+              <w:rPr>
+                <w:rFonts w:hint="default" w:ascii="Calibri" w:hAnsi="Calibri" w:cs="Calibri"/>
+                <w:sz w:val="18"/>
+                <w:szCs w:val="18"/>
+              </w:rPr>
+              <w:t>Geração via WeasyPrint em ≤ 3s por documento</w:t>
+            </w:r>
+          </w:p>
+        </w:tc>
+        <w:tc>
+          <w:tcPr>
+            <w:tcW w:w="1192" w:type="pct"/>
+            <w:tcBorders>
+              <w:top w:val="single" w:color="000000" w:sz="0" w:space="0"/>
+              <w:left w:val="single" w:color="000000" w:sz="0" w:space="0"/>
+              <w:bottom w:val="single" w:color="000000" w:sz="0" w:space="0"/>
+              <w:right w:val="single" w:color="000000" w:sz="0" w:space="0"/>
+            </w:tcBorders>
+          </w:tcPr>
+          <w:p>
+            <w:pPr>
+              <w:rPr>
+                <w:rFonts w:hint="default" w:ascii="Calibri" w:hAnsi="Calibri" w:cs="Calibri"/>
+                <w:sz w:val="18"/>
+                <w:szCs w:val="18"/>
+              </w:rPr>
+            </w:pPr>
+            <w:r>
+              <w:rPr>
+                <w:rFonts w:hint="default" w:ascii="Calibri" w:hAnsi="Calibri" w:cs="Calibri"/>
+                <w:sz w:val="18"/>
+                <w:szCs w:val="18"/>
+              </w:rPr>
+              <w:t>TAP §3 (Produto) + N5.4</w:t>
+            </w:r>
+          </w:p>
+        </w:tc>
+      </w:tr>
+      <w:tr>
+        <w:tblPrEx>
+          <w:tblBorders>
+            <w:top w:val="single" w:color="000000" w:sz="2" w:space="0"/>
+            <w:left w:val="single" w:color="000000" w:sz="2" w:space="0"/>
+            <w:bottom w:val="single" w:color="000000" w:sz="2" w:space="0"/>
+            <w:right w:val="single" w:color="000000" w:sz="2" w:space="0"/>
+            <w:insideH w:val="none" w:color="auto" w:sz="0" w:space="0"/>
+            <w:insideV w:val="none" w:color="auto" w:sz="0" w:space="0"/>
+          </w:tblBorders>
+          <w:tblCellMar>
+            <w:top w:w="80" w:type="dxa"/>
+            <w:left w:w="160" w:type="dxa"/>
+            <w:bottom w:w="80" w:type="dxa"/>
+            <w:right w:w="160" w:type="dxa"/>
+          </w:tblCellMar>
+        </w:tblPrEx>
+        <w:trPr>
+          <w:tblCellSpacing w:w="0" w:type="dxa"/>
+          <w:jc w:val="center"/>
+        </w:trPr>
+        <w:tc>
+          <w:tcPr>
+            <w:tcW w:w="540" w:type="pct"/>
+            <w:tcBorders>
+              <w:top w:val="single" w:color="000000" w:sz="0" w:space="0"/>
+              <w:left w:val="single" w:color="000000" w:sz="0" w:space="0"/>
+              <w:bottom w:val="single" w:color="000000" w:sz="0" w:space="0"/>
+              <w:right w:val="single" w:color="000000" w:sz="0" w:space="0"/>
+            </w:tcBorders>
+          </w:tcPr>
+          <w:p>
+            <w:pPr>
+              <w:rPr>
+                <w:rFonts w:hint="default" w:ascii="Calibri" w:hAnsi="Calibri" w:cs="Calibri"/>
+                <w:sz w:val="18"/>
+                <w:szCs w:val="18"/>
+              </w:rPr>
+            </w:pPr>
+            <w:r>
+              <w:rPr>
+                <w:rFonts w:hint="default" w:ascii="Calibri" w:hAnsi="Calibri" w:cs="Calibri"/>
+                <w:sz w:val="18"/>
+                <w:szCs w:val="18"/>
+              </w:rPr>
+              <w:t>REQ-05</w:t>
+            </w:r>
+          </w:p>
+        </w:tc>
+        <w:tc>
+          <w:tcPr>
+            <w:tcW w:w="1730" w:type="pct"/>
+            <w:tcBorders>
+              <w:top w:val="single" w:color="000000" w:sz="0" w:space="0"/>
+              <w:left w:val="single" w:color="000000" w:sz="0" w:space="0"/>
+              <w:bottom w:val="single" w:color="000000" w:sz="0" w:space="0"/>
+              <w:right w:val="single" w:color="000000" w:sz="0" w:space="0"/>
+            </w:tcBorders>
+          </w:tcPr>
+          <w:p>
+            <w:pPr>
+              <w:rPr>
+                <w:rFonts w:hint="default" w:ascii="Calibri" w:hAnsi="Calibri" w:cs="Calibri"/>
+                <w:sz w:val="18"/>
+                <w:szCs w:val="18"/>
+              </w:rPr>
+            </w:pPr>
+            <w:r>
+              <w:rPr>
+                <w:rFonts w:hint="default" w:ascii="Calibri" w:hAnsi="Calibri" w:cs="Calibri"/>
+                <w:sz w:val="18"/>
+                <w:szCs w:val="18"/>
+              </w:rPr>
+              <w:t>Tempo de resposta da aplicação</w:t>
+            </w:r>
+          </w:p>
+        </w:tc>
+        <w:tc>
+          <w:tcPr>
+            <w:tcW w:w="1536" w:type="pct"/>
+            <w:tcBorders>
+              <w:top w:val="single" w:color="000000" w:sz="0" w:space="0"/>
+              <w:left w:val="single" w:color="000000" w:sz="0" w:space="0"/>
+              <w:bottom w:val="single" w:color="000000" w:sz="0" w:space="0"/>
+              <w:right w:val="single" w:color="000000" w:sz="0" w:space="0"/>
+            </w:tcBorders>
+          </w:tcPr>
+          <w:p>
+            <w:pPr>
+              <w:rPr>
+                <w:rFonts w:hint="default" w:ascii="Calibri" w:hAnsi="Calibri" w:cs="Calibri"/>
+                <w:sz w:val="18"/>
+                <w:szCs w:val="18"/>
+              </w:rPr>
+            </w:pPr>
+            <w:r>
+              <w:rPr>
+                <w:rFonts w:hint="default" w:ascii="Calibri" w:hAnsi="Calibri" w:cs="Calibri"/>
+                <w:sz w:val="18"/>
+                <w:szCs w:val="18"/>
+              </w:rPr>
+              <w:t>≤ 3s em 95% das requisições (ambiente homologação)</w:t>
+            </w:r>
+          </w:p>
+        </w:tc>
+        <w:tc>
+          <w:tcPr>
+            <w:tcW w:w="1192" w:type="pct"/>
+            <w:tcBorders>
+              <w:top w:val="single" w:color="000000" w:sz="0" w:space="0"/>
+              <w:left w:val="single" w:color="000000" w:sz="0" w:space="0"/>
+              <w:bottom w:val="single" w:color="000000" w:sz="0" w:space="0"/>
+              <w:right w:val="single" w:color="000000" w:sz="0" w:space="0"/>
+            </w:tcBorders>
+          </w:tcPr>
+          <w:p>
+            <w:pPr>
+              <w:rPr>
+                <w:rFonts w:hint="default" w:ascii="Calibri" w:hAnsi="Calibri" w:cs="Calibri"/>
+                <w:sz w:val="18"/>
+                <w:szCs w:val="18"/>
+              </w:rPr>
+            </w:pPr>
+            <w:r>
+              <w:rPr>
+                <w:rFonts w:hint="default" w:ascii="Calibri" w:hAnsi="Calibri" w:cs="Calibri"/>
+                <w:sz w:val="18"/>
+                <w:szCs w:val="18"/>
+              </w:rPr>
+              <w:t>TAP §3 (Produto — M) + N5.1</w:t>
+            </w:r>
+          </w:p>
+        </w:tc>
+      </w:tr>
+      <w:tr>
+        <w:tblPrEx>
+          <w:tblBorders>
+            <w:top w:val="single" w:color="000000" w:sz="2" w:space="0"/>
+            <w:left w:val="single" w:color="000000" w:sz="2" w:space="0"/>
+            <w:bottom w:val="single" w:color="000000" w:sz="2" w:space="0"/>
+            <w:right w:val="single" w:color="000000" w:sz="2" w:space="0"/>
+            <w:insideH w:val="none" w:color="auto" w:sz="0" w:space="0"/>
+            <w:insideV w:val="none" w:color="auto" w:sz="0" w:space="0"/>
+          </w:tblBorders>
+          <w:tblCellMar>
+            <w:top w:w="80" w:type="dxa"/>
+            <w:left w:w="160" w:type="dxa"/>
+            <w:bottom w:w="80" w:type="dxa"/>
+            <w:right w:w="160" w:type="dxa"/>
+          </w:tblCellMar>
+        </w:tblPrEx>
+        <w:trPr>
+          <w:tblCellSpacing w:w="0" w:type="dxa"/>
+          <w:jc w:val="center"/>
+        </w:trPr>
+        <w:tc>
+          <w:tcPr>
+            <w:tcW w:w="540" w:type="pct"/>
+            <w:tcBorders>
+              <w:top w:val="single" w:color="000000" w:sz="0" w:space="0"/>
+              <w:left w:val="single" w:color="000000" w:sz="0" w:space="0"/>
+              <w:bottom w:val="single" w:color="000000" w:sz="0" w:space="0"/>
+              <w:right w:val="single" w:color="000000" w:sz="0" w:space="0"/>
+            </w:tcBorders>
+          </w:tcPr>
+          <w:p>
+            <w:pPr>
+              <w:rPr>
+                <w:rFonts w:hint="default" w:ascii="Calibri" w:hAnsi="Calibri" w:cs="Calibri"/>
+                <w:sz w:val="18"/>
+                <w:szCs w:val="18"/>
+              </w:rPr>
+            </w:pPr>
+            <w:r>
+              <w:rPr>
+                <w:rFonts w:hint="default" w:ascii="Calibri" w:hAnsi="Calibri" w:cs="Calibri"/>
+                <w:sz w:val="18"/>
+                <w:szCs w:val="18"/>
+              </w:rPr>
+              <w:t>REQ-06</w:t>
+            </w:r>
+          </w:p>
+        </w:tc>
+        <w:tc>
+          <w:tcPr>
+            <w:tcW w:w="1730" w:type="pct"/>
+            <w:tcBorders>
+              <w:top w:val="single" w:color="000000" w:sz="0" w:space="0"/>
+              <w:left w:val="single" w:color="000000" w:sz="0" w:space="0"/>
+              <w:bottom w:val="single" w:color="000000" w:sz="0" w:space="0"/>
+              <w:right w:val="single" w:color="000000" w:sz="0" w:space="0"/>
+            </w:tcBorders>
+          </w:tcPr>
+          <w:p>
+            <w:pPr>
+              <w:rPr>
+                <w:rFonts w:hint="default" w:ascii="Calibri" w:hAnsi="Calibri" w:cs="Calibri"/>
+                <w:sz w:val="18"/>
+                <w:szCs w:val="18"/>
+              </w:rPr>
+            </w:pPr>
+            <w:r>
+              <w:rPr>
+                <w:rFonts w:hint="default" w:ascii="Calibri" w:hAnsi="Calibri" w:cs="Calibri"/>
+                <w:sz w:val="18"/>
+                <w:szCs w:val="18"/>
+              </w:rPr>
+              <w:t>Interface web responsiva (FOSS)</w:t>
+            </w:r>
+          </w:p>
+        </w:tc>
+        <w:tc>
+          <w:tcPr>
+            <w:tcW w:w="1536" w:type="pct"/>
+            <w:tcBorders>
+              <w:top w:val="single" w:color="000000" w:sz="0" w:space="0"/>
+              <w:left w:val="single" w:color="000000" w:sz="0" w:space="0"/>
+              <w:bottom w:val="single" w:color="000000" w:sz="0" w:space="0"/>
+              <w:right w:val="single" w:color="000000" w:sz="0" w:space="0"/>
+            </w:tcBorders>
+          </w:tcPr>
+          <w:p>
+            <w:pPr>
+              <w:rPr>
+                <w:rFonts w:hint="default" w:ascii="Calibri" w:hAnsi="Calibri" w:cs="Calibri"/>
+                <w:sz w:val="18"/>
+                <w:szCs w:val="18"/>
+              </w:rPr>
+            </w:pPr>
+            <w:r>
+              <w:rPr>
+                <w:rFonts w:hint="default" w:ascii="Calibri" w:hAnsi="Calibri" w:cs="Calibri"/>
+                <w:sz w:val="18"/>
+                <w:szCs w:val="18"/>
+              </w:rPr>
+              <w:t>Compatível com Chrome/Firefox/Edge (últimas 2 versões)</w:t>
+            </w:r>
+          </w:p>
+        </w:tc>
+        <w:tc>
+          <w:tcPr>
+            <w:tcW w:w="1192" w:type="pct"/>
+            <w:tcBorders>
+              <w:top w:val="single" w:color="000000" w:sz="0" w:space="0"/>
+              <w:left w:val="single" w:color="000000" w:sz="0" w:space="0"/>
+              <w:bottom w:val="single" w:color="000000" w:sz="0" w:space="0"/>
+              <w:right w:val="single" w:color="000000" w:sz="0" w:space="0"/>
+            </w:tcBorders>
+          </w:tcPr>
+          <w:p>
+            <w:pPr>
+              <w:rPr>
+                <w:rFonts w:hint="default" w:ascii="Calibri" w:hAnsi="Calibri" w:cs="Calibri"/>
+                <w:sz w:val="18"/>
+                <w:szCs w:val="18"/>
+              </w:rPr>
+            </w:pPr>
+            <w:r>
+              <w:rPr>
+                <w:rFonts w:hint="default" w:ascii="Calibri" w:hAnsi="Calibri" w:cs="Calibri"/>
+                <w:sz w:val="18"/>
+                <w:szCs w:val="18"/>
+              </w:rPr>
+              <w:t>TAP §3 (Inovação) + N5.3</w:t>
+            </w:r>
+          </w:p>
+        </w:tc>
+      </w:tr>
+      <w:tr>
+        <w:tblPrEx>
+          <w:tblBorders>
+            <w:top w:val="single" w:color="000000" w:sz="2" w:space="0"/>
+            <w:left w:val="single" w:color="000000" w:sz="2" w:space="0"/>
+            <w:bottom w:val="single" w:color="000000" w:sz="2" w:space="0"/>
+            <w:right w:val="single" w:color="000000" w:sz="2" w:space="0"/>
+            <w:insideH w:val="none" w:color="auto" w:sz="0" w:space="0"/>
+            <w:insideV w:val="none" w:color="auto" w:sz="0" w:space="0"/>
+          </w:tblBorders>
+        </w:tblPrEx>
+        <w:trPr>
+          <w:tblCellSpacing w:w="0" w:type="dxa"/>
+          <w:jc w:val="center"/>
+        </w:trPr>
+        <w:tc>
+          <w:tcPr>
+            <w:tcW w:w="540" w:type="pct"/>
+            <w:tcBorders>
+              <w:top w:val="single" w:color="000000" w:sz="0" w:space="0"/>
+              <w:left w:val="single" w:color="000000" w:sz="0" w:space="0"/>
+              <w:bottom w:val="single" w:color="000000" w:sz="0" w:space="0"/>
+              <w:right w:val="single" w:color="000000" w:sz="0" w:space="0"/>
+            </w:tcBorders>
+          </w:tcPr>
+          <w:p>
+            <w:pPr>
+              <w:rPr>
+                <w:rFonts w:hint="default" w:ascii="Calibri" w:hAnsi="Calibri" w:cs="Calibri"/>
+                <w:sz w:val="18"/>
+                <w:szCs w:val="18"/>
+              </w:rPr>
+            </w:pPr>
+            <w:r>
+              <w:rPr>
+                <w:rFonts w:hint="default" w:ascii="Calibri" w:hAnsi="Calibri" w:cs="Calibri"/>
+                <w:sz w:val="18"/>
+                <w:szCs w:val="18"/>
+              </w:rPr>
+              <w:t>REQ-07</w:t>
+            </w:r>
+          </w:p>
+        </w:tc>
+        <w:tc>
+          <w:tcPr>
+            <w:tcW w:w="1730" w:type="pct"/>
+            <w:tcBorders>
+              <w:top w:val="single" w:color="000000" w:sz="0" w:space="0"/>
+              <w:left w:val="single" w:color="000000" w:sz="0" w:space="0"/>
+              <w:bottom w:val="single" w:color="000000" w:sz="0" w:space="0"/>
+              <w:right w:val="single" w:color="000000" w:sz="0" w:space="0"/>
+            </w:tcBorders>
+          </w:tcPr>
+          <w:p>
+            <w:pPr>
+              <w:rPr>
+                <w:rFonts w:hint="default" w:ascii="Calibri" w:hAnsi="Calibri" w:cs="Calibri"/>
+                <w:sz w:val="18"/>
+                <w:szCs w:val="18"/>
+              </w:rPr>
+            </w:pPr>
+            <w:r>
+              <w:rPr>
+                <w:rFonts w:hint="default" w:ascii="Calibri" w:hAnsi="Calibri" w:cs="Calibri"/>
+                <w:sz w:val="18"/>
+                <w:szCs w:val="18"/>
+              </w:rPr>
+              <w:t>Cache de cotações (SQLite)</w:t>
+            </w:r>
+          </w:p>
+        </w:tc>
+        <w:tc>
+          <w:tcPr>
+            <w:tcW w:w="1536" w:type="pct"/>
+            <w:tcBorders>
+              <w:top w:val="single" w:color="000000" w:sz="0" w:space="0"/>
+              <w:left w:val="single" w:color="000000" w:sz="0" w:space="0"/>
+              <w:bottom w:val="single" w:color="000000" w:sz="0" w:space="0"/>
+              <w:right w:val="single" w:color="000000" w:sz="0" w:space="0"/>
+            </w:tcBorders>
+          </w:tcPr>
+          <w:p>
+            <w:pPr>
+              <w:rPr>
+                <w:rFonts w:hint="default" w:ascii="Calibri" w:hAnsi="Calibri" w:cs="Calibri"/>
+                <w:sz w:val="18"/>
+                <w:szCs w:val="18"/>
+              </w:rPr>
+            </w:pPr>
+            <w:r>
+              <w:rPr>
+                <w:rFonts w:hint="default" w:ascii="Calibri" w:hAnsi="Calibri" w:cs="Calibri"/>
+                <w:sz w:val="18"/>
+                <w:szCs w:val="18"/>
+              </w:rPr>
+              <w:t>Redução de ≥ 50% das chamadas à API externa</w:t>
+            </w:r>
+          </w:p>
+        </w:tc>
+        <w:tc>
+          <w:tcPr>
+            <w:tcW w:w="1192" w:type="pct"/>
+            <w:tcBorders>
+              <w:top w:val="single" w:color="000000" w:sz="0" w:space="0"/>
+              <w:left w:val="single" w:color="000000" w:sz="0" w:space="0"/>
+              <w:bottom w:val="single" w:color="000000" w:sz="0" w:space="0"/>
+              <w:right w:val="single" w:color="000000" w:sz="0" w:space="0"/>
+            </w:tcBorders>
+          </w:tcPr>
+          <w:p>
+            <w:pPr>
+              <w:rPr>
+                <w:rFonts w:hint="default" w:ascii="Calibri" w:hAnsi="Calibri" w:cs="Calibri"/>
+                <w:sz w:val="18"/>
+                <w:szCs w:val="18"/>
+              </w:rPr>
+            </w:pPr>
+            <w:r>
+              <w:rPr>
+                <w:rFonts w:hint="default" w:ascii="Calibri" w:hAnsi="Calibri" w:cs="Calibri"/>
+                <w:sz w:val="18"/>
+                <w:szCs w:val="18"/>
+              </w:rPr>
+              <w:t>OKB v3.1 §4.2 + N5.2</w:t>
+            </w:r>
+          </w:p>
+        </w:tc>
+      </w:tr>
+    </w:tbl>
+    <w:p>
+      <w:pPr>
+        <w:rPr>
+          <w:rFonts w:hint="default" w:ascii="Calibri" w:hAnsi="Calibri" w:cs="Calibri"/>
+        </w:rPr>
+      </w:pPr>
+    </w:p>
+    <w:p>
+      <w:pPr>
+        <w:pStyle w:val="3"/>
+        <w:bidi w:val="0"/>
+        <w:rPr>
+          <w:rFonts w:hint="default"/>
+        </w:rPr>
+      </w:pPr>
+      <w:r>
+        <w:rPr>
+          <w:rFonts w:hint="default"/>
+        </w:rPr>
+        <w:t>Entrega Principal 2 — Garantia da Qualidade (Fase N6)</w:t>
+      </w:r>
+    </w:p>
+    <w:tbl>
+      <w:tblPr>
+        <w:tblStyle w:val="12"/>
+        <w:tblW w:w="0" w:type="auto"/>
+        <w:jc w:val="center"/>
+        <w:tblCellSpacing w:w="0" w:type="dxa"/>
+        <w:tblBorders>
+          <w:top w:val="single" w:color="000000" w:sz="2" w:space="0"/>
+          <w:left w:val="single" w:color="000000" w:sz="2" w:space="0"/>
+          <w:bottom w:val="single" w:color="000000" w:sz="2" w:space="0"/>
+          <w:right w:val="single" w:color="000000" w:sz="2" w:space="0"/>
+          <w:insideH w:val="none" w:color="auto" w:sz="0" w:space="0"/>
+          <w:insideV w:val="none" w:color="auto" w:sz="0" w:space="0"/>
+        </w:tblBorders>
+        <w:tblLayout w:type="autofit"/>
+        <w:tblCellMar>
+          <w:top w:w="80" w:type="dxa"/>
+          <w:left w:w="160" w:type="dxa"/>
+          <w:bottom w:w="80" w:type="dxa"/>
+          <w:right w:w="160" w:type="dxa"/>
+        </w:tblCellMar>
+      </w:tblPr>
+      <w:tblGrid>
+        <w:gridCol w:w="753"/>
+        <w:gridCol w:w="2643"/>
+        <w:gridCol w:w="3670"/>
+        <w:gridCol w:w="1768"/>
+      </w:tblGrid>
+      <w:tr>
+        <w:tblPrEx>
+          <w:tblBorders>
+            <w:top w:val="single" w:color="000000" w:sz="2" w:space="0"/>
+            <w:left w:val="single" w:color="000000" w:sz="2" w:space="0"/>
+            <w:bottom w:val="single" w:color="000000" w:sz="2" w:space="0"/>
+            <w:right w:val="single" w:color="000000" w:sz="2" w:space="0"/>
+            <w:insideH w:val="none" w:color="auto" w:sz="0" w:space="0"/>
+            <w:insideV w:val="none" w:color="auto" w:sz="0" w:space="0"/>
+          </w:tblBorders>
+          <w:tblCellMar>
+            <w:top w:w="80" w:type="dxa"/>
+            <w:left w:w="160" w:type="dxa"/>
+            <w:bottom w:w="80" w:type="dxa"/>
+            <w:right w:w="160" w:type="dxa"/>
+          </w:tblCellMar>
+        </w:tblPrEx>
+        <w:trPr>
+          <w:tblCellSpacing w:w="0" w:type="dxa"/>
+          <w:jc w:val="center"/>
+        </w:trPr>
+        <w:tc>
+          <w:tcPr>
+            <w:tcBorders>
+              <w:top w:val="single" w:color="000000" w:sz="0" w:space="0"/>
+              <w:left w:val="single" w:color="000000" w:sz="0" w:space="0"/>
+              <w:bottom w:val="single" w:color="000000" w:sz="0" w:space="0"/>
+              <w:right w:val="single" w:color="000000" w:sz="0" w:space="0"/>
+            </w:tcBorders>
+            <w:shd w:val="clear" w:color="auto" w:fill="B9D5F0" w:themeFill="text2" w:themeFillTint="32"/>
+            <w:vAlign w:val="top"/>
+          </w:tcPr>
+          <w:p>
+            <w:pPr>
+              <w:jc w:val="center"/>
+              <w:rPr>
+                <w:rFonts w:hint="default" w:ascii="Calibri" w:hAnsi="Calibri" w:cs="Calibri"/>
+                <w:b/>
+                <w:bCs/>
+                <w:sz w:val="18"/>
+                <w:szCs w:val="18"/>
+              </w:rPr>
+            </w:pPr>
+            <w:r>
+              <w:rPr>
+                <w:rFonts w:hint="default" w:ascii="Calibri" w:hAnsi="Calibri" w:cs="Calibri"/>
+                <w:b/>
+                <w:bCs/>
+                <w:sz w:val="18"/>
+                <w:szCs w:val="18"/>
+              </w:rPr>
+              <w:t>ID</w:t>
+            </w:r>
+          </w:p>
+        </w:tc>
+        <w:tc>
+          <w:tcPr>
+            <w:tcBorders>
+              <w:top w:val="single" w:color="000000" w:sz="0" w:space="0"/>
+              <w:left w:val="single" w:color="000000" w:sz="0" w:space="0"/>
+              <w:bottom w:val="single" w:color="000000" w:sz="0" w:space="0"/>
+              <w:right w:val="single" w:color="000000" w:sz="0" w:space="0"/>
+            </w:tcBorders>
+            <w:shd w:val="clear" w:color="auto" w:fill="B9D5F0" w:themeFill="text2" w:themeFillTint="32"/>
+            <w:vAlign w:val="top"/>
+          </w:tcPr>
+          <w:p>
+            <w:pPr>
+              <w:jc w:val="center"/>
+              <w:rPr>
+                <w:rFonts w:hint="default" w:ascii="Calibri" w:hAnsi="Calibri" w:cs="Calibri"/>
+                <w:b/>
+                <w:bCs/>
+                <w:sz w:val="18"/>
+                <w:szCs w:val="18"/>
+              </w:rPr>
+            </w:pPr>
+            <w:r>
+              <w:rPr>
+                <w:rFonts w:hint="default" w:ascii="Calibri" w:hAnsi="Calibri" w:cs="Calibri"/>
+                <w:b/>
+                <w:bCs/>
+                <w:sz w:val="18"/>
+                <w:szCs w:val="18"/>
+              </w:rPr>
+              <w:t>Requisito</w:t>
+            </w:r>
+          </w:p>
+        </w:tc>
+        <w:tc>
+          <w:tcPr>
+            <w:tcBorders>
+              <w:top w:val="single" w:color="000000" w:sz="0" w:space="0"/>
+              <w:left w:val="single" w:color="000000" w:sz="0" w:space="0"/>
+              <w:bottom w:val="single" w:color="000000" w:sz="0" w:space="0"/>
+              <w:right w:val="single" w:color="000000" w:sz="0" w:space="0"/>
+            </w:tcBorders>
+            <w:shd w:val="clear" w:color="auto" w:fill="B9D5F0" w:themeFill="text2" w:themeFillTint="32"/>
+            <w:vAlign w:val="top"/>
+          </w:tcPr>
+          <w:p>
+            <w:pPr>
+              <w:jc w:val="center"/>
+              <w:rPr>
+                <w:rFonts w:hint="default" w:ascii="Calibri" w:hAnsi="Calibri" w:cs="Calibri"/>
+                <w:b/>
+                <w:bCs/>
+                <w:sz w:val="18"/>
+                <w:szCs w:val="18"/>
+              </w:rPr>
+            </w:pPr>
+            <w:r>
+              <w:rPr>
+                <w:rFonts w:hint="default" w:ascii="Calibri" w:hAnsi="Calibri" w:cs="Calibri"/>
+                <w:b/>
+                <w:bCs/>
+                <w:sz w:val="18"/>
+                <w:szCs w:val="18"/>
+              </w:rPr>
+              <w:t>Critério de Aceite</w:t>
+            </w:r>
+          </w:p>
+        </w:tc>
+        <w:tc>
+          <w:tcPr>
+            <w:tcBorders>
+              <w:top w:val="single" w:color="000000" w:sz="0" w:space="0"/>
+              <w:left w:val="single" w:color="000000" w:sz="0" w:space="0"/>
+              <w:bottom w:val="single" w:color="000000" w:sz="0" w:space="0"/>
+              <w:right w:val="single" w:color="000000" w:sz="0" w:space="0"/>
+            </w:tcBorders>
+            <w:shd w:val="clear" w:color="auto" w:fill="B9D5F0" w:themeFill="text2" w:themeFillTint="32"/>
+            <w:vAlign w:val="top"/>
+          </w:tcPr>
+          <w:p>
+            <w:pPr>
+              <w:jc w:val="center"/>
+              <w:rPr>
+                <w:rFonts w:hint="default" w:ascii="Calibri" w:hAnsi="Calibri" w:cs="Calibri"/>
+                <w:b/>
+                <w:bCs/>
+                <w:sz w:val="18"/>
+                <w:szCs w:val="18"/>
+              </w:rPr>
+            </w:pPr>
+            <w:r>
+              <w:rPr>
+                <w:rFonts w:hint="default" w:ascii="Calibri" w:hAnsi="Calibri" w:cs="Calibri"/>
+                <w:b/>
+                <w:bCs/>
+                <w:sz w:val="18"/>
+                <w:szCs w:val="18"/>
+              </w:rPr>
+              <w:t>Rastreabilidade</w:t>
+            </w:r>
+          </w:p>
+        </w:tc>
+      </w:tr>
+      <w:tr>
+        <w:tblPrEx>
+          <w:tblBorders>
+            <w:top w:val="single" w:color="000000" w:sz="2" w:space="0"/>
+            <w:left w:val="single" w:color="000000" w:sz="2" w:space="0"/>
+            <w:bottom w:val="single" w:color="000000" w:sz="2" w:space="0"/>
+            <w:right w:val="single" w:color="000000" w:sz="2" w:space="0"/>
+            <w:insideH w:val="none" w:color="auto" w:sz="0" w:space="0"/>
+            <w:insideV w:val="none" w:color="auto" w:sz="0" w:space="0"/>
+          </w:tblBorders>
+          <w:tblCellMar>
+            <w:top w:w="80" w:type="dxa"/>
+            <w:left w:w="160" w:type="dxa"/>
+            <w:bottom w:w="80" w:type="dxa"/>
+            <w:right w:w="160" w:type="dxa"/>
+          </w:tblCellMar>
+        </w:tblPrEx>
+        <w:trPr>
+          <w:tblCellSpacing w:w="0" w:type="dxa"/>
+          <w:jc w:val="center"/>
+        </w:trPr>
+        <w:tc>
+          <w:tcPr>
+            <w:tcBorders>
+              <w:top w:val="single" w:color="000000" w:sz="0" w:space="0"/>
+              <w:left w:val="single" w:color="000000" w:sz="0" w:space="0"/>
+              <w:bottom w:val="single" w:color="000000" w:sz="0" w:space="0"/>
+              <w:right w:val="single" w:color="000000" w:sz="0" w:space="0"/>
+            </w:tcBorders>
+          </w:tcPr>
+          <w:p>
+            <w:pPr>
+              <w:rPr>
+                <w:rFonts w:hint="default" w:ascii="Calibri" w:hAnsi="Calibri" w:cs="Calibri"/>
+                <w:sz w:val="18"/>
+                <w:szCs w:val="18"/>
+              </w:rPr>
+            </w:pPr>
+            <w:r>
+              <w:rPr>
+                <w:rFonts w:hint="default" w:ascii="Calibri" w:hAnsi="Calibri" w:cs="Calibri"/>
+                <w:sz w:val="18"/>
+                <w:szCs w:val="18"/>
+              </w:rPr>
+              <w:t>REQ-08</w:t>
+            </w:r>
+          </w:p>
+        </w:tc>
+        <w:tc>
+          <w:tcPr>
+            <w:tcBorders>
+              <w:top w:val="single" w:color="000000" w:sz="0" w:space="0"/>
+              <w:left w:val="single" w:color="000000" w:sz="0" w:space="0"/>
+              <w:bottom w:val="single" w:color="000000" w:sz="0" w:space="0"/>
+              <w:right w:val="single" w:color="000000" w:sz="0" w:space="0"/>
+            </w:tcBorders>
+          </w:tcPr>
+          <w:p>
+            <w:pPr>
+              <w:rPr>
+                <w:rFonts w:hint="default" w:ascii="Calibri" w:hAnsi="Calibri" w:cs="Calibri"/>
+                <w:sz w:val="18"/>
+                <w:szCs w:val="18"/>
+              </w:rPr>
+            </w:pPr>
+            <w:r>
+              <w:rPr>
+                <w:rFonts w:hint="default" w:ascii="Calibri" w:hAnsi="Calibri" w:cs="Calibri"/>
+                <w:sz w:val="18"/>
+                <w:szCs w:val="18"/>
+              </w:rPr>
+              <w:t>Cobertura de testes automatizados</w:t>
+            </w:r>
+          </w:p>
+        </w:tc>
+        <w:tc>
+          <w:tcPr>
+            <w:tcBorders>
+              <w:top w:val="single" w:color="000000" w:sz="0" w:space="0"/>
+              <w:left w:val="single" w:color="000000" w:sz="0" w:space="0"/>
+              <w:bottom w:val="single" w:color="000000" w:sz="0" w:space="0"/>
+              <w:right w:val="single" w:color="000000" w:sz="0" w:space="0"/>
+            </w:tcBorders>
+          </w:tcPr>
+          <w:p>
+            <w:pPr>
+              <w:rPr>
+                <w:rFonts w:hint="default" w:ascii="Calibri" w:hAnsi="Calibri" w:cs="Calibri"/>
+                <w:sz w:val="18"/>
+                <w:szCs w:val="18"/>
+              </w:rPr>
+            </w:pPr>
+            <w:r>
+              <w:rPr>
+                <w:rFonts w:hint="default" w:ascii="Calibri" w:hAnsi="Calibri" w:cs="Calibri"/>
+                <w:sz w:val="18"/>
+                <w:szCs w:val="18"/>
+              </w:rPr>
+              <w:t>≥ 80% do código (unitários + integração via pytest + coverage.py)</w:t>
+            </w:r>
+          </w:p>
+        </w:tc>
+        <w:tc>
+          <w:tcPr>
+            <w:tcBorders>
+              <w:top w:val="single" w:color="000000" w:sz="0" w:space="0"/>
+              <w:left w:val="single" w:color="000000" w:sz="0" w:space="0"/>
+              <w:bottom w:val="single" w:color="000000" w:sz="0" w:space="0"/>
+              <w:right w:val="single" w:color="000000" w:sz="0" w:space="0"/>
+            </w:tcBorders>
+          </w:tcPr>
+          <w:p>
+            <w:pPr>
+              <w:rPr>
+                <w:rFonts w:hint="default" w:ascii="Calibri" w:hAnsi="Calibri" w:cs="Calibri"/>
+                <w:sz w:val="18"/>
+                <w:szCs w:val="18"/>
+              </w:rPr>
+            </w:pPr>
+            <w:r>
+              <w:rPr>
+                <w:rFonts w:hint="default" w:ascii="Calibri" w:hAnsi="Calibri" w:cs="Calibri"/>
+                <w:sz w:val="18"/>
+                <w:szCs w:val="18"/>
+              </w:rPr>
+              <w:t>TAP §3 (Qualidade) + N6.1</w:t>
+            </w:r>
+          </w:p>
+        </w:tc>
+      </w:tr>
+      <w:tr>
+        <w:tblPrEx>
+          <w:tblBorders>
+            <w:top w:val="single" w:color="000000" w:sz="2" w:space="0"/>
+            <w:left w:val="single" w:color="000000" w:sz="2" w:space="0"/>
+            <w:bottom w:val="single" w:color="000000" w:sz="2" w:space="0"/>
+            <w:right w:val="single" w:color="000000" w:sz="2" w:space="0"/>
+            <w:insideH w:val="none" w:color="auto" w:sz="0" w:space="0"/>
+            <w:insideV w:val="none" w:color="auto" w:sz="0" w:space="0"/>
+          </w:tblBorders>
+          <w:tblCellMar>
+            <w:top w:w="80" w:type="dxa"/>
+            <w:left w:w="160" w:type="dxa"/>
+            <w:bottom w:w="80" w:type="dxa"/>
+            <w:right w:w="160" w:type="dxa"/>
+          </w:tblCellMar>
+        </w:tblPrEx>
+        <w:trPr>
+          <w:tblCellSpacing w:w="0" w:type="dxa"/>
+          <w:jc w:val="center"/>
+        </w:trPr>
+        <w:tc>
+          <w:tcPr>
+            <w:tcBorders>
+              <w:top w:val="single" w:color="000000" w:sz="0" w:space="0"/>
+              <w:left w:val="single" w:color="000000" w:sz="0" w:space="0"/>
+              <w:bottom w:val="single" w:color="000000" w:sz="0" w:space="0"/>
+              <w:right w:val="single" w:color="000000" w:sz="0" w:space="0"/>
+            </w:tcBorders>
+          </w:tcPr>
+          <w:p>
+            <w:pPr>
+              <w:rPr>
+                <w:rFonts w:hint="default" w:ascii="Calibri" w:hAnsi="Calibri" w:cs="Calibri"/>
+                <w:sz w:val="18"/>
+                <w:szCs w:val="18"/>
+              </w:rPr>
+            </w:pPr>
+            <w:r>
+              <w:rPr>
+                <w:rFonts w:hint="default" w:ascii="Calibri" w:hAnsi="Calibri" w:cs="Calibri"/>
+                <w:sz w:val="18"/>
+                <w:szCs w:val="18"/>
+              </w:rPr>
+              <w:t>REQ-09</w:t>
+            </w:r>
+          </w:p>
+        </w:tc>
+        <w:tc>
+          <w:tcPr>
+            <w:tcBorders>
+              <w:top w:val="single" w:color="000000" w:sz="0" w:space="0"/>
+              <w:left w:val="single" w:color="000000" w:sz="0" w:space="0"/>
+              <w:bottom w:val="single" w:color="000000" w:sz="0" w:space="0"/>
+              <w:right w:val="single" w:color="000000" w:sz="0" w:space="0"/>
+            </w:tcBorders>
+          </w:tcPr>
+          <w:p>
+            <w:pPr>
+              <w:rPr>
+                <w:rFonts w:hint="default" w:ascii="Calibri" w:hAnsi="Calibri" w:cs="Calibri"/>
+                <w:sz w:val="18"/>
+                <w:szCs w:val="18"/>
+              </w:rPr>
+            </w:pPr>
+            <w:r>
+              <w:rPr>
+                <w:rFonts w:hint="default" w:ascii="Calibri" w:hAnsi="Calibri" w:cs="Calibri"/>
+                <w:sz w:val="18"/>
+                <w:szCs w:val="18"/>
+              </w:rPr>
+              <w:t>Testes de aceitação (UAT)</w:t>
+            </w:r>
+          </w:p>
+        </w:tc>
+        <w:tc>
+          <w:tcPr>
+            <w:tcBorders>
+              <w:top w:val="single" w:color="000000" w:sz="0" w:space="0"/>
+              <w:left w:val="single" w:color="000000" w:sz="0" w:space="0"/>
+              <w:bottom w:val="single" w:color="000000" w:sz="0" w:space="0"/>
+              <w:right w:val="single" w:color="000000" w:sz="0" w:space="0"/>
+            </w:tcBorders>
+          </w:tcPr>
+          <w:p>
+            <w:pPr>
+              <w:rPr>
+                <w:rFonts w:hint="default" w:ascii="Calibri" w:hAnsi="Calibri" w:cs="Calibri"/>
+                <w:sz w:val="18"/>
+                <w:szCs w:val="18"/>
+              </w:rPr>
+            </w:pPr>
+            <w:r>
+              <w:rPr>
+                <w:rFonts w:hint="default" w:ascii="Calibri" w:hAnsi="Calibri" w:cs="Calibri"/>
+                <w:sz w:val="18"/>
+                <w:szCs w:val="18"/>
+              </w:rPr>
+              <w:t>100% dos fluxos críticos passing, zero defeitos críticos/bloqueantes</w:t>
+            </w:r>
+          </w:p>
+        </w:tc>
+        <w:tc>
+          <w:tcPr>
+            <w:tcBorders>
+              <w:top w:val="single" w:color="000000" w:sz="0" w:space="0"/>
+              <w:left w:val="single" w:color="000000" w:sz="0" w:space="0"/>
+              <w:bottom w:val="single" w:color="000000" w:sz="0" w:space="0"/>
+              <w:right w:val="single" w:color="000000" w:sz="0" w:space="0"/>
+            </w:tcBorders>
+          </w:tcPr>
+          <w:p>
+            <w:pPr>
+              <w:rPr>
+                <w:rFonts w:hint="default" w:ascii="Calibri" w:hAnsi="Calibri" w:cs="Calibri"/>
+                <w:sz w:val="18"/>
+                <w:szCs w:val="18"/>
+              </w:rPr>
+            </w:pPr>
+            <w:r>
+              <w:rPr>
+                <w:rFonts w:hint="default" w:ascii="Calibri" w:hAnsi="Calibri" w:cs="Calibri"/>
+                <w:sz w:val="18"/>
+                <w:szCs w:val="18"/>
+              </w:rPr>
+              <w:t>TAP §3 (Qualidade) + N6.2</w:t>
+            </w:r>
+          </w:p>
+        </w:tc>
+      </w:tr>
+      <w:tr>
+        <w:tblPrEx>
+          <w:tblBorders>
+            <w:top w:val="single" w:color="000000" w:sz="2" w:space="0"/>
+            <w:left w:val="single" w:color="000000" w:sz="2" w:space="0"/>
+            <w:bottom w:val="single" w:color="000000" w:sz="2" w:space="0"/>
+            <w:right w:val="single" w:color="000000" w:sz="2" w:space="0"/>
+            <w:insideH w:val="none" w:color="auto" w:sz="0" w:space="0"/>
+            <w:insideV w:val="none" w:color="auto" w:sz="0" w:space="0"/>
+          </w:tblBorders>
+        </w:tblPrEx>
+        <w:trPr>
+          <w:tblCellSpacing w:w="0" w:type="dxa"/>
+          <w:jc w:val="center"/>
+        </w:trPr>
+        <w:tc>
+          <w:tcPr>
+            <w:tcBorders>
+              <w:top w:val="single" w:color="000000" w:sz="0" w:space="0"/>
+              <w:left w:val="single" w:color="000000" w:sz="0" w:space="0"/>
+              <w:bottom w:val="single" w:color="000000" w:sz="0" w:space="0"/>
+              <w:right w:val="single" w:color="000000" w:sz="0" w:space="0"/>
+            </w:tcBorders>
+          </w:tcPr>
+          <w:p>
+            <w:pPr>
+              <w:rPr>
+                <w:rFonts w:hint="default" w:ascii="Calibri" w:hAnsi="Calibri" w:cs="Calibri"/>
+                <w:sz w:val="18"/>
+                <w:szCs w:val="18"/>
+              </w:rPr>
+            </w:pPr>
+            <w:r>
+              <w:rPr>
+                <w:rFonts w:hint="default" w:ascii="Calibri" w:hAnsi="Calibri" w:cs="Calibri"/>
+                <w:sz w:val="18"/>
+                <w:szCs w:val="18"/>
+              </w:rPr>
+              <w:t>REQ-10</w:t>
+            </w:r>
+          </w:p>
+        </w:tc>
+        <w:tc>
+          <w:tcPr>
+            <w:tcBorders>
+              <w:top w:val="single" w:color="000000" w:sz="0" w:space="0"/>
+              <w:left w:val="single" w:color="000000" w:sz="0" w:space="0"/>
+              <w:bottom w:val="single" w:color="000000" w:sz="0" w:space="0"/>
+              <w:right w:val="single" w:color="000000" w:sz="0" w:space="0"/>
+            </w:tcBorders>
+          </w:tcPr>
+          <w:p>
+            <w:pPr>
+              <w:rPr>
+                <w:rFonts w:hint="default" w:ascii="Calibri" w:hAnsi="Calibri" w:cs="Calibri"/>
+                <w:sz w:val="18"/>
+                <w:szCs w:val="18"/>
+              </w:rPr>
+            </w:pPr>
+            <w:r>
+              <w:rPr>
+                <w:rFonts w:hint="default" w:ascii="Calibri" w:hAnsi="Calibri" w:cs="Calibri"/>
+                <w:sz w:val="18"/>
+                <w:szCs w:val="18"/>
+              </w:rPr>
+              <w:t>Aplicação de ferramentas da qualidade (PDCA + Ishikawa 6M)</w:t>
+            </w:r>
+          </w:p>
+        </w:tc>
+        <w:tc>
+          <w:tcPr>
+            <w:tcBorders>
+              <w:top w:val="single" w:color="000000" w:sz="0" w:space="0"/>
+              <w:left w:val="single" w:color="000000" w:sz="0" w:space="0"/>
+              <w:bottom w:val="single" w:color="000000" w:sz="0" w:space="0"/>
+              <w:right w:val="single" w:color="000000" w:sz="0" w:space="0"/>
+            </w:tcBorders>
+          </w:tcPr>
+          <w:p>
+            <w:pPr>
+              <w:rPr>
+                <w:rFonts w:hint="default" w:ascii="Calibri" w:hAnsi="Calibri" w:cs="Calibri"/>
+                <w:sz w:val="18"/>
+                <w:szCs w:val="18"/>
+              </w:rPr>
+            </w:pPr>
+            <w:r>
+              <w:rPr>
+                <w:rFonts w:hint="default" w:ascii="Calibri" w:hAnsi="Calibri" w:cs="Calibri"/>
+                <w:sz w:val="18"/>
+                <w:szCs w:val="18"/>
+              </w:rPr>
+              <w:t>12 PDCAs consolidados + diagrama de causa e efeito documentado no Plano de Qualidade</w:t>
+            </w:r>
+          </w:p>
+        </w:tc>
+        <w:tc>
+          <w:tcPr>
+            <w:tcBorders>
+              <w:top w:val="single" w:color="000000" w:sz="0" w:space="0"/>
+              <w:left w:val="single" w:color="000000" w:sz="0" w:space="0"/>
+              <w:bottom w:val="single" w:color="000000" w:sz="0" w:space="0"/>
+              <w:right w:val="single" w:color="000000" w:sz="0" w:space="0"/>
+            </w:tcBorders>
+          </w:tcPr>
+          <w:p>
+            <w:pPr>
+              <w:rPr>
+                <w:rFonts w:hint="default" w:ascii="Calibri" w:hAnsi="Calibri" w:cs="Calibri"/>
+                <w:sz w:val="18"/>
+                <w:szCs w:val="18"/>
+              </w:rPr>
+            </w:pPr>
+            <w:r>
+              <w:rPr>
+                <w:rFonts w:hint="default" w:ascii="Calibri" w:hAnsi="Calibri" w:cs="Calibri"/>
+                <w:sz w:val="18"/>
+                <w:szCs w:val="18"/>
+              </w:rPr>
+              <w:t>TAP §3 (Qualidade) + N6.3</w:t>
+            </w:r>
+          </w:p>
+        </w:tc>
+      </w:tr>
+    </w:tbl>
+    <w:p>
+      <w:pPr>
+        <w:rPr>
+          <w:rFonts w:hint="default" w:ascii="Calibri" w:hAnsi="Calibri" w:cs="Calibri"/>
+        </w:rPr>
+      </w:pPr>
+    </w:p>
+    <w:p>
+      <w:pPr>
+        <w:pStyle w:val="3"/>
+        <w:bidi w:val="0"/>
+        <w:rPr>
+          <w:rFonts w:hint="default"/>
+        </w:rPr>
+      </w:pPr>
+      <w:r>
+        <w:rPr>
+          <w:rFonts w:hint="default"/>
+        </w:rPr>
+        <w:t>Entrega Principal 3 — DevOps e CI/CD (Fase N7)</w:t>
+      </w:r>
+    </w:p>
+    <w:tbl>
+      <w:tblPr>
+        <w:tblStyle w:val="12"/>
+        <w:tblW w:w="4998" w:type="pct"/>
+        <w:jc w:val="center"/>
+        <w:tblCellSpacing w:w="0" w:type="dxa"/>
+        <w:tblBorders>
+          <w:top w:val="single" w:color="000000" w:sz="2" w:space="0"/>
+          <w:left w:val="single" w:color="000000" w:sz="2" w:space="0"/>
+          <w:bottom w:val="single" w:color="000000" w:sz="2" w:space="0"/>
+          <w:right w:val="single" w:color="000000" w:sz="2" w:space="0"/>
+          <w:insideH w:val="none" w:color="auto" w:sz="0" w:space="0"/>
+          <w:insideV w:val="none" w:color="auto" w:sz="0" w:space="0"/>
+        </w:tblBorders>
+        <w:tblLayout w:type="autofit"/>
+        <w:tblCellMar>
+          <w:top w:w="80" w:type="dxa"/>
+          <w:left w:w="160" w:type="dxa"/>
+          <w:bottom w:w="80" w:type="dxa"/>
+          <w:right w:w="160" w:type="dxa"/>
+        </w:tblCellMar>
+      </w:tblPr>
+      <w:tblGrid>
+        <w:gridCol w:w="966"/>
+        <w:gridCol w:w="2007"/>
+        <w:gridCol w:w="3792"/>
+        <w:gridCol w:w="2065"/>
+      </w:tblGrid>
+      <w:tr>
+        <w:tblPrEx>
+          <w:tblBorders>
+            <w:top w:val="single" w:color="000000" w:sz="2" w:space="0"/>
+            <w:left w:val="single" w:color="000000" w:sz="2" w:space="0"/>
+            <w:bottom w:val="single" w:color="000000" w:sz="2" w:space="0"/>
+            <w:right w:val="single" w:color="000000" w:sz="2" w:space="0"/>
+            <w:insideH w:val="none" w:color="auto" w:sz="0" w:space="0"/>
+            <w:insideV w:val="none" w:color="auto" w:sz="0" w:space="0"/>
+          </w:tblBorders>
+          <w:tblCellMar>
+            <w:top w:w="80" w:type="dxa"/>
+            <w:left w:w="160" w:type="dxa"/>
+            <w:bottom w:w="80" w:type="dxa"/>
+            <w:right w:w="160" w:type="dxa"/>
+          </w:tblCellMar>
+        </w:tblPrEx>
+        <w:trPr>
+          <w:tblCellSpacing w:w="0" w:type="dxa"/>
+          <w:jc w:val="center"/>
+        </w:trPr>
+        <w:tc>
+          <w:tcPr>
+            <w:tcW w:w="547" w:type="pct"/>
+            <w:tcBorders>
+              <w:top w:val="single" w:color="000000" w:sz="0" w:space="0"/>
+              <w:left w:val="single" w:color="000000" w:sz="0" w:space="0"/>
+              <w:bottom w:val="single" w:color="000000" w:sz="0" w:space="0"/>
+              <w:right w:val="single" w:color="000000" w:sz="0" w:space="0"/>
+            </w:tcBorders>
+            <w:shd w:val="clear" w:color="auto" w:fill="B9D5F0" w:themeFill="text2" w:themeFillTint="32"/>
+            <w:vAlign w:val="top"/>
+          </w:tcPr>
+          <w:p>
+            <w:pPr>
+              <w:rPr>
+                <w:rFonts w:hint="default" w:ascii="Calibri" w:hAnsi="Calibri" w:cs="Calibri"/>
+                <w:b/>
+                <w:bCs/>
+                <w:sz w:val="18"/>
+                <w:szCs w:val="18"/>
+              </w:rPr>
+            </w:pPr>
+            <w:r>
+              <w:rPr>
+                <w:rFonts w:hint="default" w:ascii="Calibri" w:hAnsi="Calibri" w:cs="Calibri"/>
+                <w:b/>
+                <w:bCs/>
+                <w:sz w:val="18"/>
+                <w:szCs w:val="18"/>
+              </w:rPr>
+              <w:t>ID</w:t>
+            </w:r>
+          </w:p>
+        </w:tc>
+        <w:tc>
+          <w:tcPr>
+            <w:tcW w:w="1136" w:type="pct"/>
+            <w:tcBorders>
+              <w:top w:val="single" w:color="000000" w:sz="0" w:space="0"/>
+              <w:left w:val="single" w:color="000000" w:sz="0" w:space="0"/>
+              <w:bottom w:val="single" w:color="000000" w:sz="0" w:space="0"/>
+              <w:right w:val="single" w:color="000000" w:sz="0" w:space="0"/>
+            </w:tcBorders>
+            <w:shd w:val="clear" w:color="auto" w:fill="B9D5F0" w:themeFill="text2" w:themeFillTint="32"/>
+            <w:vAlign w:val="top"/>
+          </w:tcPr>
+          <w:p>
+            <w:pPr>
+              <w:rPr>
+                <w:rFonts w:hint="default" w:ascii="Calibri" w:hAnsi="Calibri" w:cs="Calibri"/>
+                <w:b/>
+                <w:bCs/>
+                <w:sz w:val="18"/>
+                <w:szCs w:val="18"/>
+              </w:rPr>
+            </w:pPr>
+            <w:r>
+              <w:rPr>
+                <w:rFonts w:hint="default" w:ascii="Calibri" w:hAnsi="Calibri" w:cs="Calibri"/>
+                <w:b/>
+                <w:bCs/>
+                <w:sz w:val="18"/>
+                <w:szCs w:val="18"/>
+              </w:rPr>
+              <w:t>Requisito</w:t>
+            </w:r>
+          </w:p>
+        </w:tc>
+        <w:tc>
+          <w:tcPr>
+            <w:tcW w:w="2146" w:type="pct"/>
+            <w:tcBorders>
+              <w:top w:val="single" w:color="000000" w:sz="0" w:space="0"/>
+              <w:left w:val="single" w:color="000000" w:sz="0" w:space="0"/>
+              <w:bottom w:val="single" w:color="000000" w:sz="0" w:space="0"/>
+              <w:right w:val="single" w:color="000000" w:sz="0" w:space="0"/>
+            </w:tcBorders>
+            <w:shd w:val="clear" w:color="auto" w:fill="B9D5F0" w:themeFill="text2" w:themeFillTint="32"/>
+            <w:vAlign w:val="top"/>
+          </w:tcPr>
+          <w:p>
+            <w:pPr>
+              <w:rPr>
+                <w:rFonts w:hint="default" w:ascii="Calibri" w:hAnsi="Calibri" w:cs="Calibri"/>
+                <w:b/>
+                <w:bCs/>
+                <w:sz w:val="18"/>
+                <w:szCs w:val="18"/>
+              </w:rPr>
+            </w:pPr>
+            <w:r>
+              <w:rPr>
+                <w:rFonts w:hint="default" w:ascii="Calibri" w:hAnsi="Calibri" w:cs="Calibri"/>
+                <w:b/>
+                <w:bCs/>
+                <w:sz w:val="18"/>
+                <w:szCs w:val="18"/>
+              </w:rPr>
+              <w:t>Critério de Aceite</w:t>
+            </w:r>
+          </w:p>
+        </w:tc>
+        <w:tc>
+          <w:tcPr>
+            <w:tcW w:w="1169" w:type="pct"/>
+            <w:tcBorders>
+              <w:top w:val="single" w:color="000000" w:sz="0" w:space="0"/>
+              <w:left w:val="single" w:color="000000" w:sz="0" w:space="0"/>
+              <w:bottom w:val="single" w:color="000000" w:sz="0" w:space="0"/>
+              <w:right w:val="single" w:color="000000" w:sz="0" w:space="0"/>
+            </w:tcBorders>
+            <w:shd w:val="clear" w:color="auto" w:fill="B9D5F0" w:themeFill="text2" w:themeFillTint="32"/>
+            <w:vAlign w:val="top"/>
+          </w:tcPr>
+          <w:p>
+            <w:pPr>
+              <w:rPr>
+                <w:rFonts w:hint="default" w:ascii="Calibri" w:hAnsi="Calibri" w:cs="Calibri"/>
+                <w:b/>
+                <w:bCs/>
+                <w:sz w:val="18"/>
+                <w:szCs w:val="18"/>
+              </w:rPr>
+            </w:pPr>
+            <w:r>
+              <w:rPr>
+                <w:rFonts w:hint="default" w:ascii="Calibri" w:hAnsi="Calibri" w:cs="Calibri"/>
+                <w:b/>
+                <w:bCs/>
+                <w:sz w:val="18"/>
+                <w:szCs w:val="18"/>
+              </w:rPr>
+              <w:t>Rastreabilidade</w:t>
+            </w:r>
+          </w:p>
+        </w:tc>
+      </w:tr>
+      <w:tr>
+        <w:tblPrEx>
+          <w:tblBorders>
+            <w:top w:val="single" w:color="000000" w:sz="2" w:space="0"/>
+            <w:left w:val="single" w:color="000000" w:sz="2" w:space="0"/>
+            <w:bottom w:val="single" w:color="000000" w:sz="2" w:space="0"/>
+            <w:right w:val="single" w:color="000000" w:sz="2" w:space="0"/>
+            <w:insideH w:val="none" w:color="auto" w:sz="0" w:space="0"/>
+            <w:insideV w:val="none" w:color="auto" w:sz="0" w:space="0"/>
+          </w:tblBorders>
+          <w:tblCellMar>
+            <w:top w:w="80" w:type="dxa"/>
+            <w:left w:w="160" w:type="dxa"/>
+            <w:bottom w:w="80" w:type="dxa"/>
+            <w:right w:w="160" w:type="dxa"/>
+          </w:tblCellMar>
+        </w:tblPrEx>
+        <w:trPr>
+          <w:tblCellSpacing w:w="0" w:type="dxa"/>
+          <w:jc w:val="center"/>
+        </w:trPr>
+        <w:tc>
+          <w:tcPr>
+            <w:tcW w:w="547" w:type="pct"/>
+            <w:tcBorders>
+              <w:top w:val="single" w:color="000000" w:sz="0" w:space="0"/>
+              <w:left w:val="single" w:color="000000" w:sz="0" w:space="0"/>
+              <w:bottom w:val="single" w:color="000000" w:sz="0" w:space="0"/>
+              <w:right w:val="single" w:color="000000" w:sz="0" w:space="0"/>
+            </w:tcBorders>
+          </w:tcPr>
+          <w:p>
+            <w:pPr>
+              <w:rPr>
+                <w:rFonts w:hint="default" w:ascii="Calibri" w:hAnsi="Calibri" w:cs="Calibri"/>
+                <w:sz w:val="18"/>
+                <w:szCs w:val="18"/>
+              </w:rPr>
+            </w:pPr>
+            <w:r>
+              <w:rPr>
+                <w:rFonts w:hint="default" w:ascii="Calibri" w:hAnsi="Calibri" w:cs="Calibri"/>
+                <w:sz w:val="18"/>
+                <w:szCs w:val="18"/>
+              </w:rPr>
+              <w:t>REQ-11</w:t>
+            </w:r>
+          </w:p>
+        </w:tc>
+        <w:tc>
+          <w:tcPr>
+            <w:tcW w:w="1136" w:type="pct"/>
+            <w:tcBorders>
+              <w:top w:val="single" w:color="000000" w:sz="0" w:space="0"/>
+              <w:left w:val="single" w:color="000000" w:sz="0" w:space="0"/>
+              <w:bottom w:val="single" w:color="000000" w:sz="0" w:space="0"/>
+              <w:right w:val="single" w:color="000000" w:sz="0" w:space="0"/>
+            </w:tcBorders>
+          </w:tcPr>
+          <w:p>
+            <w:pPr>
+              <w:rPr>
+                <w:rFonts w:hint="default" w:ascii="Calibri" w:hAnsi="Calibri" w:cs="Calibri"/>
+                <w:sz w:val="18"/>
+                <w:szCs w:val="18"/>
+              </w:rPr>
+            </w:pPr>
+            <w:r>
+              <w:rPr>
+                <w:rFonts w:hint="default" w:ascii="Calibri" w:hAnsi="Calibri" w:cs="Calibri"/>
+                <w:sz w:val="18"/>
+                <w:szCs w:val="18"/>
+              </w:rPr>
+              <w:t>Pipeline CI funcional</w:t>
+            </w:r>
+          </w:p>
+        </w:tc>
+        <w:tc>
+          <w:tcPr>
+            <w:tcW w:w="2146" w:type="pct"/>
+            <w:tcBorders>
+              <w:top w:val="single" w:color="000000" w:sz="0" w:space="0"/>
+              <w:left w:val="single" w:color="000000" w:sz="0" w:space="0"/>
+              <w:bottom w:val="single" w:color="000000" w:sz="0" w:space="0"/>
+              <w:right w:val="single" w:color="000000" w:sz="0" w:space="0"/>
+            </w:tcBorders>
+          </w:tcPr>
+          <w:p>
+            <w:pPr>
+              <w:rPr>
+                <w:rFonts w:hint="default" w:ascii="Calibri" w:hAnsi="Calibri" w:cs="Calibri"/>
+                <w:sz w:val="18"/>
+                <w:szCs w:val="18"/>
+              </w:rPr>
+            </w:pPr>
+            <w:r>
+              <w:rPr>
+                <w:rFonts w:hint="default" w:ascii="Calibri" w:hAnsi="Calibri" w:cs="Calibri"/>
+                <w:sz w:val="18"/>
+                <w:szCs w:val="18"/>
+              </w:rPr>
+              <w:t>Lint + testes rodando em ≤ 5 min por push</w:t>
+            </w:r>
+          </w:p>
+        </w:tc>
+        <w:tc>
+          <w:tcPr>
+            <w:tcW w:w="1169" w:type="pct"/>
+            <w:tcBorders>
+              <w:top w:val="single" w:color="000000" w:sz="0" w:space="0"/>
+              <w:left w:val="single" w:color="000000" w:sz="0" w:space="0"/>
+              <w:bottom w:val="single" w:color="000000" w:sz="0" w:space="0"/>
+              <w:right w:val="single" w:color="000000" w:sz="0" w:space="0"/>
+            </w:tcBorders>
+          </w:tcPr>
+          <w:p>
+            <w:pPr>
+              <w:rPr>
+                <w:rFonts w:hint="default" w:ascii="Calibri" w:hAnsi="Calibri" w:cs="Calibri"/>
+                <w:sz w:val="18"/>
+                <w:szCs w:val="18"/>
+              </w:rPr>
+            </w:pPr>
+            <w:r>
+              <w:rPr>
+                <w:rFonts w:hint="default" w:ascii="Calibri" w:hAnsi="Calibri" w:cs="Calibri"/>
+                <w:sz w:val="18"/>
+                <w:szCs w:val="18"/>
+              </w:rPr>
+              <w:t>OKB v3.1 §4.1 + N7.1</w:t>
+            </w:r>
+          </w:p>
+        </w:tc>
+      </w:tr>
+    </w:tbl>
+    <w:p>
+      <w:pPr>
+        <w:rPr>
+          <w:rFonts w:hint="default" w:ascii="Calibri" w:hAnsi="Calibri" w:cs="Calibri"/>
+        </w:rPr>
+      </w:pPr>
+    </w:p>
+    <w:p>
+      <w:pPr>
+        <w:pStyle w:val="3"/>
+        <w:bidi w:val="0"/>
+        <w:rPr>
+          <w:rFonts w:hint="default"/>
+        </w:rPr>
+      </w:pPr>
+      <w:r>
+        <w:rPr>
+          <w:rFonts w:hint="default"/>
+        </w:rPr>
+        <w:t>Entrega Principal 4 — Base de Conhecimento (Fase N9)</w:t>
+      </w:r>
+    </w:p>
+    <w:tbl>
+      <w:tblPr>
+        <w:tblStyle w:val="12"/>
+        <w:tblW w:w="4998" w:type="pct"/>
+        <w:jc w:val="center"/>
+        <w:tblCellSpacing w:w="0" w:type="dxa"/>
+        <w:tblBorders>
+          <w:top w:val="single" w:color="000000" w:sz="2" w:space="0"/>
+          <w:left w:val="single" w:color="000000" w:sz="2" w:space="0"/>
+          <w:bottom w:val="single" w:color="000000" w:sz="2" w:space="0"/>
+          <w:right w:val="single" w:color="000000" w:sz="2" w:space="0"/>
+          <w:insideH w:val="none" w:color="auto" w:sz="0" w:space="0"/>
+          <w:insideV w:val="none" w:color="auto" w:sz="0" w:space="0"/>
+        </w:tblBorders>
+        <w:tblLayout w:type="autofit"/>
+        <w:tblCellMar>
+          <w:top w:w="80" w:type="dxa"/>
+          <w:left w:w="160" w:type="dxa"/>
+          <w:bottom w:w="80" w:type="dxa"/>
+          <w:right w:w="160" w:type="dxa"/>
+        </w:tblCellMar>
+      </w:tblPr>
+      <w:tblGrid>
+        <w:gridCol w:w="890"/>
+        <w:gridCol w:w="2777"/>
+        <w:gridCol w:w="3113"/>
+        <w:gridCol w:w="2050"/>
+      </w:tblGrid>
+      <w:tr>
+        <w:tblPrEx>
+          <w:tblBorders>
+            <w:top w:val="single" w:color="000000" w:sz="2" w:space="0"/>
+            <w:left w:val="single" w:color="000000" w:sz="2" w:space="0"/>
+            <w:bottom w:val="single" w:color="000000" w:sz="2" w:space="0"/>
+            <w:right w:val="single" w:color="000000" w:sz="2" w:space="0"/>
+            <w:insideH w:val="none" w:color="auto" w:sz="0" w:space="0"/>
+            <w:insideV w:val="none" w:color="auto" w:sz="0" w:space="0"/>
+          </w:tblBorders>
+          <w:tblCellMar>
+            <w:top w:w="80" w:type="dxa"/>
+            <w:left w:w="160" w:type="dxa"/>
+            <w:bottom w:w="80" w:type="dxa"/>
+            <w:right w:w="160" w:type="dxa"/>
+          </w:tblCellMar>
+        </w:tblPrEx>
+        <w:trPr>
+          <w:tblCellSpacing w:w="0" w:type="dxa"/>
+          <w:jc w:val="center"/>
+        </w:trPr>
+        <w:tc>
+          <w:tcPr>
+            <w:tcW w:w="504" w:type="pct"/>
+            <w:tcBorders>
+              <w:top w:val="single" w:color="000000" w:sz="0" w:space="0"/>
+              <w:left w:val="single" w:color="000000" w:sz="0" w:space="0"/>
+              <w:bottom w:val="single" w:color="000000" w:sz="0" w:space="0"/>
+              <w:right w:val="single" w:color="000000" w:sz="0" w:space="0"/>
+            </w:tcBorders>
+            <w:shd w:val="clear" w:color="auto" w:fill="B9D5F0" w:themeFill="text2" w:themeFillTint="32"/>
+          </w:tcPr>
+          <w:p>
+            <w:pPr>
+              <w:jc w:val="center"/>
+              <w:rPr>
+                <w:rFonts w:hint="default" w:ascii="Calibri" w:hAnsi="Calibri" w:cs="Calibri"/>
+                <w:b/>
+                <w:bCs/>
+                <w:sz w:val="18"/>
+                <w:szCs w:val="18"/>
+              </w:rPr>
+            </w:pPr>
+            <w:r>
+              <w:rPr>
+                <w:rFonts w:hint="default" w:ascii="Calibri" w:hAnsi="Calibri" w:cs="Calibri"/>
+                <w:b/>
+                <w:bCs/>
+                <w:sz w:val="18"/>
+                <w:szCs w:val="18"/>
+              </w:rPr>
+              <w:t>ID</w:t>
+            </w:r>
+          </w:p>
+        </w:tc>
+        <w:tc>
+          <w:tcPr>
+            <w:tcW w:w="1572" w:type="pct"/>
+            <w:tcBorders>
+              <w:top w:val="single" w:color="000000" w:sz="0" w:space="0"/>
+              <w:left w:val="single" w:color="000000" w:sz="0" w:space="0"/>
+              <w:bottom w:val="single" w:color="000000" w:sz="0" w:space="0"/>
+              <w:right w:val="single" w:color="000000" w:sz="0" w:space="0"/>
+            </w:tcBorders>
+            <w:shd w:val="clear" w:color="auto" w:fill="B9D5F0" w:themeFill="text2" w:themeFillTint="32"/>
+          </w:tcPr>
+          <w:p>
+            <w:pPr>
+              <w:jc w:val="center"/>
+              <w:rPr>
+                <w:rFonts w:hint="default" w:ascii="Calibri" w:hAnsi="Calibri" w:cs="Calibri"/>
+                <w:b/>
+                <w:bCs/>
+                <w:sz w:val="18"/>
+                <w:szCs w:val="18"/>
+              </w:rPr>
+            </w:pPr>
+            <w:r>
+              <w:rPr>
+                <w:rFonts w:hint="default" w:ascii="Calibri" w:hAnsi="Calibri" w:cs="Calibri"/>
+                <w:b/>
+                <w:bCs/>
+                <w:sz w:val="18"/>
+                <w:szCs w:val="18"/>
+              </w:rPr>
+              <w:t>Requisito</w:t>
+            </w:r>
+          </w:p>
+        </w:tc>
+        <w:tc>
+          <w:tcPr>
+            <w:tcW w:w="1762" w:type="pct"/>
+            <w:tcBorders>
+              <w:top w:val="single" w:color="000000" w:sz="0" w:space="0"/>
+              <w:left w:val="single" w:color="000000" w:sz="0" w:space="0"/>
+              <w:bottom w:val="single" w:color="000000" w:sz="0" w:space="0"/>
+              <w:right w:val="single" w:color="000000" w:sz="0" w:space="0"/>
+            </w:tcBorders>
+            <w:shd w:val="clear" w:color="auto" w:fill="B9D5F0" w:themeFill="text2" w:themeFillTint="32"/>
+          </w:tcPr>
+          <w:p>
+            <w:pPr>
+              <w:jc w:val="center"/>
+              <w:rPr>
+                <w:rFonts w:hint="default" w:ascii="Calibri" w:hAnsi="Calibri" w:cs="Calibri"/>
+                <w:b/>
+                <w:bCs/>
+                <w:sz w:val="18"/>
+                <w:szCs w:val="18"/>
+              </w:rPr>
+            </w:pPr>
+            <w:r>
+              <w:rPr>
+                <w:rFonts w:hint="default" w:ascii="Calibri" w:hAnsi="Calibri" w:cs="Calibri"/>
+                <w:b/>
+                <w:bCs/>
+                <w:sz w:val="18"/>
+                <w:szCs w:val="18"/>
+              </w:rPr>
+              <w:t>Critério de Aceite</w:t>
+            </w:r>
+          </w:p>
+        </w:tc>
+        <w:tc>
+          <w:tcPr>
+            <w:tcW w:w="1160" w:type="pct"/>
+            <w:tcBorders>
+              <w:top w:val="single" w:color="000000" w:sz="0" w:space="0"/>
+              <w:left w:val="single" w:color="000000" w:sz="0" w:space="0"/>
+              <w:bottom w:val="single" w:color="000000" w:sz="0" w:space="0"/>
+              <w:right w:val="single" w:color="000000" w:sz="0" w:space="0"/>
+            </w:tcBorders>
+            <w:shd w:val="clear" w:color="auto" w:fill="B9D5F0" w:themeFill="text2" w:themeFillTint="32"/>
+          </w:tcPr>
+          <w:p>
+            <w:pPr>
+              <w:jc w:val="center"/>
+              <w:rPr>
+                <w:rFonts w:hint="default" w:ascii="Calibri" w:hAnsi="Calibri" w:cs="Calibri"/>
+                <w:b/>
+                <w:bCs/>
+                <w:sz w:val="18"/>
+                <w:szCs w:val="18"/>
+              </w:rPr>
+            </w:pPr>
+            <w:r>
+              <w:rPr>
+                <w:rFonts w:hint="default" w:ascii="Calibri" w:hAnsi="Calibri" w:cs="Calibri"/>
+                <w:b/>
+                <w:bCs/>
+                <w:sz w:val="18"/>
+                <w:szCs w:val="18"/>
+              </w:rPr>
+              <w:t>Rastreabilidade</w:t>
+            </w:r>
+          </w:p>
+        </w:tc>
+      </w:tr>
+      <w:tr>
+        <w:tblPrEx>
+          <w:tblBorders>
+            <w:top w:val="single" w:color="000000" w:sz="2" w:space="0"/>
+            <w:left w:val="single" w:color="000000" w:sz="2" w:space="0"/>
+            <w:bottom w:val="single" w:color="000000" w:sz="2" w:space="0"/>
+            <w:right w:val="single" w:color="000000" w:sz="2" w:space="0"/>
+            <w:insideH w:val="none" w:color="auto" w:sz="0" w:space="0"/>
+            <w:insideV w:val="none" w:color="auto" w:sz="0" w:space="0"/>
+          </w:tblBorders>
+          <w:tblCellMar>
+            <w:top w:w="80" w:type="dxa"/>
+            <w:left w:w="160" w:type="dxa"/>
+            <w:bottom w:w="80" w:type="dxa"/>
+            <w:right w:w="160" w:type="dxa"/>
+          </w:tblCellMar>
+        </w:tblPrEx>
+        <w:trPr>
+          <w:tblCellSpacing w:w="0" w:type="dxa"/>
+          <w:jc w:val="center"/>
+        </w:trPr>
+        <w:tc>
+          <w:tcPr>
+            <w:tcW w:w="504" w:type="pct"/>
+            <w:tcBorders>
+              <w:top w:val="single" w:color="000000" w:sz="0" w:space="0"/>
+              <w:left w:val="single" w:color="000000" w:sz="0" w:space="0"/>
+              <w:bottom w:val="single" w:color="000000" w:sz="0" w:space="0"/>
+              <w:right w:val="single" w:color="000000" w:sz="0" w:space="0"/>
+            </w:tcBorders>
+          </w:tcPr>
+          <w:p>
+            <w:pPr>
+              <w:rPr>
+                <w:rFonts w:hint="default" w:ascii="Calibri" w:hAnsi="Calibri" w:cs="Calibri"/>
+                <w:sz w:val="18"/>
+                <w:szCs w:val="18"/>
+              </w:rPr>
+            </w:pPr>
+            <w:r>
+              <w:rPr>
+                <w:rFonts w:hint="default" w:ascii="Calibri" w:hAnsi="Calibri" w:cs="Calibri"/>
+                <w:sz w:val="18"/>
+                <w:szCs w:val="18"/>
+              </w:rPr>
+              <w:t>REQ-12</w:t>
+            </w:r>
+          </w:p>
+        </w:tc>
+        <w:tc>
+          <w:tcPr>
+            <w:tcW w:w="1572" w:type="pct"/>
+            <w:tcBorders>
+              <w:top w:val="single" w:color="000000" w:sz="0" w:space="0"/>
+              <w:left w:val="single" w:color="000000" w:sz="0" w:space="0"/>
+              <w:bottom w:val="single" w:color="000000" w:sz="0" w:space="0"/>
+              <w:right w:val="single" w:color="000000" w:sz="0" w:space="0"/>
+            </w:tcBorders>
+          </w:tcPr>
+          <w:p>
+            <w:pPr>
+              <w:rPr>
+                <w:rFonts w:hint="default" w:ascii="Calibri" w:hAnsi="Calibri" w:cs="Calibri"/>
+                <w:sz w:val="18"/>
+                <w:szCs w:val="18"/>
+              </w:rPr>
+            </w:pPr>
+            <w:r>
+              <w:rPr>
+                <w:rFonts w:hint="default" w:ascii="Calibri" w:hAnsi="Calibri" w:cs="Calibri"/>
+                <w:sz w:val="18"/>
+                <w:szCs w:val="18"/>
+              </w:rPr>
+              <w:t>ADRs para decisões arquiteturais críticas</w:t>
+            </w:r>
+          </w:p>
+        </w:tc>
+        <w:tc>
+          <w:tcPr>
+            <w:tcW w:w="1762" w:type="pct"/>
+            <w:tcBorders>
+              <w:top w:val="single" w:color="000000" w:sz="0" w:space="0"/>
+              <w:left w:val="single" w:color="000000" w:sz="0" w:space="0"/>
+              <w:bottom w:val="single" w:color="000000" w:sz="0" w:space="0"/>
+              <w:right w:val="single" w:color="000000" w:sz="0" w:space="0"/>
+            </w:tcBorders>
+          </w:tcPr>
+          <w:p>
+            <w:pPr>
+              <w:rPr>
+                <w:rFonts w:hint="default" w:ascii="Calibri" w:hAnsi="Calibri" w:cs="Calibri"/>
+                <w:sz w:val="18"/>
+                <w:szCs w:val="18"/>
+              </w:rPr>
+            </w:pPr>
+            <w:r>
+              <w:rPr>
+                <w:rFonts w:hint="default" w:ascii="Calibri" w:hAnsi="Calibri" w:cs="Calibri"/>
+                <w:sz w:val="18"/>
+                <w:szCs w:val="18"/>
+              </w:rPr>
+              <w:t>Mínimo 3 ADRs registrados (stack, Kanban, métricas)</w:t>
+            </w:r>
+          </w:p>
+        </w:tc>
+        <w:tc>
+          <w:tcPr>
+            <w:tcW w:w="1160" w:type="pct"/>
+            <w:tcBorders>
+              <w:top w:val="single" w:color="000000" w:sz="0" w:space="0"/>
+              <w:left w:val="single" w:color="000000" w:sz="0" w:space="0"/>
+              <w:bottom w:val="single" w:color="000000" w:sz="0" w:space="0"/>
+              <w:right w:val="single" w:color="000000" w:sz="0" w:space="0"/>
+            </w:tcBorders>
+          </w:tcPr>
+          <w:p>
+            <w:pPr>
+              <w:rPr>
+                <w:rFonts w:hint="default" w:ascii="Calibri" w:hAnsi="Calibri" w:cs="Calibri"/>
+                <w:sz w:val="18"/>
+                <w:szCs w:val="18"/>
+              </w:rPr>
+            </w:pPr>
+            <w:r>
+              <w:rPr>
+                <w:rFonts w:hint="default" w:ascii="Calibri" w:hAnsi="Calibri" w:cs="Calibri"/>
+                <w:sz w:val="18"/>
+                <w:szCs w:val="18"/>
+              </w:rPr>
+              <w:t>OKB v3.1 §4.5 + N9.1</w:t>
+            </w:r>
+          </w:p>
+        </w:tc>
+      </w:tr>
+      <w:tr>
+        <w:tblPrEx>
+          <w:tblBorders>
+            <w:top w:val="single" w:color="000000" w:sz="2" w:space="0"/>
+            <w:left w:val="single" w:color="000000" w:sz="2" w:space="0"/>
+            <w:bottom w:val="single" w:color="000000" w:sz="2" w:space="0"/>
+            <w:right w:val="single" w:color="000000" w:sz="2" w:space="0"/>
+            <w:insideH w:val="none" w:color="auto" w:sz="0" w:space="0"/>
+            <w:insideV w:val="none" w:color="auto" w:sz="0" w:space="0"/>
+          </w:tblBorders>
+          <w:tblCellMar>
+            <w:top w:w="80" w:type="dxa"/>
+            <w:left w:w="160" w:type="dxa"/>
+            <w:bottom w:w="80" w:type="dxa"/>
+            <w:right w:w="160" w:type="dxa"/>
+          </w:tblCellMar>
+        </w:tblPrEx>
+        <w:trPr>
+          <w:tblCellSpacing w:w="0" w:type="dxa"/>
+          <w:jc w:val="center"/>
+        </w:trPr>
+        <w:tc>
+          <w:tcPr>
+            <w:tcW w:w="504" w:type="pct"/>
+            <w:tcBorders>
+              <w:top w:val="single" w:color="000000" w:sz="0" w:space="0"/>
+              <w:left w:val="single" w:color="000000" w:sz="0" w:space="0"/>
+              <w:bottom w:val="single" w:color="000000" w:sz="0" w:space="0"/>
+              <w:right w:val="single" w:color="000000" w:sz="0" w:space="0"/>
+            </w:tcBorders>
+          </w:tcPr>
+          <w:p>
+            <w:pPr>
+              <w:rPr>
+                <w:rFonts w:hint="default" w:ascii="Calibri" w:hAnsi="Calibri" w:cs="Calibri"/>
+                <w:sz w:val="18"/>
+                <w:szCs w:val="18"/>
+              </w:rPr>
+            </w:pPr>
+            <w:r>
+              <w:rPr>
+                <w:rFonts w:hint="default" w:ascii="Calibri" w:hAnsi="Calibri" w:cs="Calibri"/>
+                <w:sz w:val="18"/>
+                <w:szCs w:val="18"/>
+              </w:rPr>
+              <w:t>REQ-13</w:t>
+            </w:r>
+          </w:p>
+        </w:tc>
+        <w:tc>
+          <w:tcPr>
+            <w:tcW w:w="1572" w:type="pct"/>
+            <w:tcBorders>
+              <w:top w:val="single" w:color="000000" w:sz="0" w:space="0"/>
+              <w:left w:val="single" w:color="000000" w:sz="0" w:space="0"/>
+              <w:bottom w:val="single" w:color="000000" w:sz="0" w:space="0"/>
+              <w:right w:val="single" w:color="000000" w:sz="0" w:space="0"/>
+            </w:tcBorders>
+          </w:tcPr>
+          <w:p>
+            <w:pPr>
+              <w:rPr>
+                <w:rFonts w:hint="default" w:ascii="Calibri" w:hAnsi="Calibri" w:cs="Calibri"/>
+                <w:sz w:val="18"/>
+                <w:szCs w:val="18"/>
+              </w:rPr>
+            </w:pPr>
+            <w:r>
+              <w:rPr>
+                <w:rFonts w:hint="default" w:ascii="Calibri" w:hAnsi="Calibri" w:cs="Calibri"/>
+                <w:sz w:val="18"/>
+                <w:szCs w:val="18"/>
+              </w:rPr>
+              <w:t>Rastreabilidade de prompts SDD</w:t>
+            </w:r>
+          </w:p>
+        </w:tc>
+        <w:tc>
+          <w:tcPr>
+            <w:tcW w:w="1762" w:type="pct"/>
+            <w:tcBorders>
+              <w:top w:val="single" w:color="000000" w:sz="0" w:space="0"/>
+              <w:left w:val="single" w:color="000000" w:sz="0" w:space="0"/>
+              <w:bottom w:val="single" w:color="000000" w:sz="0" w:space="0"/>
+              <w:right w:val="single" w:color="000000" w:sz="0" w:space="0"/>
+            </w:tcBorders>
+          </w:tcPr>
+          <w:p>
+            <w:pPr>
+              <w:rPr>
+                <w:rFonts w:hint="default" w:ascii="Calibri" w:hAnsi="Calibri" w:cs="Calibri"/>
+                <w:sz w:val="18"/>
+                <w:szCs w:val="18"/>
+              </w:rPr>
+            </w:pPr>
+            <w:r>
+              <w:rPr>
+                <w:rFonts w:hint="default" w:ascii="Calibri" w:hAnsi="Calibri" w:cs="Calibri"/>
+                <w:sz w:val="18"/>
+                <w:szCs w:val="18"/>
+              </w:rPr>
+              <w:t>100% dos prompts catalogados em</w:t>
+            </w:r>
+          </w:p>
+          <w:p>
+            <w:pPr>
+              <w:rPr>
+                <w:rFonts w:hint="default" w:ascii="Calibri" w:hAnsi="Calibri" w:cs="Calibri"/>
+                <w:sz w:val="18"/>
+                <w:szCs w:val="18"/>
+              </w:rPr>
+            </w:pPr>
+            <w:r>
+              <w:rPr>
+                <w:rFonts w:hint="default" w:ascii="Calibri" w:hAnsi="Calibri" w:cs="Calibri"/>
+                <w:sz w:val="18"/>
+                <w:szCs w:val="18"/>
+                <w:highlight w:val="lightGray"/>
+              </w:rPr>
+              <w:t>.ai/handoffs/</w:t>
+            </w:r>
+          </w:p>
+        </w:tc>
+        <w:tc>
+          <w:tcPr>
+            <w:tcW w:w="1160" w:type="pct"/>
+            <w:tcBorders>
+              <w:top w:val="single" w:color="000000" w:sz="0" w:space="0"/>
+              <w:left w:val="single" w:color="000000" w:sz="0" w:space="0"/>
+              <w:bottom w:val="single" w:color="000000" w:sz="0" w:space="0"/>
+              <w:right w:val="single" w:color="000000" w:sz="0" w:space="0"/>
+            </w:tcBorders>
+          </w:tcPr>
+          <w:p>
+            <w:pPr>
+              <w:rPr>
+                <w:rFonts w:hint="default" w:ascii="Calibri" w:hAnsi="Calibri" w:cs="Calibri"/>
+                <w:sz w:val="18"/>
+                <w:szCs w:val="18"/>
+              </w:rPr>
+            </w:pPr>
+            <w:r>
+              <w:rPr>
+                <w:rFonts w:hint="default" w:ascii="Calibri" w:hAnsi="Calibri" w:cs="Calibri"/>
+                <w:sz w:val="18"/>
+                <w:szCs w:val="18"/>
+              </w:rPr>
+              <w:t>OKB v3.1 §4.4 + N9.3</w:t>
+            </w:r>
+          </w:p>
+        </w:tc>
+      </w:tr>
+    </w:tbl>
+    <w:p>
+      <w:pPr>
+        <w:rPr>
+          <w:rFonts w:hint="default" w:ascii="Calibri" w:hAnsi="Calibri" w:cs="Calibri"/>
+        </w:rPr>
+      </w:pPr>
+    </w:p>
+    <w:p>
+      <w:pPr>
+        <w:pStyle w:val="3"/>
+        <w:bidi w:val="0"/>
+        <w:rPr>
+          <w:rFonts w:hint="default"/>
+        </w:rPr>
+      </w:pPr>
+      <w:r>
+        <w:rPr>
+          <w:rFonts w:hint="default"/>
+        </w:rPr>
+        <w:t>Entrega Principal 5 — Documentação Técnica (Fase N11)</w:t>
+      </w:r>
+    </w:p>
+    <w:tbl>
+      <w:tblPr>
+        <w:tblStyle w:val="12"/>
+        <w:tblW w:w="4998" w:type="pct"/>
+        <w:jc w:val="center"/>
+        <w:tblCellSpacing w:w="0" w:type="dxa"/>
+        <w:tblBorders>
+          <w:top w:val="single" w:color="000000" w:sz="2" w:space="0"/>
+          <w:left w:val="single" w:color="000000" w:sz="2" w:space="0"/>
+          <w:bottom w:val="single" w:color="000000" w:sz="2" w:space="0"/>
+          <w:right w:val="single" w:color="000000" w:sz="2" w:space="0"/>
+          <w:insideH w:val="none" w:color="auto" w:sz="0" w:space="0"/>
+          <w:insideV w:val="none" w:color="auto" w:sz="0" w:space="0"/>
+        </w:tblBorders>
+        <w:tblLayout w:type="autofit"/>
+        <w:tblCellMar>
+          <w:top w:w="80" w:type="dxa"/>
+          <w:left w:w="160" w:type="dxa"/>
+          <w:bottom w:w="80" w:type="dxa"/>
+          <w:right w:w="160" w:type="dxa"/>
+        </w:tblCellMar>
+      </w:tblPr>
+      <w:tblGrid>
+        <w:gridCol w:w="817"/>
+        <w:gridCol w:w="2564"/>
+        <w:gridCol w:w="3440"/>
+        <w:gridCol w:w="2009"/>
+      </w:tblGrid>
+      <w:tr>
+        <w:tblPrEx>
+          <w:tblBorders>
+            <w:top w:val="single" w:color="000000" w:sz="2" w:space="0"/>
+            <w:left w:val="single" w:color="000000" w:sz="2" w:space="0"/>
+            <w:bottom w:val="single" w:color="000000" w:sz="2" w:space="0"/>
+            <w:right w:val="single" w:color="000000" w:sz="2" w:space="0"/>
+            <w:insideH w:val="none" w:color="auto" w:sz="0" w:space="0"/>
+            <w:insideV w:val="none" w:color="auto" w:sz="0" w:space="0"/>
+          </w:tblBorders>
+          <w:tblCellMar>
+            <w:top w:w="80" w:type="dxa"/>
+            <w:left w:w="160" w:type="dxa"/>
+            <w:bottom w:w="80" w:type="dxa"/>
+            <w:right w:w="160" w:type="dxa"/>
+          </w:tblCellMar>
+        </w:tblPrEx>
+        <w:trPr>
+          <w:tblCellSpacing w:w="0" w:type="dxa"/>
+          <w:jc w:val="center"/>
+        </w:trPr>
+        <w:tc>
+          <w:tcPr>
+            <w:tcW w:w="463" w:type="pct"/>
+            <w:tcBorders>
+              <w:top w:val="single" w:color="000000" w:sz="0" w:space="0"/>
+              <w:left w:val="single" w:color="000000" w:sz="0" w:space="0"/>
+              <w:bottom w:val="single" w:color="000000" w:sz="0" w:space="0"/>
+              <w:right w:val="single" w:color="000000" w:sz="0" w:space="0"/>
+            </w:tcBorders>
+            <w:shd w:val="clear" w:color="auto" w:fill="B9D5F0" w:themeFill="text2" w:themeFillTint="32"/>
+          </w:tcPr>
+          <w:p>
+            <w:pPr>
+              <w:jc w:val="center"/>
+              <w:rPr>
+                <w:rFonts w:hint="default" w:ascii="Calibri" w:hAnsi="Calibri" w:cs="Calibri"/>
+                <w:b/>
+                <w:bCs/>
+                <w:sz w:val="18"/>
+                <w:szCs w:val="18"/>
+              </w:rPr>
+            </w:pPr>
+            <w:r>
+              <w:rPr>
+                <w:rFonts w:hint="default" w:ascii="Calibri" w:hAnsi="Calibri" w:cs="Calibri"/>
+                <w:b/>
+                <w:bCs/>
+                <w:sz w:val="18"/>
+                <w:szCs w:val="18"/>
+              </w:rPr>
+              <w:t>ID</w:t>
+            </w:r>
+          </w:p>
+        </w:tc>
+        <w:tc>
+          <w:tcPr>
+            <w:tcW w:w="1451" w:type="pct"/>
+            <w:tcBorders>
+              <w:top w:val="single" w:color="000000" w:sz="0" w:space="0"/>
+              <w:left w:val="single" w:color="000000" w:sz="0" w:space="0"/>
+              <w:bottom w:val="single" w:color="000000" w:sz="0" w:space="0"/>
+              <w:right w:val="single" w:color="000000" w:sz="0" w:space="0"/>
+            </w:tcBorders>
+            <w:shd w:val="clear" w:color="auto" w:fill="B9D5F0" w:themeFill="text2" w:themeFillTint="32"/>
+          </w:tcPr>
+          <w:p>
+            <w:pPr>
+              <w:jc w:val="center"/>
+              <w:rPr>
+                <w:rFonts w:hint="default" w:ascii="Calibri" w:hAnsi="Calibri" w:cs="Calibri"/>
+                <w:b/>
+                <w:bCs/>
+                <w:sz w:val="18"/>
+                <w:szCs w:val="18"/>
+              </w:rPr>
+            </w:pPr>
+            <w:r>
+              <w:rPr>
+                <w:rFonts w:hint="default" w:ascii="Calibri" w:hAnsi="Calibri" w:cs="Calibri"/>
+                <w:b/>
+                <w:bCs/>
+                <w:sz w:val="18"/>
+                <w:szCs w:val="18"/>
+              </w:rPr>
+              <w:t>Requisito</w:t>
+            </w:r>
+          </w:p>
+        </w:tc>
+        <w:tc>
+          <w:tcPr>
+            <w:tcW w:w="1947" w:type="pct"/>
+            <w:tcBorders>
+              <w:top w:val="single" w:color="000000" w:sz="0" w:space="0"/>
+              <w:left w:val="single" w:color="000000" w:sz="0" w:space="0"/>
+              <w:bottom w:val="single" w:color="000000" w:sz="0" w:space="0"/>
+              <w:right w:val="single" w:color="000000" w:sz="0" w:space="0"/>
+            </w:tcBorders>
+            <w:shd w:val="clear" w:color="auto" w:fill="B9D5F0" w:themeFill="text2" w:themeFillTint="32"/>
+          </w:tcPr>
+          <w:p>
+            <w:pPr>
+              <w:jc w:val="center"/>
+              <w:rPr>
+                <w:rFonts w:hint="default" w:ascii="Calibri" w:hAnsi="Calibri" w:cs="Calibri"/>
+                <w:b/>
+                <w:bCs/>
+                <w:sz w:val="18"/>
+                <w:szCs w:val="18"/>
+              </w:rPr>
+            </w:pPr>
+            <w:r>
+              <w:rPr>
+                <w:rFonts w:hint="default" w:ascii="Calibri" w:hAnsi="Calibri" w:cs="Calibri"/>
+                <w:b/>
+                <w:bCs/>
+                <w:sz w:val="18"/>
+                <w:szCs w:val="18"/>
+              </w:rPr>
+              <w:t>Critério de Aceite</w:t>
+            </w:r>
+          </w:p>
+        </w:tc>
+        <w:tc>
+          <w:tcPr>
+            <w:tcW w:w="1137" w:type="pct"/>
+            <w:tcBorders>
+              <w:top w:val="single" w:color="000000" w:sz="0" w:space="0"/>
+              <w:left w:val="single" w:color="000000" w:sz="0" w:space="0"/>
+              <w:bottom w:val="single" w:color="000000" w:sz="0" w:space="0"/>
+              <w:right w:val="single" w:color="000000" w:sz="0" w:space="0"/>
+            </w:tcBorders>
+            <w:shd w:val="clear" w:color="auto" w:fill="B9D5F0" w:themeFill="text2" w:themeFillTint="32"/>
+          </w:tcPr>
+          <w:p>
+            <w:pPr>
+              <w:jc w:val="center"/>
+              <w:rPr>
+                <w:rFonts w:hint="default" w:ascii="Calibri" w:hAnsi="Calibri" w:cs="Calibri"/>
+                <w:b/>
+                <w:bCs/>
+                <w:sz w:val="18"/>
+                <w:szCs w:val="18"/>
+              </w:rPr>
+            </w:pPr>
+            <w:r>
+              <w:rPr>
+                <w:rFonts w:hint="default" w:ascii="Calibri" w:hAnsi="Calibri" w:cs="Calibri"/>
+                <w:b/>
+                <w:bCs/>
+                <w:sz w:val="18"/>
+                <w:szCs w:val="18"/>
+              </w:rPr>
+              <w:t>Rastreabilidade</w:t>
+            </w:r>
+          </w:p>
+        </w:tc>
+      </w:tr>
+      <w:tr>
+        <w:tblPrEx>
+          <w:tblBorders>
+            <w:top w:val="single" w:color="000000" w:sz="2" w:space="0"/>
+            <w:left w:val="single" w:color="000000" w:sz="2" w:space="0"/>
+            <w:bottom w:val="single" w:color="000000" w:sz="2" w:space="0"/>
+            <w:right w:val="single" w:color="000000" w:sz="2" w:space="0"/>
+            <w:insideH w:val="none" w:color="auto" w:sz="0" w:space="0"/>
+            <w:insideV w:val="none" w:color="auto" w:sz="0" w:space="0"/>
+          </w:tblBorders>
+          <w:tblCellMar>
+            <w:top w:w="80" w:type="dxa"/>
+            <w:left w:w="160" w:type="dxa"/>
+            <w:bottom w:w="80" w:type="dxa"/>
+            <w:right w:w="160" w:type="dxa"/>
+          </w:tblCellMar>
+        </w:tblPrEx>
+        <w:trPr>
+          <w:tblCellSpacing w:w="0" w:type="dxa"/>
+          <w:jc w:val="center"/>
+        </w:trPr>
+        <w:tc>
+          <w:tcPr>
+            <w:tcW w:w="463" w:type="pct"/>
+            <w:tcBorders>
+              <w:top w:val="single" w:color="000000" w:sz="0" w:space="0"/>
+              <w:left w:val="single" w:color="000000" w:sz="0" w:space="0"/>
+              <w:bottom w:val="single" w:color="000000" w:sz="0" w:space="0"/>
+              <w:right w:val="single" w:color="000000" w:sz="0" w:space="0"/>
+            </w:tcBorders>
+          </w:tcPr>
+          <w:p>
+            <w:pPr>
+              <w:rPr>
+                <w:rFonts w:hint="default" w:ascii="Calibri" w:hAnsi="Calibri" w:cs="Calibri"/>
+                <w:sz w:val="18"/>
+                <w:szCs w:val="18"/>
+              </w:rPr>
+            </w:pPr>
+            <w:r>
+              <w:rPr>
+                <w:rFonts w:hint="default" w:ascii="Calibri" w:hAnsi="Calibri" w:cs="Calibri"/>
+                <w:sz w:val="18"/>
+                <w:szCs w:val="18"/>
+              </w:rPr>
+              <w:t>REQ-14</w:t>
+            </w:r>
+          </w:p>
+        </w:tc>
+        <w:tc>
+          <w:tcPr>
+            <w:tcW w:w="1451" w:type="pct"/>
+            <w:tcBorders>
+              <w:top w:val="single" w:color="000000" w:sz="0" w:space="0"/>
+              <w:left w:val="single" w:color="000000" w:sz="0" w:space="0"/>
+              <w:bottom w:val="single" w:color="000000" w:sz="0" w:space="0"/>
+              <w:right w:val="single" w:color="000000" w:sz="0" w:space="0"/>
+            </w:tcBorders>
+          </w:tcPr>
+          <w:p>
+            <w:pPr>
+              <w:rPr>
+                <w:rFonts w:hint="default" w:ascii="Calibri" w:hAnsi="Calibri" w:cs="Calibri"/>
+                <w:sz w:val="18"/>
+                <w:szCs w:val="18"/>
+              </w:rPr>
+            </w:pPr>
+            <w:r>
+              <w:rPr>
+                <w:rFonts w:hint="default" w:ascii="Calibri" w:hAnsi="Calibri" w:cs="Calibri"/>
+                <w:sz w:val="18"/>
+                <w:szCs w:val="18"/>
+              </w:rPr>
+              <w:t>Documentação técnica consolidada</w:t>
+            </w:r>
+          </w:p>
+        </w:tc>
+        <w:tc>
+          <w:tcPr>
+            <w:tcW w:w="1947" w:type="pct"/>
+            <w:tcBorders>
+              <w:top w:val="single" w:color="000000" w:sz="0" w:space="0"/>
+              <w:left w:val="single" w:color="000000" w:sz="0" w:space="0"/>
+              <w:bottom w:val="single" w:color="000000" w:sz="0" w:space="0"/>
+              <w:right w:val="single" w:color="000000" w:sz="0" w:space="0"/>
+            </w:tcBorders>
+          </w:tcPr>
+          <w:p>
+            <w:pPr>
+              <w:rPr>
+                <w:rFonts w:hint="default" w:ascii="Calibri" w:hAnsi="Calibri" w:cs="Calibri"/>
+                <w:sz w:val="18"/>
+                <w:szCs w:val="18"/>
+              </w:rPr>
+            </w:pPr>
+            <w:r>
+              <w:rPr>
+                <w:rFonts w:hint="default" w:ascii="Calibri" w:hAnsi="Calibri" w:cs="Calibri"/>
+                <w:sz w:val="18"/>
+                <w:szCs w:val="18"/>
+              </w:rPr>
+              <w:t>Arquitetura + APIs (OpenAPI) revisadas e aprovadas</w:t>
+            </w:r>
+          </w:p>
+        </w:tc>
+        <w:tc>
+          <w:tcPr>
+            <w:tcW w:w="1137" w:type="pct"/>
+            <w:tcBorders>
+              <w:top w:val="single" w:color="000000" w:sz="0" w:space="0"/>
+              <w:left w:val="single" w:color="000000" w:sz="0" w:space="0"/>
+              <w:bottom w:val="single" w:color="000000" w:sz="0" w:space="0"/>
+              <w:right w:val="single" w:color="000000" w:sz="0" w:space="0"/>
+            </w:tcBorders>
+          </w:tcPr>
+          <w:p>
+            <w:pPr>
+              <w:rPr>
+                <w:rFonts w:hint="default" w:ascii="Calibri" w:hAnsi="Calibri" w:cs="Calibri"/>
+                <w:sz w:val="18"/>
+                <w:szCs w:val="18"/>
+              </w:rPr>
+            </w:pPr>
+            <w:r>
+              <w:rPr>
+                <w:rFonts w:hint="default" w:ascii="Calibri" w:hAnsi="Calibri" w:cs="Calibri"/>
+                <w:sz w:val="18"/>
+                <w:szCs w:val="18"/>
+              </w:rPr>
+              <w:t>TAP §3 (Produto) + N11.1</w:t>
+            </w:r>
+          </w:p>
+        </w:tc>
+      </w:tr>
+    </w:tbl>
+    <w:p>
+      <w:pPr>
+        <w:rPr>
+          <w:rFonts w:hint="default" w:ascii="Calibri" w:hAnsi="Calibri" w:cs="Calibri"/>
+        </w:rPr>
+      </w:pPr>
+    </w:p>
+    <w:p>
+      <w:pPr>
+        <w:pStyle w:val="3"/>
+        <w:bidi w:val="0"/>
+        <w:rPr>
+          <w:rFonts w:hint="default"/>
+        </w:rPr>
+      </w:pPr>
+      <w:r>
+        <w:rPr>
+          <w:rFonts w:hint="default"/>
+        </w:rPr>
+        <w:t>Entrega Principal 6 — Conformidade FOSS (Fases N1, N4)</w:t>
+      </w:r>
+    </w:p>
+    <w:tbl>
+      <w:tblPr>
+        <w:tblStyle w:val="12"/>
+        <w:tblW w:w="0" w:type="auto"/>
+        <w:jc w:val="center"/>
+        <w:tblCellSpacing w:w="0" w:type="dxa"/>
+        <w:tblBorders>
+          <w:top w:val="single" w:color="000000" w:sz="2" w:space="0"/>
+          <w:left w:val="single" w:color="000000" w:sz="2" w:space="0"/>
+          <w:bottom w:val="single" w:color="000000" w:sz="2" w:space="0"/>
+          <w:right w:val="single" w:color="000000" w:sz="2" w:space="0"/>
+          <w:insideH w:val="none" w:color="auto" w:sz="0" w:space="0"/>
+          <w:insideV w:val="none" w:color="auto" w:sz="0" w:space="0"/>
+        </w:tblBorders>
+        <w:tblLayout w:type="autofit"/>
+        <w:tblCellMar>
+          <w:top w:w="80" w:type="dxa"/>
+          <w:left w:w="160" w:type="dxa"/>
+          <w:bottom w:w="80" w:type="dxa"/>
+          <w:right w:w="160" w:type="dxa"/>
+        </w:tblCellMar>
+      </w:tblPr>
+      <w:tblGrid>
+        <w:gridCol w:w="793"/>
+        <w:gridCol w:w="1878"/>
+        <w:gridCol w:w="3985"/>
+        <w:gridCol w:w="2178"/>
+      </w:tblGrid>
+      <w:tr>
+        <w:tblPrEx>
+          <w:tblBorders>
+            <w:top w:val="single" w:color="000000" w:sz="2" w:space="0"/>
+            <w:left w:val="single" w:color="000000" w:sz="2" w:space="0"/>
+            <w:bottom w:val="single" w:color="000000" w:sz="2" w:space="0"/>
+            <w:right w:val="single" w:color="000000" w:sz="2" w:space="0"/>
+            <w:insideH w:val="none" w:color="auto" w:sz="0" w:space="0"/>
+            <w:insideV w:val="none" w:color="auto" w:sz="0" w:space="0"/>
+          </w:tblBorders>
+          <w:tblCellMar>
+            <w:top w:w="80" w:type="dxa"/>
+            <w:left w:w="160" w:type="dxa"/>
+            <w:bottom w:w="80" w:type="dxa"/>
+            <w:right w:w="160" w:type="dxa"/>
+          </w:tblCellMar>
+        </w:tblPrEx>
+        <w:trPr>
+          <w:tblCellSpacing w:w="0" w:type="dxa"/>
+          <w:jc w:val="center"/>
+        </w:trPr>
+        <w:tc>
+          <w:tcPr>
+            <w:tcBorders>
+              <w:top w:val="single" w:color="000000" w:sz="0" w:space="0"/>
+              <w:left w:val="single" w:color="000000" w:sz="0" w:space="0"/>
+              <w:bottom w:val="single" w:color="000000" w:sz="0" w:space="0"/>
+              <w:right w:val="single" w:color="000000" w:sz="0" w:space="0"/>
+            </w:tcBorders>
+            <w:shd w:val="clear" w:color="auto" w:fill="B9D5F0" w:themeFill="text2" w:themeFillTint="32"/>
+          </w:tcPr>
+          <w:p>
+            <w:pPr>
+              <w:jc w:val="center"/>
+              <w:rPr>
+                <w:rFonts w:hint="default" w:ascii="Calibri" w:hAnsi="Calibri" w:cs="Calibri"/>
+                <w:b/>
+                <w:bCs/>
+                <w:sz w:val="18"/>
+                <w:szCs w:val="18"/>
+              </w:rPr>
+            </w:pPr>
+            <w:r>
+              <w:rPr>
+                <w:rFonts w:hint="default" w:ascii="Calibri" w:hAnsi="Calibri" w:cs="Calibri"/>
+                <w:b/>
+                <w:bCs/>
+                <w:sz w:val="18"/>
+                <w:szCs w:val="18"/>
+              </w:rPr>
+              <w:t>ID</w:t>
+            </w:r>
+          </w:p>
+        </w:tc>
+        <w:tc>
+          <w:tcPr>
+            <w:tcBorders>
+              <w:top w:val="single" w:color="000000" w:sz="0" w:space="0"/>
+              <w:left w:val="single" w:color="000000" w:sz="0" w:space="0"/>
+              <w:bottom w:val="single" w:color="000000" w:sz="0" w:space="0"/>
+              <w:right w:val="single" w:color="000000" w:sz="0" w:space="0"/>
+            </w:tcBorders>
+            <w:shd w:val="clear" w:color="auto" w:fill="B9D5F0" w:themeFill="text2" w:themeFillTint="32"/>
+          </w:tcPr>
+          <w:p>
+            <w:pPr>
+              <w:jc w:val="center"/>
+              <w:rPr>
+                <w:rFonts w:hint="default" w:ascii="Calibri" w:hAnsi="Calibri" w:cs="Calibri"/>
+                <w:b/>
+                <w:bCs/>
+                <w:sz w:val="18"/>
+                <w:szCs w:val="18"/>
+              </w:rPr>
+            </w:pPr>
+            <w:r>
+              <w:rPr>
+                <w:rFonts w:hint="default" w:ascii="Calibri" w:hAnsi="Calibri" w:cs="Calibri"/>
+                <w:b/>
+                <w:bCs/>
+                <w:sz w:val="18"/>
+                <w:szCs w:val="18"/>
+              </w:rPr>
+              <w:t>Requisito</w:t>
+            </w:r>
+          </w:p>
+        </w:tc>
+        <w:tc>
+          <w:tcPr>
+            <w:tcBorders>
+              <w:top w:val="single" w:color="000000" w:sz="0" w:space="0"/>
+              <w:left w:val="single" w:color="000000" w:sz="0" w:space="0"/>
+              <w:bottom w:val="single" w:color="000000" w:sz="0" w:space="0"/>
+              <w:right w:val="single" w:color="000000" w:sz="0" w:space="0"/>
+            </w:tcBorders>
+            <w:shd w:val="clear" w:color="auto" w:fill="B9D5F0" w:themeFill="text2" w:themeFillTint="32"/>
+          </w:tcPr>
+          <w:p>
+            <w:pPr>
+              <w:jc w:val="center"/>
+              <w:rPr>
+                <w:rFonts w:hint="default" w:ascii="Calibri" w:hAnsi="Calibri" w:cs="Calibri"/>
+                <w:b/>
+                <w:bCs/>
+                <w:sz w:val="18"/>
+                <w:szCs w:val="18"/>
+              </w:rPr>
+            </w:pPr>
+            <w:r>
+              <w:rPr>
+                <w:rFonts w:hint="default" w:ascii="Calibri" w:hAnsi="Calibri" w:cs="Calibri"/>
+                <w:b/>
+                <w:bCs/>
+                <w:sz w:val="18"/>
+                <w:szCs w:val="18"/>
+              </w:rPr>
+              <w:t>Critério de Aceite</w:t>
+            </w:r>
+          </w:p>
+        </w:tc>
+        <w:tc>
+          <w:tcPr>
+            <w:tcBorders>
+              <w:top w:val="single" w:color="000000" w:sz="0" w:space="0"/>
+              <w:left w:val="single" w:color="000000" w:sz="0" w:space="0"/>
+              <w:bottom w:val="single" w:color="000000" w:sz="0" w:space="0"/>
+              <w:right w:val="single" w:color="000000" w:sz="0" w:space="0"/>
+            </w:tcBorders>
+            <w:shd w:val="clear" w:color="auto" w:fill="B9D5F0" w:themeFill="text2" w:themeFillTint="32"/>
+          </w:tcPr>
+          <w:p>
+            <w:pPr>
+              <w:jc w:val="center"/>
+              <w:rPr>
+                <w:rFonts w:hint="default" w:ascii="Calibri" w:hAnsi="Calibri" w:cs="Calibri"/>
+                <w:b/>
+                <w:bCs/>
+                <w:sz w:val="18"/>
+                <w:szCs w:val="18"/>
+              </w:rPr>
+            </w:pPr>
+            <w:r>
+              <w:rPr>
+                <w:rFonts w:hint="default" w:ascii="Calibri" w:hAnsi="Calibri" w:cs="Calibri"/>
+                <w:b/>
+                <w:bCs/>
+                <w:sz w:val="18"/>
+                <w:szCs w:val="18"/>
+              </w:rPr>
+              <w:t>Rastreabilidade</w:t>
+            </w:r>
+          </w:p>
+        </w:tc>
+      </w:tr>
+      <w:tr>
+        <w:tblPrEx>
+          <w:tblBorders>
+            <w:top w:val="single" w:color="000000" w:sz="2" w:space="0"/>
+            <w:left w:val="single" w:color="000000" w:sz="2" w:space="0"/>
+            <w:bottom w:val="single" w:color="000000" w:sz="2" w:space="0"/>
+            <w:right w:val="single" w:color="000000" w:sz="2" w:space="0"/>
+            <w:insideH w:val="none" w:color="auto" w:sz="0" w:space="0"/>
+            <w:insideV w:val="none" w:color="auto" w:sz="0" w:space="0"/>
+          </w:tblBorders>
+          <w:tblCellMar>
+            <w:top w:w="80" w:type="dxa"/>
+            <w:left w:w="160" w:type="dxa"/>
+            <w:bottom w:w="80" w:type="dxa"/>
+            <w:right w:w="160" w:type="dxa"/>
+          </w:tblCellMar>
+        </w:tblPrEx>
+        <w:trPr>
+          <w:tblCellSpacing w:w="0" w:type="dxa"/>
+          <w:jc w:val="center"/>
+        </w:trPr>
+        <w:tc>
+          <w:tcPr>
+            <w:tcBorders>
+              <w:top w:val="single" w:color="000000" w:sz="0" w:space="0"/>
+              <w:left w:val="single" w:color="000000" w:sz="0" w:space="0"/>
+              <w:bottom w:val="single" w:color="000000" w:sz="0" w:space="0"/>
+              <w:right w:val="single" w:color="000000" w:sz="0" w:space="0"/>
+            </w:tcBorders>
+          </w:tcPr>
+          <w:p>
+            <w:pPr>
+              <w:rPr>
+                <w:rFonts w:hint="default" w:ascii="Calibri" w:hAnsi="Calibri" w:cs="Calibri"/>
+                <w:sz w:val="18"/>
+                <w:szCs w:val="18"/>
+              </w:rPr>
+            </w:pPr>
+            <w:r>
+              <w:rPr>
+                <w:rFonts w:hint="default" w:ascii="Calibri" w:hAnsi="Calibri" w:cs="Calibri"/>
+                <w:sz w:val="18"/>
+                <w:szCs w:val="18"/>
+              </w:rPr>
+              <w:t>REQ-15</w:t>
+            </w:r>
+          </w:p>
+        </w:tc>
+        <w:tc>
+          <w:tcPr>
+            <w:tcBorders>
+              <w:top w:val="single" w:color="000000" w:sz="0" w:space="0"/>
+              <w:left w:val="single" w:color="000000" w:sz="0" w:space="0"/>
+              <w:bottom w:val="single" w:color="000000" w:sz="0" w:space="0"/>
+              <w:right w:val="single" w:color="000000" w:sz="0" w:space="0"/>
+            </w:tcBorders>
+          </w:tcPr>
+          <w:p>
+            <w:pPr>
+              <w:rPr>
+                <w:rFonts w:hint="default" w:ascii="Calibri" w:hAnsi="Calibri" w:cs="Calibri"/>
+                <w:sz w:val="18"/>
+                <w:szCs w:val="18"/>
+              </w:rPr>
+            </w:pPr>
+            <w:r>
+              <w:rPr>
+                <w:rFonts w:hint="default" w:ascii="Calibri" w:hAnsi="Calibri" w:cs="Calibri"/>
+                <w:sz w:val="18"/>
+                <w:szCs w:val="18"/>
+              </w:rPr>
+              <w:t>Licenciamento 100% FOSS</w:t>
+            </w:r>
+          </w:p>
+        </w:tc>
+        <w:tc>
+          <w:tcPr>
+            <w:tcBorders>
+              <w:top w:val="single" w:color="000000" w:sz="0" w:space="0"/>
+              <w:left w:val="single" w:color="000000" w:sz="0" w:space="0"/>
+              <w:bottom w:val="single" w:color="000000" w:sz="0" w:space="0"/>
+              <w:right w:val="single" w:color="000000" w:sz="0" w:space="0"/>
+            </w:tcBorders>
+          </w:tcPr>
+          <w:p>
+            <w:pPr>
+              <w:rPr>
+                <w:rFonts w:hint="default" w:ascii="Calibri" w:hAnsi="Calibri" w:cs="Calibri"/>
+                <w:sz w:val="18"/>
+                <w:szCs w:val="18"/>
+              </w:rPr>
+            </w:pPr>
+            <w:r>
+              <w:rPr>
+                <w:rFonts w:hint="default" w:ascii="Calibri" w:hAnsi="Calibri" w:cs="Calibri"/>
+                <w:sz w:val="18"/>
+                <w:szCs w:val="18"/>
+              </w:rPr>
+              <w:t>Todas dependências com licenças OSI-approved (MIT, Apache 2.0, BSD, GPL)</w:t>
+            </w:r>
+          </w:p>
+        </w:tc>
+        <w:tc>
+          <w:tcPr>
+            <w:tcBorders>
+              <w:top w:val="single" w:color="000000" w:sz="0" w:space="0"/>
+              <w:left w:val="single" w:color="000000" w:sz="0" w:space="0"/>
+              <w:bottom w:val="single" w:color="000000" w:sz="0" w:space="0"/>
+              <w:right w:val="single" w:color="000000" w:sz="0" w:space="0"/>
+            </w:tcBorders>
+          </w:tcPr>
+          <w:p>
+            <w:pPr>
+              <w:rPr>
+                <w:rFonts w:hint="default" w:ascii="Calibri" w:hAnsi="Calibri" w:cs="Calibri"/>
+                <w:sz w:val="18"/>
+                <w:szCs w:val="18"/>
+              </w:rPr>
+            </w:pPr>
+            <w:r>
+              <w:rPr>
+                <w:rFonts w:hint="default" w:ascii="Calibri" w:hAnsi="Calibri" w:cs="Calibri"/>
+                <w:sz w:val="18"/>
+                <w:szCs w:val="18"/>
+              </w:rPr>
+              <w:t>TAP §3 (Inovação) + N1.5 + N4.4</w:t>
+            </w:r>
+          </w:p>
+        </w:tc>
+      </w:tr>
+    </w:tbl>
+    <w:p>
+      <w:pPr>
+        <w:rPr>
+          <w:rFonts w:hint="default" w:ascii="Calibri" w:hAnsi="Calibri" w:cs="Calibri"/>
+        </w:rPr>
+      </w:pPr>
+    </w:p>
+    <w:p>
+      <w:pPr>
+        <w:pStyle w:val="3"/>
+        <w:bidi w:val="0"/>
+        <w:rPr>
+          <w:rFonts w:hint="default"/>
+        </w:rPr>
+      </w:pPr>
+      <w:r>
+        <w:rPr>
+          <w:rFonts w:hint="default"/>
+        </w:rPr>
+        <w:t>MATRIZ DE RASTREABILIDADE CONSOLIDADA (TAP §3 → EAP → REQUISITOS)</w:t>
+      </w:r>
+    </w:p>
+    <w:tbl>
+      <w:tblPr>
+        <w:tblStyle w:val="12"/>
+        <w:tblW w:w="0" w:type="auto"/>
+        <w:jc w:val="center"/>
+        <w:tblCellSpacing w:w="0" w:type="dxa"/>
+        <w:tblBorders>
+          <w:top w:val="single" w:color="000000" w:sz="2" w:space="0"/>
+          <w:left w:val="single" w:color="000000" w:sz="2" w:space="0"/>
+          <w:bottom w:val="single" w:color="000000" w:sz="2" w:space="0"/>
+          <w:right w:val="single" w:color="000000" w:sz="2" w:space="0"/>
+          <w:insideH w:val="none" w:color="auto" w:sz="0" w:space="0"/>
+          <w:insideV w:val="none" w:color="auto" w:sz="0" w:space="0"/>
+        </w:tblBorders>
+        <w:tblLayout w:type="autofit"/>
+        <w:tblCellMar>
+          <w:top w:w="80" w:type="dxa"/>
+          <w:left w:w="160" w:type="dxa"/>
+          <w:bottom w:w="80" w:type="dxa"/>
+          <w:right w:w="160" w:type="dxa"/>
+        </w:tblCellMar>
+      </w:tblPr>
+      <w:tblGrid>
+        <w:gridCol w:w="2412"/>
+        <w:gridCol w:w="2180"/>
+        <w:gridCol w:w="2335"/>
+        <w:gridCol w:w="1907"/>
+      </w:tblGrid>
+      <w:tr>
+        <w:tblPrEx>
+          <w:tblBorders>
+            <w:top w:val="single" w:color="000000" w:sz="2" w:space="0"/>
+            <w:left w:val="single" w:color="000000" w:sz="2" w:space="0"/>
+            <w:bottom w:val="single" w:color="000000" w:sz="2" w:space="0"/>
+            <w:right w:val="single" w:color="000000" w:sz="2" w:space="0"/>
+            <w:insideH w:val="none" w:color="auto" w:sz="0" w:space="0"/>
+            <w:insideV w:val="none" w:color="auto" w:sz="0" w:space="0"/>
+          </w:tblBorders>
+          <w:tblCellMar>
+            <w:top w:w="80" w:type="dxa"/>
+            <w:left w:w="160" w:type="dxa"/>
+            <w:bottom w:w="80" w:type="dxa"/>
+            <w:right w:w="160" w:type="dxa"/>
+          </w:tblCellMar>
+        </w:tblPrEx>
+        <w:trPr>
+          <w:tblCellSpacing w:w="0" w:type="dxa"/>
+          <w:jc w:val="center"/>
+        </w:trPr>
+        <w:tc>
+          <w:tcPr>
+            <w:tcBorders>
+              <w:top w:val="single" w:color="000000" w:sz="0" w:space="0"/>
+              <w:left w:val="single" w:color="000000" w:sz="0" w:space="0"/>
+              <w:bottom w:val="single" w:color="000000" w:sz="0" w:space="0"/>
+              <w:right w:val="single" w:color="000000" w:sz="0" w:space="0"/>
+            </w:tcBorders>
+            <w:shd w:val="clear" w:color="auto" w:fill="B9D5F0" w:themeFill="text2" w:themeFillTint="32"/>
+          </w:tcPr>
+          <w:p>
+            <w:pPr>
+              <w:jc w:val="center"/>
+              <w:rPr>
+                <w:rFonts w:hint="default" w:ascii="Calibri" w:hAnsi="Calibri" w:cs="Calibri"/>
+                <w:b/>
+                <w:bCs/>
+                <w:sz w:val="18"/>
+                <w:szCs w:val="18"/>
+              </w:rPr>
+            </w:pPr>
+            <w:r>
+              <w:rPr>
+                <w:rFonts w:hint="default" w:ascii="Calibri" w:hAnsi="Calibri" w:cs="Calibri"/>
+                <w:b/>
+                <w:bCs/>
+                <w:sz w:val="18"/>
+                <w:szCs w:val="18"/>
+              </w:rPr>
+              <w:t>Objetivo SMART (TAP §3)</w:t>
+            </w:r>
+          </w:p>
+        </w:tc>
+        <w:tc>
+          <w:tcPr>
+            <w:tcBorders>
+              <w:top w:val="single" w:color="000000" w:sz="0" w:space="0"/>
+              <w:left w:val="single" w:color="000000" w:sz="0" w:space="0"/>
+              <w:bottom w:val="single" w:color="000000" w:sz="0" w:space="0"/>
+              <w:right w:val="single" w:color="000000" w:sz="0" w:space="0"/>
+            </w:tcBorders>
+            <w:shd w:val="clear" w:color="auto" w:fill="B9D5F0" w:themeFill="text2" w:themeFillTint="32"/>
+          </w:tcPr>
+          <w:p>
+            <w:pPr>
+              <w:jc w:val="center"/>
+              <w:rPr>
+                <w:rFonts w:hint="default" w:ascii="Calibri" w:hAnsi="Calibri" w:cs="Calibri"/>
+                <w:b/>
+                <w:bCs/>
+                <w:sz w:val="18"/>
+                <w:szCs w:val="18"/>
+              </w:rPr>
+            </w:pPr>
+            <w:r>
+              <w:rPr>
+                <w:rFonts w:hint="default" w:ascii="Calibri" w:hAnsi="Calibri" w:cs="Calibri"/>
+                <w:b/>
+                <w:bCs/>
+                <w:sz w:val="18"/>
+                <w:szCs w:val="18"/>
+              </w:rPr>
+              <w:t>Fases EAP v2.0 Associadas</w:t>
+            </w:r>
+          </w:p>
+        </w:tc>
+        <w:tc>
+          <w:tcPr>
+            <w:tcBorders>
+              <w:top w:val="single" w:color="000000" w:sz="0" w:space="0"/>
+              <w:left w:val="single" w:color="000000" w:sz="0" w:space="0"/>
+              <w:bottom w:val="single" w:color="000000" w:sz="0" w:space="0"/>
+              <w:right w:val="single" w:color="000000" w:sz="0" w:space="0"/>
+            </w:tcBorders>
+            <w:shd w:val="clear" w:color="auto" w:fill="B9D5F0" w:themeFill="text2" w:themeFillTint="32"/>
+          </w:tcPr>
+          <w:p>
+            <w:pPr>
+              <w:jc w:val="center"/>
+              <w:rPr>
+                <w:rFonts w:hint="default" w:ascii="Calibri" w:hAnsi="Calibri" w:cs="Calibri"/>
+                <w:b/>
+                <w:bCs/>
+                <w:sz w:val="18"/>
+                <w:szCs w:val="18"/>
+              </w:rPr>
+            </w:pPr>
+            <w:r>
+              <w:rPr>
+                <w:rFonts w:hint="default" w:ascii="Calibri" w:hAnsi="Calibri" w:cs="Calibri"/>
+                <w:b/>
+                <w:bCs/>
+                <w:sz w:val="18"/>
+                <w:szCs w:val="18"/>
+              </w:rPr>
+              <w:t>Requisitos Cobertos</w:t>
+            </w:r>
+          </w:p>
+        </w:tc>
+        <w:tc>
+          <w:tcPr>
+            <w:tcBorders>
+              <w:top w:val="single" w:color="000000" w:sz="0" w:space="0"/>
+              <w:left w:val="single" w:color="000000" w:sz="0" w:space="0"/>
+              <w:bottom w:val="single" w:color="000000" w:sz="0" w:space="0"/>
+              <w:right w:val="single" w:color="000000" w:sz="0" w:space="0"/>
+            </w:tcBorders>
+            <w:shd w:val="clear" w:color="auto" w:fill="B9D5F0" w:themeFill="text2" w:themeFillTint="32"/>
+          </w:tcPr>
+          <w:p>
+            <w:pPr>
+              <w:jc w:val="center"/>
+              <w:rPr>
+                <w:rFonts w:hint="default" w:ascii="Calibri" w:hAnsi="Calibri" w:cs="Calibri"/>
+                <w:b/>
+                <w:bCs/>
+                <w:sz w:val="18"/>
+                <w:szCs w:val="18"/>
+              </w:rPr>
+            </w:pPr>
+            <w:r>
+              <w:rPr>
+                <w:rFonts w:hint="default" w:ascii="Calibri" w:hAnsi="Calibri" w:cs="Calibri"/>
+                <w:b/>
+                <w:bCs/>
+                <w:sz w:val="18"/>
+                <w:szCs w:val="18"/>
+              </w:rPr>
+              <w:t>Domínio PMBOK 7ª</w:t>
+            </w:r>
+          </w:p>
+        </w:tc>
+      </w:tr>
+      <w:tr>
+        <w:tblPrEx>
+          <w:tblBorders>
+            <w:top w:val="single" w:color="000000" w:sz="2" w:space="0"/>
+            <w:left w:val="single" w:color="000000" w:sz="2" w:space="0"/>
+            <w:bottom w:val="single" w:color="000000" w:sz="2" w:space="0"/>
+            <w:right w:val="single" w:color="000000" w:sz="2" w:space="0"/>
+            <w:insideH w:val="none" w:color="auto" w:sz="0" w:space="0"/>
+            <w:insideV w:val="none" w:color="auto" w:sz="0" w:space="0"/>
+          </w:tblBorders>
+          <w:tblCellMar>
+            <w:top w:w="80" w:type="dxa"/>
+            <w:left w:w="160" w:type="dxa"/>
+            <w:bottom w:w="80" w:type="dxa"/>
+            <w:right w:w="160" w:type="dxa"/>
+          </w:tblCellMar>
+        </w:tblPrEx>
+        <w:trPr>
+          <w:tblCellSpacing w:w="0" w:type="dxa"/>
+          <w:jc w:val="center"/>
+        </w:trPr>
+        <w:tc>
+          <w:tcPr>
+            <w:tcBorders>
+              <w:top w:val="single" w:color="000000" w:sz="0" w:space="0"/>
+              <w:left w:val="single" w:color="000000" w:sz="0" w:space="0"/>
+              <w:bottom w:val="single" w:color="000000" w:sz="0" w:space="0"/>
+              <w:right w:val="single" w:color="000000" w:sz="0" w:space="0"/>
+            </w:tcBorders>
+          </w:tcPr>
+          <w:p>
+            <w:pPr>
+              <w:rPr>
+                <w:rFonts w:hint="default" w:ascii="Calibri" w:hAnsi="Calibri" w:cs="Calibri"/>
+                <w:sz w:val="18"/>
+                <w:szCs w:val="18"/>
+              </w:rPr>
+            </w:pPr>
+            <w:r>
+              <w:rPr>
+                <w:rFonts w:hint="default" w:ascii="Calibri" w:hAnsi="Calibri" w:cs="Calibri"/>
+                <w:b/>
+                <w:sz w:val="18"/>
+                <w:szCs w:val="18"/>
+              </w:rPr>
+              <w:t>Produto (Escopo)</w:t>
+            </w:r>
+          </w:p>
+          <w:p>
+            <w:pPr>
+              <w:rPr>
+                <w:rFonts w:hint="default" w:ascii="Calibri" w:hAnsi="Calibri" w:cs="Calibri"/>
+                <w:sz w:val="18"/>
+                <w:szCs w:val="18"/>
+              </w:rPr>
+            </w:pPr>
+            <w:r>
+              <w:rPr>
+                <w:rFonts w:hint="default" w:ascii="Calibri" w:hAnsi="Calibri" w:cs="Calibri"/>
+                <w:sz w:val="18"/>
+                <w:szCs w:val="18"/>
+              </w:rPr>
+              <w:t xml:space="preserve"> — MVP funcional com simulação cambial, 5 regimes, invoice PDF, ≤ 3s</w:t>
+            </w:r>
+          </w:p>
+        </w:tc>
+        <w:tc>
+          <w:tcPr>
+            <w:tcBorders>
+              <w:top w:val="single" w:color="000000" w:sz="0" w:space="0"/>
+              <w:left w:val="single" w:color="000000" w:sz="0" w:space="0"/>
+              <w:bottom w:val="single" w:color="000000" w:sz="0" w:space="0"/>
+              <w:right w:val="single" w:color="000000" w:sz="0" w:space="0"/>
+            </w:tcBorders>
+          </w:tcPr>
+          <w:p>
+            <w:pPr>
+              <w:rPr>
+                <w:rFonts w:hint="default" w:ascii="Calibri" w:hAnsi="Calibri" w:cs="Calibri"/>
+                <w:sz w:val="18"/>
+                <w:szCs w:val="18"/>
+              </w:rPr>
+            </w:pPr>
+            <w:r>
+              <w:rPr>
+                <w:rFonts w:hint="default" w:ascii="Calibri" w:hAnsi="Calibri" w:cs="Calibri"/>
+                <w:sz w:val="18"/>
+                <w:szCs w:val="18"/>
+              </w:rPr>
+              <w:t>N5 (Desenvolvimento)</w:t>
+            </w:r>
+          </w:p>
+        </w:tc>
+        <w:tc>
+          <w:tcPr>
+            <w:tcBorders>
+              <w:top w:val="single" w:color="000000" w:sz="0" w:space="0"/>
+              <w:left w:val="single" w:color="000000" w:sz="0" w:space="0"/>
+              <w:bottom w:val="single" w:color="000000" w:sz="0" w:space="0"/>
+              <w:right w:val="single" w:color="000000" w:sz="0" w:space="0"/>
+            </w:tcBorders>
+          </w:tcPr>
+          <w:p>
+            <w:pPr>
+              <w:rPr>
+                <w:rFonts w:hint="default" w:ascii="Calibri" w:hAnsi="Calibri" w:cs="Calibri"/>
+                <w:sz w:val="18"/>
+                <w:szCs w:val="18"/>
+              </w:rPr>
+            </w:pPr>
+            <w:r>
+              <w:rPr>
+                <w:rFonts w:hint="default" w:ascii="Calibri" w:hAnsi="Calibri" w:cs="Calibri"/>
+                <w:sz w:val="18"/>
+                <w:szCs w:val="18"/>
+              </w:rPr>
+              <w:t>REQ-01, REQ-02, REQ-03, REQ-04, REQ-05, REQ-06, REQ-07</w:t>
+            </w:r>
+          </w:p>
+        </w:tc>
+        <w:tc>
+          <w:tcPr>
+            <w:tcBorders>
+              <w:top w:val="single" w:color="000000" w:sz="0" w:space="0"/>
+              <w:left w:val="single" w:color="000000" w:sz="0" w:space="0"/>
+              <w:bottom w:val="single" w:color="000000" w:sz="0" w:space="0"/>
+              <w:right w:val="single" w:color="000000" w:sz="0" w:space="0"/>
+            </w:tcBorders>
+          </w:tcPr>
+          <w:p>
+            <w:pPr>
+              <w:rPr>
+                <w:rFonts w:hint="default" w:ascii="Calibri" w:hAnsi="Calibri" w:cs="Calibri"/>
+                <w:sz w:val="18"/>
+                <w:szCs w:val="18"/>
+              </w:rPr>
+            </w:pPr>
+            <w:r>
+              <w:rPr>
+                <w:rFonts w:hint="default" w:ascii="Calibri" w:hAnsi="Calibri" w:cs="Calibri"/>
+                <w:sz w:val="18"/>
+                <w:szCs w:val="18"/>
+              </w:rPr>
+              <w:t>Entrega</w:t>
+            </w:r>
+          </w:p>
+        </w:tc>
+      </w:tr>
+      <w:tr>
+        <w:tblPrEx>
+          <w:tblBorders>
+            <w:top w:val="single" w:color="000000" w:sz="2" w:space="0"/>
+            <w:left w:val="single" w:color="000000" w:sz="2" w:space="0"/>
+            <w:bottom w:val="single" w:color="000000" w:sz="2" w:space="0"/>
+            <w:right w:val="single" w:color="000000" w:sz="2" w:space="0"/>
+            <w:insideH w:val="none" w:color="auto" w:sz="0" w:space="0"/>
+            <w:insideV w:val="none" w:color="auto" w:sz="0" w:space="0"/>
+          </w:tblBorders>
+          <w:tblCellMar>
+            <w:top w:w="80" w:type="dxa"/>
+            <w:left w:w="160" w:type="dxa"/>
+            <w:bottom w:w="80" w:type="dxa"/>
+            <w:right w:w="160" w:type="dxa"/>
+          </w:tblCellMar>
+        </w:tblPrEx>
+        <w:trPr>
+          <w:tblCellSpacing w:w="0" w:type="dxa"/>
+          <w:jc w:val="center"/>
+        </w:trPr>
+        <w:tc>
+          <w:tcPr>
+            <w:tcBorders>
+              <w:top w:val="single" w:color="000000" w:sz="0" w:space="0"/>
+              <w:left w:val="single" w:color="000000" w:sz="0" w:space="0"/>
+              <w:bottom w:val="single" w:color="000000" w:sz="0" w:space="0"/>
+              <w:right w:val="single" w:color="000000" w:sz="0" w:space="0"/>
+            </w:tcBorders>
+          </w:tcPr>
+          <w:p>
+            <w:pPr>
+              <w:rPr>
+                <w:rFonts w:hint="default" w:ascii="Calibri" w:hAnsi="Calibri" w:cs="Calibri"/>
+                <w:sz w:val="18"/>
+                <w:szCs w:val="18"/>
+              </w:rPr>
+            </w:pPr>
+            <w:r>
+              <w:rPr>
+                <w:rFonts w:hint="default" w:ascii="Calibri" w:hAnsi="Calibri" w:cs="Calibri"/>
+                <w:b/>
+                <w:sz w:val="18"/>
+                <w:szCs w:val="18"/>
+              </w:rPr>
+              <w:t>Qualidade e Testes</w:t>
+            </w:r>
+          </w:p>
+          <w:p>
+            <w:pPr>
+              <w:rPr>
+                <w:rFonts w:hint="default" w:ascii="Calibri" w:hAnsi="Calibri" w:cs="Calibri"/>
+                <w:sz w:val="18"/>
+                <w:szCs w:val="18"/>
+              </w:rPr>
+            </w:pPr>
+            <w:r>
+              <w:rPr>
+                <w:rFonts w:hint="default" w:ascii="Calibri" w:hAnsi="Calibri" w:cs="Calibri"/>
+                <w:sz w:val="18"/>
+                <w:szCs w:val="18"/>
+              </w:rPr>
+              <w:t xml:space="preserve"> — ≥ 80% coverage, UAT 100% fluxos críticos, zero defeitos críticos</w:t>
+            </w:r>
+          </w:p>
+        </w:tc>
+        <w:tc>
+          <w:tcPr>
+            <w:tcBorders>
+              <w:top w:val="single" w:color="000000" w:sz="0" w:space="0"/>
+              <w:left w:val="single" w:color="000000" w:sz="0" w:space="0"/>
+              <w:bottom w:val="single" w:color="000000" w:sz="0" w:space="0"/>
+              <w:right w:val="single" w:color="000000" w:sz="0" w:space="0"/>
+            </w:tcBorders>
+          </w:tcPr>
+          <w:p>
+            <w:pPr>
+              <w:rPr>
+                <w:rFonts w:hint="default" w:ascii="Calibri" w:hAnsi="Calibri" w:cs="Calibri"/>
+                <w:sz w:val="18"/>
+                <w:szCs w:val="18"/>
+              </w:rPr>
+            </w:pPr>
+            <w:r>
+              <w:rPr>
+                <w:rFonts w:hint="default" w:ascii="Calibri" w:hAnsi="Calibri" w:cs="Calibri"/>
+                <w:sz w:val="18"/>
+                <w:szCs w:val="18"/>
+              </w:rPr>
+              <w:t>N6 (Garantia da Qualidade)</w:t>
+            </w:r>
+          </w:p>
+        </w:tc>
+        <w:tc>
+          <w:tcPr>
+            <w:tcBorders>
+              <w:top w:val="single" w:color="000000" w:sz="0" w:space="0"/>
+              <w:left w:val="single" w:color="000000" w:sz="0" w:space="0"/>
+              <w:bottom w:val="single" w:color="000000" w:sz="0" w:space="0"/>
+              <w:right w:val="single" w:color="000000" w:sz="0" w:space="0"/>
+            </w:tcBorders>
+          </w:tcPr>
+          <w:p>
+            <w:pPr>
+              <w:rPr>
+                <w:rFonts w:hint="default" w:ascii="Calibri" w:hAnsi="Calibri" w:cs="Calibri"/>
+                <w:sz w:val="18"/>
+                <w:szCs w:val="18"/>
+              </w:rPr>
+            </w:pPr>
+            <w:r>
+              <w:rPr>
+                <w:rFonts w:hint="default" w:ascii="Calibri" w:hAnsi="Calibri" w:cs="Calibri"/>
+                <w:sz w:val="18"/>
+                <w:szCs w:val="18"/>
+              </w:rPr>
+              <w:t>REQ-08, REQ-09, REQ-10</w:t>
+            </w:r>
+          </w:p>
+        </w:tc>
+        <w:tc>
+          <w:tcPr>
+            <w:tcBorders>
+              <w:top w:val="single" w:color="000000" w:sz="0" w:space="0"/>
+              <w:left w:val="single" w:color="000000" w:sz="0" w:space="0"/>
+              <w:bottom w:val="single" w:color="000000" w:sz="0" w:space="0"/>
+              <w:right w:val="single" w:color="000000" w:sz="0" w:space="0"/>
+            </w:tcBorders>
+          </w:tcPr>
+          <w:p>
+            <w:pPr>
+              <w:rPr>
+                <w:rFonts w:hint="default" w:ascii="Calibri" w:hAnsi="Calibri" w:cs="Calibri"/>
+                <w:sz w:val="18"/>
+                <w:szCs w:val="18"/>
+              </w:rPr>
+            </w:pPr>
+            <w:r>
+              <w:rPr>
+                <w:rFonts w:hint="default" w:ascii="Calibri" w:hAnsi="Calibri" w:cs="Calibri"/>
+                <w:sz w:val="18"/>
+                <w:szCs w:val="18"/>
+              </w:rPr>
+              <w:t>Medição</w:t>
+            </w:r>
+          </w:p>
+        </w:tc>
+      </w:tr>
+      <w:tr>
+        <w:tblPrEx>
+          <w:tblBorders>
+            <w:top w:val="single" w:color="000000" w:sz="2" w:space="0"/>
+            <w:left w:val="single" w:color="000000" w:sz="2" w:space="0"/>
+            <w:bottom w:val="single" w:color="000000" w:sz="2" w:space="0"/>
+            <w:right w:val="single" w:color="000000" w:sz="2" w:space="0"/>
+            <w:insideH w:val="none" w:color="auto" w:sz="0" w:space="0"/>
+            <w:insideV w:val="none" w:color="auto" w:sz="0" w:space="0"/>
+          </w:tblBorders>
+        </w:tblPrEx>
+        <w:trPr>
+          <w:tblCellSpacing w:w="0" w:type="dxa"/>
+          <w:jc w:val="center"/>
+        </w:trPr>
+        <w:tc>
+          <w:tcPr>
+            <w:tcBorders>
+              <w:top w:val="single" w:color="000000" w:sz="0" w:space="0"/>
+              <w:left w:val="single" w:color="000000" w:sz="0" w:space="0"/>
+              <w:bottom w:val="single" w:color="000000" w:sz="0" w:space="0"/>
+              <w:right w:val="single" w:color="000000" w:sz="0" w:space="0"/>
+            </w:tcBorders>
+          </w:tcPr>
+          <w:p>
+            <w:pPr>
+              <w:rPr>
+                <w:rFonts w:hint="default" w:ascii="Calibri" w:hAnsi="Calibri" w:cs="Calibri"/>
+                <w:sz w:val="18"/>
+                <w:szCs w:val="18"/>
+              </w:rPr>
+            </w:pPr>
+            <w:r>
+              <w:rPr>
+                <w:rFonts w:hint="default" w:ascii="Calibri" w:hAnsi="Calibri" w:cs="Calibri"/>
+                <w:b/>
+                <w:sz w:val="18"/>
+                <w:szCs w:val="18"/>
+              </w:rPr>
+              <w:t>Cronograma (Marcos)</w:t>
+            </w:r>
+          </w:p>
+          <w:p>
+            <w:pPr>
+              <w:rPr>
+                <w:rFonts w:hint="default" w:ascii="Calibri" w:hAnsi="Calibri" w:cs="Calibri"/>
+                <w:sz w:val="18"/>
+                <w:szCs w:val="18"/>
+              </w:rPr>
+            </w:pPr>
+            <w:r>
+              <w:rPr>
+                <w:rFonts w:hint="default" w:ascii="Calibri" w:hAnsi="Calibri" w:cs="Calibri"/>
+                <w:sz w:val="18"/>
+                <w:szCs w:val="18"/>
+              </w:rPr>
+              <w:t xml:space="preserve"> — 22/09 (parcial) + Nov/2026 (final)</w:t>
+            </w:r>
+          </w:p>
+        </w:tc>
+        <w:tc>
+          <w:tcPr>
+            <w:tcBorders>
+              <w:top w:val="single" w:color="000000" w:sz="0" w:space="0"/>
+              <w:left w:val="single" w:color="000000" w:sz="0" w:space="0"/>
+              <w:bottom w:val="single" w:color="000000" w:sz="0" w:space="0"/>
+              <w:right w:val="single" w:color="000000" w:sz="0" w:space="0"/>
+            </w:tcBorders>
+          </w:tcPr>
+          <w:p>
+            <w:pPr>
+              <w:rPr>
+                <w:rFonts w:hint="default" w:ascii="Calibri" w:hAnsi="Calibri" w:cs="Calibri"/>
+                <w:sz w:val="18"/>
+                <w:szCs w:val="18"/>
+              </w:rPr>
+            </w:pPr>
+            <w:r>
+              <w:rPr>
+                <w:rFonts w:hint="default" w:ascii="Calibri" w:hAnsi="Calibri" w:cs="Calibri"/>
+                <w:sz w:val="18"/>
+                <w:szCs w:val="18"/>
+              </w:rPr>
+              <w:t>Macro-fases MF1/MF2/MF3</w:t>
+            </w:r>
+          </w:p>
+        </w:tc>
+        <w:tc>
+          <w:tcPr>
+            <w:tcBorders>
+              <w:top w:val="single" w:color="000000" w:sz="0" w:space="0"/>
+              <w:left w:val="single" w:color="000000" w:sz="0" w:space="0"/>
+              <w:bottom w:val="single" w:color="000000" w:sz="0" w:space="0"/>
+              <w:right w:val="single" w:color="000000" w:sz="0" w:space="0"/>
+            </w:tcBorders>
+          </w:tcPr>
+          <w:p>
+            <w:pPr>
+              <w:rPr>
+                <w:rFonts w:hint="default" w:ascii="Calibri" w:hAnsi="Calibri" w:cs="Calibri"/>
+                <w:sz w:val="18"/>
+                <w:szCs w:val="18"/>
+              </w:rPr>
+            </w:pPr>
+            <w:r>
+              <w:rPr>
+                <w:rFonts w:hint="default" w:ascii="Calibri" w:hAnsi="Calibri" w:cs="Calibri"/>
+                <w:sz w:val="18"/>
+                <w:szCs w:val="18"/>
+              </w:rPr>
+              <w:t>Todos (indiretamente)</w:t>
+            </w:r>
+          </w:p>
+        </w:tc>
+        <w:tc>
+          <w:tcPr>
+            <w:tcBorders>
+              <w:top w:val="single" w:color="000000" w:sz="0" w:space="0"/>
+              <w:left w:val="single" w:color="000000" w:sz="0" w:space="0"/>
+              <w:bottom w:val="single" w:color="000000" w:sz="0" w:space="0"/>
+              <w:right w:val="single" w:color="000000" w:sz="0" w:space="0"/>
+            </w:tcBorders>
+          </w:tcPr>
+          <w:p>
+            <w:pPr>
+              <w:rPr>
+                <w:rFonts w:hint="default" w:ascii="Calibri" w:hAnsi="Calibri" w:cs="Calibri"/>
+                <w:sz w:val="18"/>
+                <w:szCs w:val="18"/>
+              </w:rPr>
+            </w:pPr>
+            <w:r>
+              <w:rPr>
+                <w:rFonts w:hint="default" w:ascii="Calibri" w:hAnsi="Calibri" w:cs="Calibri"/>
+                <w:sz w:val="18"/>
+                <w:szCs w:val="18"/>
+              </w:rPr>
+              <w:t>Abordagem de Desenvolvimento</w:t>
+            </w:r>
+          </w:p>
+        </w:tc>
+      </w:tr>
+      <w:tr>
+        <w:tblPrEx>
+          <w:tblBorders>
+            <w:top w:val="single" w:color="000000" w:sz="2" w:space="0"/>
+            <w:left w:val="single" w:color="000000" w:sz="2" w:space="0"/>
+            <w:bottom w:val="single" w:color="000000" w:sz="2" w:space="0"/>
+            <w:right w:val="single" w:color="000000" w:sz="2" w:space="0"/>
+            <w:insideH w:val="none" w:color="auto" w:sz="0" w:space="0"/>
+            <w:insideV w:val="none" w:color="auto" w:sz="0" w:space="0"/>
+          </w:tblBorders>
+          <w:tblCellMar>
+            <w:top w:w="80" w:type="dxa"/>
+            <w:left w:w="160" w:type="dxa"/>
+            <w:bottom w:w="80" w:type="dxa"/>
+            <w:right w:w="160" w:type="dxa"/>
+          </w:tblCellMar>
+        </w:tblPrEx>
+        <w:trPr>
+          <w:tblCellSpacing w:w="0" w:type="dxa"/>
+          <w:jc w:val="center"/>
+        </w:trPr>
+        <w:tc>
+          <w:tcPr>
+            <w:tcBorders>
+              <w:top w:val="single" w:color="000000" w:sz="0" w:space="0"/>
+              <w:left w:val="single" w:color="000000" w:sz="0" w:space="0"/>
+              <w:bottom w:val="single" w:color="000000" w:sz="0" w:space="0"/>
+              <w:right w:val="single" w:color="000000" w:sz="0" w:space="0"/>
+            </w:tcBorders>
+          </w:tcPr>
+          <w:p>
+            <w:pPr>
+              <w:rPr>
+                <w:rFonts w:hint="default" w:ascii="Calibri" w:hAnsi="Calibri" w:cs="Calibri"/>
+                <w:sz w:val="18"/>
+                <w:szCs w:val="18"/>
+              </w:rPr>
+            </w:pPr>
+            <w:r>
+              <w:rPr>
+                <w:rFonts w:hint="default" w:ascii="Calibri" w:hAnsi="Calibri" w:cs="Calibri"/>
+                <w:b/>
+                <w:sz w:val="18"/>
+                <w:szCs w:val="18"/>
+              </w:rPr>
+              <w:t>Métricas e Indicadores</w:t>
+            </w:r>
+          </w:p>
+          <w:p>
+            <w:pPr>
+              <w:rPr>
+                <w:rFonts w:hint="default" w:ascii="Calibri" w:hAnsi="Calibri" w:cs="Calibri"/>
+                <w:sz w:val="18"/>
+                <w:szCs w:val="18"/>
+              </w:rPr>
+            </w:pPr>
+            <w:r>
+              <w:rPr>
+                <w:rFonts w:hint="default" w:ascii="Calibri" w:hAnsi="Calibri" w:cs="Calibri"/>
+                <w:sz w:val="18"/>
+                <w:szCs w:val="18"/>
+              </w:rPr>
+              <w:t xml:space="preserve"> — Cycle Time + Throughput via GitHub Insights</w:t>
+            </w:r>
+          </w:p>
+        </w:tc>
+        <w:tc>
+          <w:tcPr>
+            <w:tcBorders>
+              <w:top w:val="single" w:color="000000" w:sz="0" w:space="0"/>
+              <w:left w:val="single" w:color="000000" w:sz="0" w:space="0"/>
+              <w:bottom w:val="single" w:color="000000" w:sz="0" w:space="0"/>
+              <w:right w:val="single" w:color="000000" w:sz="0" w:space="0"/>
+            </w:tcBorders>
+          </w:tcPr>
+          <w:p>
+            <w:pPr>
+              <w:rPr>
+                <w:rFonts w:hint="default" w:ascii="Calibri" w:hAnsi="Calibri" w:cs="Calibri"/>
+                <w:sz w:val="18"/>
+                <w:szCs w:val="18"/>
+              </w:rPr>
+            </w:pPr>
+            <w:r>
+              <w:rPr>
+                <w:rFonts w:hint="default" w:ascii="Calibri" w:hAnsi="Calibri" w:cs="Calibri"/>
+                <w:sz w:val="18"/>
+                <w:szCs w:val="18"/>
+              </w:rPr>
+              <w:t>N7 (DevOps) + N9 (Base de Conhecimento)</w:t>
+            </w:r>
+          </w:p>
+        </w:tc>
+        <w:tc>
+          <w:tcPr>
+            <w:tcBorders>
+              <w:top w:val="single" w:color="000000" w:sz="0" w:space="0"/>
+              <w:left w:val="single" w:color="000000" w:sz="0" w:space="0"/>
+              <w:bottom w:val="single" w:color="000000" w:sz="0" w:space="0"/>
+              <w:right w:val="single" w:color="000000" w:sz="0" w:space="0"/>
+            </w:tcBorders>
+          </w:tcPr>
+          <w:p>
+            <w:pPr>
+              <w:rPr>
+                <w:rFonts w:hint="default" w:ascii="Calibri" w:hAnsi="Calibri" w:cs="Calibri"/>
+                <w:sz w:val="18"/>
+                <w:szCs w:val="18"/>
+              </w:rPr>
+            </w:pPr>
+            <w:r>
+              <w:rPr>
+                <w:rFonts w:hint="default" w:ascii="Calibri" w:hAnsi="Calibri" w:cs="Calibri"/>
+                <w:sz w:val="18"/>
+                <w:szCs w:val="18"/>
+              </w:rPr>
+              <w:t>REQ-11</w:t>
+            </w:r>
+          </w:p>
+        </w:tc>
+        <w:tc>
+          <w:tcPr>
+            <w:tcBorders>
+              <w:top w:val="single" w:color="000000" w:sz="0" w:space="0"/>
+              <w:left w:val="single" w:color="000000" w:sz="0" w:space="0"/>
+              <w:bottom w:val="single" w:color="000000" w:sz="0" w:space="0"/>
+              <w:right w:val="single" w:color="000000" w:sz="0" w:space="0"/>
+            </w:tcBorders>
+          </w:tcPr>
+          <w:p>
+            <w:pPr>
+              <w:rPr>
+                <w:rFonts w:hint="default" w:ascii="Calibri" w:hAnsi="Calibri" w:cs="Calibri"/>
+                <w:sz w:val="18"/>
+                <w:szCs w:val="18"/>
+              </w:rPr>
+            </w:pPr>
+            <w:r>
+              <w:rPr>
+                <w:rFonts w:hint="default" w:ascii="Calibri" w:hAnsi="Calibri" w:cs="Calibri"/>
+                <w:sz w:val="18"/>
+                <w:szCs w:val="18"/>
+              </w:rPr>
+              <w:t>Medição</w:t>
+            </w:r>
+          </w:p>
+        </w:tc>
+      </w:tr>
+      <w:tr>
+        <w:tblPrEx>
+          <w:tblBorders>
+            <w:top w:val="single" w:color="000000" w:sz="2" w:space="0"/>
+            <w:left w:val="single" w:color="000000" w:sz="2" w:space="0"/>
+            <w:bottom w:val="single" w:color="000000" w:sz="2" w:space="0"/>
+            <w:right w:val="single" w:color="000000" w:sz="2" w:space="0"/>
+            <w:insideH w:val="none" w:color="auto" w:sz="0" w:space="0"/>
+            <w:insideV w:val="none" w:color="auto" w:sz="0" w:space="0"/>
+          </w:tblBorders>
+          <w:tblCellMar>
+            <w:top w:w="80" w:type="dxa"/>
+            <w:left w:w="160" w:type="dxa"/>
+            <w:bottom w:w="80" w:type="dxa"/>
+            <w:right w:w="160" w:type="dxa"/>
+          </w:tblCellMar>
+        </w:tblPrEx>
+        <w:trPr>
+          <w:tblCellSpacing w:w="0" w:type="dxa"/>
+          <w:jc w:val="center"/>
+        </w:trPr>
+        <w:tc>
+          <w:tcPr>
+            <w:tcBorders>
+              <w:top w:val="single" w:color="000000" w:sz="0" w:space="0"/>
+              <w:left w:val="single" w:color="000000" w:sz="0" w:space="0"/>
+              <w:bottom w:val="single" w:color="000000" w:sz="0" w:space="0"/>
+              <w:right w:val="single" w:color="000000" w:sz="0" w:space="0"/>
+            </w:tcBorders>
+          </w:tcPr>
+          <w:p>
+            <w:pPr>
+              <w:rPr>
+                <w:rFonts w:hint="default" w:ascii="Calibri" w:hAnsi="Calibri" w:cs="Calibri"/>
+                <w:sz w:val="18"/>
+                <w:szCs w:val="18"/>
+              </w:rPr>
+            </w:pPr>
+            <w:r>
+              <w:rPr>
+                <w:rFonts w:hint="default" w:ascii="Calibri" w:hAnsi="Calibri" w:cs="Calibri"/>
+                <w:b/>
+                <w:sz w:val="18"/>
+                <w:szCs w:val="18"/>
+              </w:rPr>
+              <w:t>Inovação e Ferramentas</w:t>
+            </w:r>
+          </w:p>
+          <w:p>
+            <w:pPr>
+              <w:rPr>
+                <w:rFonts w:hint="default" w:ascii="Calibri" w:hAnsi="Calibri" w:cs="Calibri"/>
+                <w:sz w:val="18"/>
+                <w:szCs w:val="18"/>
+              </w:rPr>
+            </w:pPr>
+            <w:r>
+              <w:rPr>
+                <w:rFonts w:hint="default" w:ascii="Calibri" w:hAnsi="Calibri" w:cs="Calibri"/>
+                <w:sz w:val="18"/>
+                <w:szCs w:val="18"/>
+              </w:rPr>
+              <w:t xml:space="preserve"> — FOSS + SDD com IA auditável</w:t>
+            </w:r>
+          </w:p>
+        </w:tc>
+        <w:tc>
+          <w:tcPr>
+            <w:tcBorders>
+              <w:top w:val="single" w:color="000000" w:sz="0" w:space="0"/>
+              <w:left w:val="single" w:color="000000" w:sz="0" w:space="0"/>
+              <w:bottom w:val="single" w:color="000000" w:sz="0" w:space="0"/>
+              <w:right w:val="single" w:color="000000" w:sz="0" w:space="0"/>
+            </w:tcBorders>
+          </w:tcPr>
+          <w:p>
+            <w:pPr>
+              <w:rPr>
+                <w:rFonts w:hint="default" w:ascii="Calibri" w:hAnsi="Calibri" w:cs="Calibri"/>
+                <w:sz w:val="18"/>
+                <w:szCs w:val="18"/>
+              </w:rPr>
+            </w:pPr>
+            <w:r>
+              <w:rPr>
+                <w:rFonts w:hint="default" w:ascii="Calibri" w:hAnsi="Calibri" w:cs="Calibri"/>
+                <w:sz w:val="18"/>
+                <w:szCs w:val="18"/>
+              </w:rPr>
+              <w:t>N1.5, N4.4, N5.5, N9.1, N9.3</w:t>
+            </w:r>
+          </w:p>
+        </w:tc>
+        <w:tc>
+          <w:tcPr>
+            <w:tcBorders>
+              <w:top w:val="single" w:color="000000" w:sz="0" w:space="0"/>
+              <w:left w:val="single" w:color="000000" w:sz="0" w:space="0"/>
+              <w:bottom w:val="single" w:color="000000" w:sz="0" w:space="0"/>
+              <w:right w:val="single" w:color="000000" w:sz="0" w:space="0"/>
+            </w:tcBorders>
+          </w:tcPr>
+          <w:p>
+            <w:pPr>
+              <w:rPr>
+                <w:rFonts w:hint="default" w:ascii="Calibri" w:hAnsi="Calibri" w:cs="Calibri"/>
+                <w:sz w:val="18"/>
+                <w:szCs w:val="18"/>
+              </w:rPr>
+            </w:pPr>
+            <w:r>
+              <w:rPr>
+                <w:rFonts w:hint="default" w:ascii="Calibri" w:hAnsi="Calibri" w:cs="Calibri"/>
+                <w:sz w:val="18"/>
+                <w:szCs w:val="18"/>
+              </w:rPr>
+              <w:t>REQ-12, REQ-13, REQ-15</w:t>
+            </w:r>
+          </w:p>
+        </w:tc>
+        <w:tc>
+          <w:tcPr>
+            <w:tcBorders>
+              <w:top w:val="single" w:color="000000" w:sz="0" w:space="0"/>
+              <w:left w:val="single" w:color="000000" w:sz="0" w:space="0"/>
+              <w:bottom w:val="single" w:color="000000" w:sz="0" w:space="0"/>
+              <w:right w:val="single" w:color="000000" w:sz="0" w:space="0"/>
+            </w:tcBorders>
+          </w:tcPr>
+          <w:p>
+            <w:pPr>
+              <w:rPr>
+                <w:rFonts w:hint="default" w:ascii="Calibri" w:hAnsi="Calibri" w:cs="Calibri"/>
+                <w:sz w:val="18"/>
+                <w:szCs w:val="18"/>
+              </w:rPr>
+            </w:pPr>
+            <w:r>
+              <w:rPr>
+                <w:rFonts w:hint="default" w:ascii="Calibri" w:hAnsi="Calibri" w:cs="Calibri"/>
+                <w:sz w:val="18"/>
+                <w:szCs w:val="18"/>
+              </w:rPr>
+              <w:t>Trabalho do Projeto</w:t>
+            </w:r>
+          </w:p>
+        </w:tc>
+      </w:tr>
+    </w:tbl>
+    <w:p>
+      <w:pPr>
+        <w:keepNext w:val="0"/>
+        <w:keepLines w:val="0"/>
+        <w:pageBreakBefore w:val="0"/>
+        <w:widowControl/>
+        <w:kinsoku/>
+        <w:wordWrap/>
+        <w:overflowPunct/>
+        <w:topLinePunct w:val="0"/>
+        <w:autoSpaceDE/>
+        <w:autoSpaceDN/>
+        <w:bidi w:val="0"/>
+        <w:adjustRightInd/>
+        <w:snapToGrid/>
+        <w:spacing w:before="0" w:beforeLines="50"/>
+        <w:textAlignment w:val="auto"/>
+        <w:rPr>
+          <w:rFonts w:hint="default" w:ascii="Calibri" w:hAnsi="Calibri" w:cs="Calibri"/>
+          <w:sz w:val="16"/>
+          <w:szCs w:val="16"/>
+        </w:rPr>
+      </w:pPr>
+      <w:r>
+        <w:rPr>
+          <w:rFonts w:hint="default" w:ascii="Calibri" w:hAnsi="Calibri" w:cs="Calibri"/>
+          <w:b/>
+          <w:sz w:val="16"/>
+          <w:szCs w:val="16"/>
+        </w:rPr>
+        <w:t>Verificação de completude:</w:t>
+      </w:r>
+      <w:r>
+        <w:rPr>
+          <w:rFonts w:hint="default" w:ascii="Calibri" w:hAnsi="Calibri" w:cs="Calibri"/>
+          <w:sz w:val="16"/>
+          <w:szCs w:val="16"/>
+        </w:rPr>
+        <w:t xml:space="preserve"> 100% dos Objetivos SMART do TAP §3 possuem ao menos um requisito associado na seção §5.</w:t>
+      </w:r>
+    </w:p>
+    <w:p>
+      <w:pPr>
         <w:pStyle w:val="41"/>
       </w:pPr>
-      <w:r>
-        <w:t>[</w:t>
-      </w:r>
-      <w:r>
-        <w:fldChar w:fldCharType="begin"/>
-      </w:r>
-      <w:r>
-        <w:instrText xml:space="preserve"> HYPERLINK "http://escritoriodeprojetos.com.br/documentacao-dos-requisitos" </w:instrText>
-      </w:r>
-      <w:r>
-        <w:fldChar w:fldCharType="separate"/>
-      </w:r>
-      <w:r>
-        <w:rPr>
-          <w:rStyle w:val="19"/>
-        </w:rPr>
-        <w:t>Documente os principais requisitos</w:t>
-      </w:r>
-      <w:r>
-        <w:rPr>
-          <w:rStyle w:val="19"/>
-        </w:rPr>
-        <w:fldChar w:fldCharType="end"/>
-      </w:r>
-      <w:r>
-        <w:t xml:space="preserve"> dos produtos/entregas a serem atendidos identificados na EAP acima. ]</w:t>
-      </w:r>
     </w:p>
     <w:p>
       <w:pPr>
@@ -17092,7 +21405,7 @@
 
 <file path=word/commentsExtended.xml><?xml version="1.0" encoding="utf-8"?>
 <w15:commentsEx xmlns:wpc="http://schemas.microsoft.com/office/word/2010/wordprocessingCanvas" xmlns:mc="http://schemas.openxmlformats.org/markup-compatibility/2006" xmlns:o="urn:schemas-microsoft-com:office:office" xmlns:r="http://schemas.openxmlformats.org/officeDocument/2006/relationships" xmlns:m="http://schemas.openxmlformats.org/officeDocument/2006/math" xmlns:v="urn:schemas-microsoft-com:vml" xmlns:wp14="http://schemas.microsoft.com/office/word/2010/wordprocessingDrawing" xmlns:wp="http://schemas.openxmlformats.org/drawingml/2006/wordprocessingDrawing" xmlns:w="http://schemas.openxmlformats.org/wordprocessingml/2006/main" xmlns:w14="http://schemas.microsoft.com/office/word/2010/wordml" xmlns:w15="http://schemas.microsoft.com/office/word/2012/wordml" xmlns:w10="urn:schemas-microsoft-com:office:word" xmlns:wpg="http://schemas.microsoft.com/office/word/2010/wordprocessingGroup" xmlns:wpi="http://schemas.microsoft.com/office/word/2010/wordprocessingInk" xmlns:wne="http://schemas.microsoft.com/office/word/2006/wordml" xmlns:wps="http://schemas.microsoft.com/office/word/2010/wordprocessingShape" xmlns:wpsCustomData="http://www.wps.cn/officeDocument/2013/wpsCustomData" mc:Ignorable="w14 w15 wp14">
-  <w15:commentEx w15:paraId="7FFFFB16" w15:done="0"/>
+  <w15:commentEx w15:paraId="67F5519D" w15:done="0"/>
 </w15:commentsEx>
 </file>
 
@@ -17658,6 +21971,26 @@
     </w:lvl>
   </w:abstractNum>
   <w:abstractNum w:abstractNumId="1">
+    <w:nsid w:val="EF9FBFB2"/>
+    <w:multiLevelType w:val="singleLevel"/>
+    <w:tmpl w:val="EF9FBFB2"/>
+    <w:lvl w:ilvl="0" w:tentative="0">
+      <w:start w:val="1"/>
+      <w:numFmt w:val="lowerLetter"/>
+      <w:lvlText w:val="%1)"/>
+      <w:lvlJc w:val="left"/>
+      <w:pPr>
+        <w:tabs>
+          <w:tab w:val="left" w:pos="845"/>
+        </w:tabs>
+        <w:ind w:left="845" w:leftChars="0" w:hanging="425" w:firstLineChars="0"/>
+      </w:pPr>
+      <w:rPr>
+        <w:rFonts w:hint="default"/>
+      </w:rPr>
+    </w:lvl>
+  </w:abstractNum>
+  <w:abstractNum w:abstractNumId="2">
     <w:nsid w:val="FEEF960E"/>
     <w:multiLevelType w:val="singleLevel"/>
     <w:tmpl w:val="FEEF960E"/>
@@ -17677,7 +22010,7 @@
       </w:rPr>
     </w:lvl>
   </w:abstractNum>
-  <w:abstractNum w:abstractNumId="2">
+  <w:abstractNum w:abstractNumId="3">
     <w:nsid w:val="32756A2F"/>
     <w:multiLevelType w:val="multilevel"/>
     <w:tmpl w:val="32756A2F"/>
@@ -17772,7 +22105,7 @@
       </w:pPr>
     </w:lvl>
   </w:abstractNum>
-  <w:abstractNum w:abstractNumId="3">
+  <w:abstractNum w:abstractNumId="4">
     <w:nsid w:val="7EFF375D"/>
     <w:multiLevelType w:val="singleLevel"/>
     <w:tmpl w:val="7EFF375D"/>
@@ -17795,16 +22128,19 @@
     </w:lvl>
   </w:abstractNum>
   <w:num w:numId="1">
+    <w:abstractNumId w:val="3"/>
+  </w:num>
+  <w:num w:numId="2">
     <w:abstractNumId w:val="2"/>
   </w:num>
-  <w:num w:numId="2">
-    <w:abstractNumId w:val="1"/>
-  </w:num>
   <w:num w:numId="3">
-    <w:abstractNumId w:val="3"/>
+    <w:abstractNumId w:val="4"/>
   </w:num>
   <w:num w:numId="4">
     <w:abstractNumId w:val="0"/>
+  </w:num>
+  <w:num w:numId="5">
+    <w:abstractNumId w:val="1"/>
   </w:num>
 </w:numbering>
 </file>

</xml_diff>